<commit_message>
Komprimer rapport, legg til dataoversiktsfigur og redesign alle figurar
- Rapport ned frå 13 556 til 11 021 strippa ord (−18,7 %)
- Fjerna dupliserte formlar frå Kap 2, strama 4.3, 8.1, 8.4 og 9.3
- Ny Fig04_Dataoversikt.png (2×3 panel: varegrupper, pris, forbruk, CV, ABC, leverandørar)
- Omnummerert Fig04–10 → Fig05–11, oppdatert alle referansar i MD og build_word.py
- Modernisert stil på alle 12 figurar: tynnare linjer, subtilare grid, meir luft
- Bygd oppdatert LOG650_Rapport_v5.docx med 12 figurar og 16 tabellar

Co-Authored-By: Claude Opus 4.6 (1M context) <noreply@anthropic.com>
</commit_message>
<xml_diff>
--- a/005 report/LOG650_Rapport_v5.docx
+++ b/005 report/LOG650_Rapport_v5.docx
@@ -612,7 +612,7 @@
           <w:szCs w:val="28"/>
         </w:rPr>
         <w:sectPr>
-          <w:footerReference w:type="default" r:id="rId33"/>
+          <w:footerReference w:type="default" r:id="rId34"/>
           <w:type w:val="continuous"/>
           <w:pgSz w:w="11907" w:h="16840"/>
           <w:pgMar w:top="1417" w:right="1417" w:bottom="1417" w:left="1701" w:header="720" w:footer="397" w:gutter="0"/>
@@ -2281,7 +2281,7 @@
           <w:szCs w:val="32"/>
         </w:rPr>
         <w:sectPr>
-          <w:footerReference w:type="default" r:id="rId34"/>
+          <w:footerReference w:type="default" r:id="rId35"/>
           <w:pgSz w:w="11907" w:h="16840"/>
           <w:pgMar w:top="1417" w:right="1417" w:bottom="1417" w:left="1701" w:header="720" w:footer="403" w:gutter="0"/>
           <w:cols w:space="720"/>
@@ -3400,7 +3400,7 @@
           <w:szCs w:val="32"/>
         </w:rPr>
         <w:sectPr>
-          <w:footerReference w:type="default" r:id="rId35"/>
+          <w:footerReference w:type="default" r:id="rId36"/>
           <w:pgSz w:w="11907" w:h="16840"/>
           <w:pgMar w:top="1417" w:right="1417" w:bottom="1417" w:left="1701" w:header="720" w:footer="403" w:gutter="0"/>
           <w:cols w:space="720"/>
@@ -4418,7 +4418,7 @@
           <w:b/>
         </w:rPr>
         <w:sectPr>
-          <w:footerReference w:type="default" r:id="rId36"/>
+          <w:footerReference w:type="default" r:id="rId37"/>
           <w:pgSz w:w="11907" w:h="16840"/>
           <w:pgMar w:top="1417" w:right="1417" w:bottom="1417" w:left="1701" w:header="720" w:footer="403" w:gutter="0"/>
           <w:cols w:space="720"/>
@@ -4465,7 +4465,7 @@
     <w:p>
       <w:pPr>
         <w:sectPr>
-          <w:footerReference w:type="default" r:id="rId37"/>
+          <w:footerReference w:type="default" r:id="rId38"/>
           <w:pgSz w:w="11907" w:h="16840"/>
           <w:pgMar w:top="1417" w:right="1417" w:bottom="1417" w:left="1701" w:header="720" w:footer="403" w:gutter="0"/>
           <w:cols w:space="720"/>
@@ -4740,7 +4740,7 @@
     <w:p>
       <w:pPr>
         <w:sectPr>
-          <w:footerReference w:type="default" r:id="rId38"/>
+          <w:footerReference w:type="default" r:id="rId39"/>
           <w:pgSz w:w="11907" w:h="16840"/>
           <w:pgMar w:top="1417" w:right="1417" w:bottom="1417" w:left="1701" w:header="720" w:footer="403" w:gutter="0"/>
           <w:cols w:space="720"/>
@@ -6312,7 +6312,7 @@
     <w:p>
       <w:pPr>
         <w:sectPr>
-          <w:footerReference w:type="default" r:id="rId39"/>
+          <w:footerReference w:type="default" r:id="rId40"/>
           <w:pgSz w:w="11907" w:h="16840"/>
           <w:pgMar w:top="1417" w:right="1417" w:bottom="1417" w:left="1701" w:header="720" w:footer="403" w:gutter="0"/>
           <w:cols w:space="720"/>
@@ -6402,7 +6402,7 @@
           <w:rFonts w:ascii="Times New Roman" w:hAnsi="Times New Roman" w:cs="Times New Roman"/>
           <w:sz w:val="24"/>
         </w:rPr>
-        <w:t>Figur 4. ABC Pareto-kurve: kumulativ verdiandel for 709 artikler</w:t>
+        <w:t>Figur 4. Dataoversikt: fordeling av nøkkelvariablar for 709 artiklar</w:t>
       </w:r>
     </w:p>
     <w:p>
@@ -6414,7 +6414,7 @@
           <w:rFonts w:ascii="Times New Roman" w:hAnsi="Times New Roman" w:cs="Times New Roman"/>
           <w:sz w:val="24"/>
         </w:rPr>
-        <w:t>Figur 5. ABC/XYZ-kryssmatrise: antall artikler per kombinasjon</w:t>
+        <w:t>Figur 5. ABC Pareto-kurve: kumulativ verdiandel for 709 artikler</w:t>
       </w:r>
     </w:p>
     <w:p>
@@ -6426,7 +6426,7 @@
           <w:rFonts w:ascii="Times New Roman" w:hAnsi="Times New Roman" w:cs="Times New Roman"/>
           <w:sz w:val="24"/>
         </w:rPr>
-        <w:t>Figur 6. EOQ-avvik: relativ frekvensavvik med terskel ved τ_f = 1,5</w:t>
+        <w:t>Figur 6. ABC/XYZ-kryssmatrise: antall artikler per kombinasjon</w:t>
       </w:r>
     </w:p>
     <w:p>
@@ -6438,7 +6438,7 @@
           <w:rFonts w:ascii="Times New Roman" w:hAnsi="Times New Roman" w:cs="Times New Roman"/>
           <w:sz w:val="24"/>
         </w:rPr>
-        <w:t>Figur 7. Silhouette-score for K = 2–7 (treningsdata, n = 389)</w:t>
+        <w:t>Figur 7. EOQ-avvik: relativ frekvensavvik med terskel ved τ_f = 1,5</w:t>
       </w:r>
     </w:p>
     <w:p>
@@ -6450,7 +6450,7 @@
           <w:rFonts w:ascii="Times New Roman" w:hAnsi="Times New Roman" w:cs="Times New Roman"/>
           <w:sz w:val="24"/>
         </w:rPr>
-        <w:t>Figur 8. K-means klyngeresultat (K = 3): forbruksstabilitet vs verdi og kostnadsavvik</w:t>
+        <w:t>Figur 8. Silhouette-score for K = 2–7 (treningsdata, n = 389)</w:t>
       </w:r>
     </w:p>
     <w:p>
@@ -6462,7 +6462,7 @@
           <w:rFonts w:ascii="Times New Roman" w:hAnsi="Times New Roman" w:cs="Times New Roman"/>
           <w:sz w:val="24"/>
         </w:rPr>
-        <w:t>Figur 9. Klyngeprofiler for K-means (K = 3): gjennomsnittlig z-score per feature</w:t>
+        <w:t>Figur 9. K-means klyngeresultat (K = 3): forbruksstabilitet vs verdi og kostnadsavvik</w:t>
       </w:r>
     </w:p>
     <w:p>
@@ -6474,7 +6474,19 @@
           <w:rFonts w:ascii="Times New Roman" w:hAnsi="Times New Roman" w:cs="Times New Roman"/>
           <w:sz w:val="24"/>
         </w:rPr>
-        <w:t>Figur 10. Regelmotor og besparelsesanalyse: HVFS-anbefalinger og EOQ-besparelse</w:t>
+        <w:t>Figur 10. Klyngeprofiler for K-means (K = 3): gjennomsnittlig z-score per feature</w:t>
+      </w:r>
+    </w:p>
+    <w:p>
+      <w:pPr>
+        <w:spacing w:line="360" w:lineRule="auto"/>
+      </w:pPr>
+      <w:r>
+        <w:rPr>
+          <w:rFonts w:ascii="Times New Roman" w:hAnsi="Times New Roman" w:cs="Times New Roman"/>
+          <w:sz w:val="24"/>
+        </w:rPr>
+        <w:t>Figur 11. Regelmotor og besparelsesanalyse: HVFS-anbefalinger og EOQ-besparelse</w:t>
       </w:r>
     </w:p>
     <w:p>
@@ -7320,7 +7332,7 @@
           <w:rFonts w:ascii="Times New Roman" w:hAnsi="Times New Roman" w:cs="Times New Roman"/>
           <w:sz w:val="24"/>
         </w:rPr>
-        <w:t>Flerkriterietilnærminger har fått økt oppmerksomhet. Keshavarz Ghorabaee et al. (2015) presenterer EDAS-metoden (Evaluation based on Distance from Average Solution) som en alternativ tilnærming til tradisjonell ABC, og argumenterer for at avstandsbaserte rangeringsmetoder er mer robuste overfor ekstremverdier enn kumulative prosentandeler. Partovi og Burton (1993) foreslo allerede på 1990-tallet å bruke AHP (Analytic Hierarchy Process) for å vekte klassifiseringskriterier etter organisasjonens prioriteringer. Begge tilnærminger er faglig interessante, men krever subjektiv vekting — noe som utgjør en svakhet i kvantitative, datadrevne analyser. Denne oppgaven velger å holde seg til objektivt beregnbare kriterier (verdi, CV, EOQ-avvik) for å sikre etterprøvbarhet.</w:t>
+        <w:t>Flerkriterietilnærminger som EDAS (Keshavarz Ghorabaee et al., 2015) og AHP (Partovi &amp; Burton, 1993) krever subjektiv vekting, noe som svekker etterprøvbarheten. Denne oppgaven benytter derfor objektivt beregnbare kriterier (verdi, CV, EOQ-avvik). Klyngeanalyse representerer et datadrevet alternativ som fanger sammensatte mønstre uten forhåndsdefinerte terskelverdier (Srinivasan &amp; Moon, 1999). Kombinasjonen av K-means med regelbaserte beslutningssystemer — slik denne oppgaven gjennomfører — er lite dokumentert i sykehuskontekst, og utgjør oppgavens metodiske bidrag.</w:t>
       </w:r>
     </w:p>
     <w:p>
@@ -7332,7 +7344,7 @@
           <w:rFonts w:ascii="Times New Roman" w:hAnsi="Times New Roman" w:cs="Times New Roman"/>
           <w:sz w:val="24"/>
         </w:rPr>
-        <w:t>Bruk av klyngeanalyse for lagerklassifisering er dokumentert i litteraturen som et alternativ som fanger opp sammensatte mønstre uten å kreve forhåndsdefinerte terskelverdier. Srinivasan og Moon (1999) introduserte hierarkisk klynging som verktøy for strategisk analyse av forsyningskjedenettverk, og viste at klyngebaserte beslutninger gir løsninger nær optimale med langt lavere beregningsmessig kompleksitet enn helhetlige optimeringer. K-means som spesifikk algoritme er godt etablert i lagerstyringsapplikasjoner, men kombinasjonen med regelbaserte beslutningssystemer — slik denne oppgaven gjennomfører — er lite dokumentert i sykehuskontekst, og utgjør oppgavens metodiske bidrag.</w:t>
+        <w:t>van Kampen et al. (2012) identifiserer tre hoveddimensjoner for SKU-klassifisering: karakteristikker (verdi, variabilitet, kritikalitet), klassifiseringsteknikk (ABC, clustering, MCDM) og operasjonalisering i styringssystemer. Denne oppgaven opererer i krysningspunktet mellom alle tre.</w:t>
       </w:r>
     </w:p>
     <w:p>
@@ -7344,19 +7356,7 @@
           <w:rFonts w:ascii="Times New Roman" w:hAnsi="Times New Roman" w:cs="Times New Roman"/>
           <w:sz w:val="24"/>
         </w:rPr>
-        <w:t>van Kampen et al. (2012) gir det mest omfattende rammeverket for SKU-klassifisering som akademisk felt, og identifiserer tre hoveddimensjoner: hvilke karakteristikker som benyttes (verdi, variabilitet, kritikalitet, ledetid), hvilken klassifiseringsteknikk som velges (ABC, clustering, MCDM), og hvordan klassene operasjonaliseres i styringssystemer. Rammeverket er særlig nyttig som posisjoneringsverktøy: denne oppgaven opererer i krysningspunktet mellom alle tre dimensjoner, og er metodisk motivert av at ingen enkelt teknikk alene håndterer den beslutningssituasjonen Helse Bergen står i.</w:t>
-      </w:r>
-    </w:p>
-    <w:p>
-      <w:pPr>
-        <w:spacing w:line="360" w:lineRule="auto"/>
-      </w:pPr>
-      <w:r>
-        <w:rPr>
-          <w:rFonts w:ascii="Times New Roman" w:hAnsi="Times New Roman" w:cs="Times New Roman"/>
-          <w:sz w:val="24"/>
-        </w:rPr>
-        <w:t>Det sentrale gapet i litteraturen er fraværet av kvantitative casestudier som kombinerer ABC, XYZ, EOQ-avviksanalyse og klyngeanalyse i en samlet analysemodell koblet mot faktiske SAP-transaksjonsdata, med besparelsesestimat som eksplisitt output. Bijvank og Vis (2012) påpeker at sykehuslogistikk kjennetegnes av begrenset kapasitet, korte ledetidskrav og høy servicekritikalitet — faktorer som gjør standard industrimodeller utilstrekkelige. Moons et al. (2019) understreker behovet for flerkriteriebaserte ytelsesmål fremfor enkelt-dimensjonale kostnadsmål. Saha og Ray (2019) konkluderer i sin gjennomgang av 137 artikler at det er behov for empiriske studier som kobler kvantitative klassifiseringsmodeller til konkrete beslutninger i reelle sykehussystemer. Denne oppgaven søker å fylle nettopp dette gapet.</w:t>
+        <w:t>Det sentrale gapet i litteraturen er fraværet av kvantitative casestudier som kombinerer ABC, XYZ, EOQ-avviksanalyse og klyngeanalyse i en samlet analysemodell koblet mot faktiske SAP-transaksjonsdata, med besparelsesestimat som eksplisitt output. Saha og Ray (2019) konkluderer i sin gjennomgang av 137 artikler at det er behov for empiriske studier som kobler kvantitative klassifiseringsmodeller til konkrete beslutninger i reelle sykehussystemer. Denne oppgaven søker å fylle dette gapet.</w:t>
       </w:r>
     </w:p>
     <w:p>
@@ -8940,7 +8940,7 @@
           <w:rFonts w:ascii="Times New Roman" w:hAnsi="Times New Roman" w:cs="Times New Roman"/>
           <w:sz w:val="24"/>
         </w:rPr>
-        <w:t>ABC-analyse er en klassifiseringsmetode basert på Pareto-prinsippet, som fastslår at en liten andel artikler typisk står for en stor andel av total forbruksverdi. Metoden deler lagerbeholdningen i tre kategorier etter kumulativ verdiandel: A-artikler utgjør de artiklene som til sammen representerer de første 80 prosentene av total innkjøpsverdi; B-artikler de neste 15 prosentene (80–95 prosent kumulativt); og C-artikler de resterende 5 prosentene av verdi, som typisk utgjør den største andelen av artikkeltallet (Silaen et al., 2023). Grenseverdiene 80/15/5 prosent er konvensjonelle og benyttes konsekvent i denne oppgaven.</w:t>
+        <w:t>ABC-analyse er en klassifiseringsmetode basert på Pareto-prinsippet, som fastslår at en liten andel artikler typisk står for en stor andel av total forbruksverdi. Metoden deler lagerbeholdningen i tre kategorier etter kumulativ verdiandel: A-artikler representerer de første 80 % av total innkjøpsverdi, B-artikler de neste 15 % og C-artikler de resterende 5 % (Silaen et al., 2023). Den formelle beregningen er beskrevet i kapittel 5.</w:t>
       </w:r>
     </w:p>
     <w:p>
@@ -8952,282 +8952,7 @@
           <w:rFonts w:ascii="Times New Roman" w:hAnsi="Times New Roman" w:cs="Times New Roman"/>
           <w:sz w:val="24"/>
         </w:rPr>
-        <w:t>Den formelle beregningen tar utgangspunkt i total innkjøpsverdi per artikkel over analyseperioden, sortert synkende. Kumulativ verdiandel beregnes som:</w:t>
-      </w:r>
-    </w:p>
-    <w:p>
-      <w:pPr>
-        <w:spacing w:line="360" w:lineRule="auto"/>
-        <w:jc w:val="center"/>
-      </w:pPr>
-      <m:oMath>
-        <m:sSub>
-          <m:e>
-            <m:r>
-              <m:rPr>
-                <m:nor/>
-              </m:rPr>
-              <m:t>CUM\_PCT</m:t>
-            </m:r>
-          </m:e>
-          <m:sub>
-            <m:r>
-              <m:t>i</m:t>
-            </m:r>
-          </m:sub>
-        </m:sSub>
-        <m:r>
-          <m:t>=</m:t>
-        </m:r>
-        <m:f>
-          <m:fPr>
-            <m:type m:val="bar"/>
-          </m:fPr>
-          <m:num>
-            <m:nary>
-              <m:naryPr>
-                <m:chr m:val="∑"/>
-                <m:limLoc m:val="subSup"/>
-                <m:grow m:val="1"/>
-                <m:subHide m:val="off"/>
-                <m:supHide m:val="off"/>
-              </m:naryPr>
-              <m:sub>
-                <m:r>
-                  <m:t>j=1</m:t>
-                </m:r>
-              </m:sub>
-              <m:sup>
-                <m:r>
-                  <m:t>i</m:t>
-                </m:r>
-              </m:sup>
-              <m:e>
-                <m:sSub>
-                  <m:e>
-                    <m:r>
-                      <m:t>V</m:t>
-                    </m:r>
-                  </m:e>
-                  <m:sub>
-                    <m:r>
-                      <m:t>j</m:t>
-                    </m:r>
-                  </m:sub>
-                </m:sSub>
-              </m:e>
-            </m:nary>
-          </m:num>
-          <m:den>
-            <m:nary>
-              <m:naryPr>
-                <m:chr m:val="∑"/>
-                <m:limLoc m:val="subSup"/>
-                <m:grow m:val="1"/>
-                <m:subHide m:val="off"/>
-                <m:supHide m:val="off"/>
-              </m:naryPr>
-              <m:sub>
-                <m:r>
-                  <m:t>j=1</m:t>
-                </m:r>
-              </m:sub>
-              <m:sup>
-                <m:r>
-                  <m:t>N</m:t>
-                </m:r>
-              </m:sup>
-              <m:e>
-                <m:sSub>
-                  <m:e>
-                    <m:r>
-                      <m:t>V</m:t>
-                    </m:r>
-                  </m:e>
-                  <m:sub>
-                    <m:r>
-                      <m:t>j</m:t>
-                    </m:r>
-                  </m:sub>
-                </m:sSub>
-              </m:e>
-            </m:nary>
-          </m:den>
-        </m:f>
-        <m:r>
-          <m:t>×100</m:t>
-        </m:r>
-      </m:oMath>
-    </w:p>
-    <w:p>
-      <w:pPr>
-        <w:spacing w:line="360" w:lineRule="auto"/>
-      </w:pPr>
-      <w:r>
-        <w:rPr>
-          <w:rFonts w:ascii="Times New Roman" w:hAnsi="Times New Roman" w:cs="Times New Roman"/>
-          <w:sz w:val="24"/>
-        </w:rPr>
-        <w:t xml:space="preserve">der </w:t>
-      </w:r>
-      <m:oMath>
-        <m:sSub>
-          <m:e>
-            <m:r>
-              <m:t>V</m:t>
-            </m:r>
-          </m:e>
-          <m:sub>
-            <m:r>
-              <m:t>j</m:t>
-            </m:r>
-          </m:sub>
-        </m:sSub>
-      </m:oMath>
-      <w:r>
-        <w:rPr>
-          <w:rFonts w:ascii="Times New Roman" w:hAnsi="Times New Roman" w:cs="Times New Roman"/>
-          <w:sz w:val="24"/>
-        </w:rPr>
-        <w:t xml:space="preserve"> er innkjøpsverdien for artikkel </w:t>
-      </w:r>
-      <m:oMath>
-        <m:r>
-          <m:t>j</m:t>
-        </m:r>
-      </m:oMath>
-      <w:r>
-        <w:rPr>
-          <w:rFonts w:ascii="Times New Roman" w:hAnsi="Times New Roman" w:cs="Times New Roman"/>
-          <w:sz w:val="24"/>
-        </w:rPr>
-        <w:t xml:space="preserve"> rangert etter synkende verdi, og </w:t>
-      </w:r>
-      <m:oMath>
-        <m:r>
-          <m:t>N</m:t>
-        </m:r>
-      </m:oMath>
-      <w:r>
-        <w:rPr>
-          <w:rFonts w:ascii="Times New Roman" w:hAnsi="Times New Roman" w:cs="Times New Roman"/>
-          <w:sz w:val="24"/>
-        </w:rPr>
-        <w:t xml:space="preserve"> er totalt antall artikler. Artikkel </w:t>
-      </w:r>
-      <m:oMath>
-        <m:r>
-          <m:t>i</m:t>
-        </m:r>
-      </m:oMath>
-      <w:r>
-        <w:rPr>
-          <w:rFonts w:ascii="Times New Roman" w:hAnsi="Times New Roman" w:cs="Times New Roman"/>
-          <w:sz w:val="24"/>
-        </w:rPr>
-        <w:t xml:space="preserve"> tilordnes klasse A dersom </w:t>
-      </w:r>
-      <m:oMath>
-        <m:sSub>
-          <m:e>
-            <m:r>
-              <m:rPr>
-                <m:nor/>
-              </m:rPr>
-              <m:t>CUM\_PCT</m:t>
-            </m:r>
-          </m:e>
-          <m:sub>
-            <m:r>
-              <m:t>i</m:t>
-            </m:r>
-          </m:sub>
-        </m:sSub>
-        <m:r>
-          <m:t>≤80</m:t>
-        </m:r>
-      </m:oMath>
-      <w:r>
-        <w:rPr>
-          <w:rFonts w:ascii="Times New Roman" w:hAnsi="Times New Roman" w:cs="Times New Roman"/>
-          <w:sz w:val="24"/>
-        </w:rPr>
-        <w:t xml:space="preserve">, klasse B dersom </w:t>
-      </w:r>
-      <m:oMath>
-        <m:r>
-          <m:t>80&lt;</m:t>
-        </m:r>
-        <m:sSub>
-          <m:e>
-            <m:r>
-              <m:rPr>
-                <m:nor/>
-              </m:rPr>
-              <m:t>CUM\_PCT</m:t>
-            </m:r>
-          </m:e>
-          <m:sub>
-            <m:r>
-              <m:t>i</m:t>
-            </m:r>
-          </m:sub>
-        </m:sSub>
-        <m:r>
-          <m:t>≤95</m:t>
-        </m:r>
-      </m:oMath>
-      <w:r>
-        <w:rPr>
-          <w:rFonts w:ascii="Times New Roman" w:hAnsi="Times New Roman" w:cs="Times New Roman"/>
-          <w:sz w:val="24"/>
-        </w:rPr>
-        <w:t>, og klasse C ellers. I denne oppgaven benyttes innkjøpsverdi fra SAP-tabell EKPO (feltet NETWR) som primærgrunnlag, supplert med beregnet verdi (</w:t>
-      </w:r>
-      <m:oMath>
-        <m:sSub>
-          <m:e>
-            <m:r>
-              <m:t>D</m:t>
-            </m:r>
-          </m:e>
-          <m:sub>
-            <m:r>
-              <m:rPr>
-                <m:nor/>
-              </m:rPr>
-              <m:t>annual</m:t>
-            </m:r>
-          </m:sub>
-        </m:sSub>
-        <m:r>
-          <m:t>×</m:t>
-        </m:r>
-        <m:r>
-          <m:rPr>
-            <m:nor/>
-          </m:rPr>
-          <m:t>UNIT\_PRICE</m:t>
-        </m:r>
-      </m:oMath>
-      <w:r>
-        <w:rPr>
-          <w:rFonts w:ascii="Times New Roman" w:hAnsi="Times New Roman" w:cs="Times New Roman"/>
-          <w:sz w:val="24"/>
-        </w:rPr>
-        <w:t>) for artikler uten innkjøpshistorikk i analyseperioden.</w:t>
-      </w:r>
-    </w:p>
-    <w:p>
-      <w:pPr>
-        <w:spacing w:line="360" w:lineRule="auto"/>
-      </w:pPr>
-      <w:r>
-        <w:rPr>
-          <w:rFonts w:ascii="Times New Roman" w:hAnsi="Times New Roman" w:cs="Times New Roman"/>
-          <w:sz w:val="24"/>
-        </w:rPr>
-        <w:t>Styrken ved ABC-analyse er metodens enkelhet, transparens og direkte kopling til lagerkapitalbinding. Metoden identifiserer raskt hvilke artikler som krever tett oppfølging og prioritert styring. Svakheten er at verdidimensjonen alene ikke fanger opp kritikalitet for forsyningssikkerhet eller variabilitet i etterspørsel — to faktorer som er særlig relevante i sykehuskontekst. En A-artikkel kan ha svært uregelmessig forbruksmønster og kreve annen styringslogikk enn en A-artikkel med stabilt forbruk. Partovi og Burton (1993) påpeker allerede tidlig at ABC-analyse bør suppleres med kriterier for klinisk viktighet og ledetidsfølsomhet. I denne oppgaven adresseres dette ved å kombinere ABC med XYZ-klassifisering og EOQ-avviksanalyse.</w:t>
+        <w:t>Styrken ved ABC er enkelhet og direkte kopling til lagerkapitalbinding, men verdidimensjonen alene fanger ikke variabilitet i etterspørsel eller kritikalitet for forsyningssikkerhet (Partovi &amp; Burton, 1993). I denne oppgaven adresseres dette ved å kombinere ABC med XYZ-klassifisering og EOQ-avviksanalyse.</w:t>
       </w:r>
     </w:p>
     <w:p>
@@ -9252,124 +8977,23 @@
           <w:rFonts w:ascii="Times New Roman" w:hAnsi="Times New Roman" w:cs="Times New Roman"/>
           <w:sz w:val="24"/>
         </w:rPr>
-        <w:t>XYZ-klassifisering kategoriserer artikler etter etterspørselens forutsigbarhet, målt ved variasjonskoeffisienten (CV). CV er definert som forholdet mellom standardavviket og gjennomsnittet av månedlig forbruk over analyseperioden:</w:t>
-      </w:r>
-    </w:p>
-    <w:p>
-      <w:pPr>
-        <w:spacing w:line="360" w:lineRule="auto"/>
-        <w:jc w:val="center"/>
-      </w:pPr>
+        <w:t>XYZ-klassifisering kategoriserer artikler etter etterspørselens forutsigbarhet, målt ved variasjonskoeffisienten (CV). Klassifikasjonsgrensene følger Nowotyńska (2013): X (</w:t>
+      </w:r>
       <m:oMath>
         <m:r>
-          <m:t>C</m:t>
+          <m:t>CV&lt;0,5,</m:t>
         </m:r>
-        <m:sSub>
-          <m:e>
-            <m:r>
-              <m:t>V</m:t>
-            </m:r>
-          </m:e>
-          <m:sub>
-            <m:r>
-              <m:t>i</m:t>
-            </m:r>
-          </m:sub>
-        </m:sSub>
-        <m:r>
-          <m:t>=</m:t>
-        </m:r>
-        <m:f>
-          <m:fPr>
-            <m:type m:val="bar"/>
-          </m:fPr>
-          <m:num>
-            <m:sSub>
-              <m:e>
-                <m:r>
-                  <m:t>σ</m:t>
-                </m:r>
-              </m:e>
-              <m:sub>
-                <m:r>
-                  <m:t>i</m:t>
-                </m:r>
-              </m:sub>
-            </m:sSub>
-          </m:num>
-          <m:den>
-            <m:sSub>
-              <m:e>
-                <m:r>
-                  <m:t>μ</m:t>
-                </m:r>
-              </m:e>
-              <m:sub>
-                <m:r>
-                  <m:t>i</m:t>
-                </m:r>
-              </m:sub>
-            </m:sSub>
-          </m:den>
-        </m:f>
       </m:oMath>
-    </w:p>
-    <w:p>
-      <w:pPr>
-        <w:spacing w:line="360" w:lineRule="auto"/>
-      </w:pPr>
-      <w:r>
-        <w:rPr>
-          <w:rFonts w:ascii="Times New Roman" w:hAnsi="Times New Roman" w:cs="Times New Roman"/>
-          <w:sz w:val="24"/>
-        </w:rPr>
-        <w:t xml:space="preserve">der </w:t>
-      </w:r>
-      <m:oMath>
-        <m:sSub>
-          <m:e>
-            <m:r>
-              <m:t>σ</m:t>
-            </m:r>
-          </m:e>
-          <m:sub>
-            <m:r>
-              <m:t>i</m:t>
-            </m:r>
-          </m:sub>
-        </m:sSub>
-      </m:oMath>
-      <w:r>
-        <w:rPr>
-          <w:rFonts w:ascii="Times New Roman" w:hAnsi="Times New Roman" w:cs="Times New Roman"/>
-          <w:sz w:val="24"/>
-        </w:rPr>
-        <w:t xml:space="preserve"> er standardavviket og </w:t>
-      </w:r>
-      <m:oMath>
-        <m:sSub>
-          <m:e>
-            <m:r>
-              <m:t>μ</m:t>
-            </m:r>
-          </m:e>
-          <m:sub>
-            <m:r>
-              <m:t>i</m:t>
-            </m:r>
-          </m:sub>
-        </m:sSub>
-      </m:oMath>
-      <w:r>
-        <w:rPr>
-          <w:rFonts w:ascii="Times New Roman" w:hAnsi="Times New Roman" w:cs="Times New Roman"/>
-          <w:sz w:val="24"/>
-        </w:rPr>
-        <w:t xml:space="preserve"> er gjennomsnittet av artikkel </w:t>
+      <w:r>
+        <w:rPr>
+          <w:rFonts w:ascii="Times New Roman" w:hAnsi="Times New Roman" w:cs="Times New Roman"/>
+          <w:sz w:val="24"/>
+        </w:rPr>
+        <w:t xml:space="preserve"> stabilt), Y (0,5 ≤ </w:t>
       </w:r>
       <m:oMath>
         <m:r>
-          <m:t>i</m:t>
+          <m:t>CV&lt;1,0,</m:t>
         </m:r>
       </m:oMath>
       <w:r>
@@ -9377,17 +9001,11 @@
           <w:rFonts w:ascii="Times New Roman" w:hAnsi="Times New Roman" w:cs="Times New Roman"/>
           <w:sz w:val="24"/>
         </w:rPr>
-        <w:t xml:space="preserve">'s månedlige forbruk. Klassifikasjonsgensene følger Nowotyńska (2013): X-artikler har </w:t>
+        <w:t xml:space="preserve"> moderat) og Z (</w:t>
       </w:r>
       <m:oMath>
         <m:r>
-          <m:t>CV&lt;0</m:t>
-        </m:r>
-        <m:r>
-          <m:t>,</m:t>
-        </m:r>
-        <m:r>
-          <m:t>5</m:t>
+          <m:t>CV≥1,0,</m:t>
         </m:r>
       </m:oMath>
       <w:r>
@@ -9395,58 +9013,7 @@
           <w:rFonts w:ascii="Times New Roman" w:hAnsi="Times New Roman" w:cs="Times New Roman"/>
           <w:sz w:val="24"/>
         </w:rPr>
-        <w:t xml:space="preserve"> og karakteriseres av stabilt, forutsigbart forbruk; Y-artikler har </w:t>
-      </w:r>
-      <m:oMath>
-        <m:r>
-          <m:t>0</m:t>
-        </m:r>
-        <m:r>
-          <m:t>,</m:t>
-        </m:r>
-        <m:r>
-          <m:t>5≤</m:t>
-        </m:r>
-      </m:oMath>
-      <w:r>
-        <w:rPr>
-          <w:rFonts w:ascii="Times New Roman" w:hAnsi="Times New Roman" w:cs="Times New Roman"/>
-          <w:sz w:val="24"/>
-        </w:rPr>
-        <w:t>CV &lt; 1</w:t>
-      </w:r>
-      <m:oMath>
-        <m:r>
-          <m:t>,</m:t>
-        </m:r>
-        <m:r>
-          <m:t>0</m:t>
-        </m:r>
-      </m:oMath>
-      <w:r>
-        <w:rPr>
-          <w:rFonts w:ascii="Times New Roman" w:hAnsi="Times New Roman" w:cs="Times New Roman"/>
-          <w:sz w:val="24"/>
-        </w:rPr>
-        <w:t xml:space="preserve"> og viser moderate svingninger; Z-artikler har </w:t>
-      </w:r>
-      <m:oMath>
-        <m:r>
-          <m:t>CV≥1</m:t>
-        </m:r>
-        <m:r>
-          <m:t>,</m:t>
-        </m:r>
-        <m:r>
-          <m:t>0</m:t>
-        </m:r>
-      </m:oMath>
-      <w:r>
-        <w:rPr>
-          <w:rFonts w:ascii="Times New Roman" w:hAnsi="Times New Roman" w:cs="Times New Roman"/>
-          <w:sz w:val="24"/>
-        </w:rPr>
-        <w:t xml:space="preserve"> og kjennetegnes av uregelmessig eller sesongpreget etterspørsel.</w:t>
+        <w:t xml:space="preserve"> uregelmessig). Den formelle definisjonen er gitt i kapittel 5.</w:t>
       </w:r>
     </w:p>
     <w:p>
@@ -9458,19 +9025,7 @@
           <w:rFonts w:ascii="Times New Roman" w:hAnsi="Times New Roman" w:cs="Times New Roman"/>
           <w:sz w:val="24"/>
         </w:rPr>
-        <w:t>XYZ-analyse er metodisk komplementær til ABC fordi den tilføyer en tidsseriedimensjon til verdianalysen. En artikkel med høy innkjøpsverdi (A-klasse) og stabilt forbruk (X-klasse) er en svært god kandidat for sentralisert styring gjennom et regionalt lager, fordi etterspørselen er lett å planlegge og aggregert volum kan utnyttes for innkjøpsstordriftsfordeler. En AZ-artikkel krever derimot lokal beredskapslagring uavhengig av verdi, fordi forsyningssikkerhet ikke kan garanteres gjennom sentraliserte leveranser med standard ledetid. Suryaputri et al. (2022) viser i sin casestudie fra helseindustrien at ABC/XYZ-matrisen med ni kategorier gir substansielt bedre differensiering av bestillingspolicy sammenlignet med enkelt-kriterieanalyse.</w:t>
-      </w:r>
-    </w:p>
-    <w:p>
-      <w:pPr>
-        <w:spacing w:line="360" w:lineRule="auto"/>
-      </w:pPr>
-      <w:r>
-        <w:rPr>
-          <w:rFonts w:ascii="Times New Roman" w:hAnsi="Times New Roman" w:cs="Times New Roman"/>
-          <w:sz w:val="24"/>
-        </w:rPr>
-        <w:t>En sentral utfordring i denne oppgaven er forholdet mellom beregnet XYZ fra forbruksdata (MSEG) og SAP-systemets lagrede XYZ-verdi (MDMA.ZZXYZ). SAP-feltet ZZXYZ oppdateres ikke nødvendigvis løpende og kan basere seg på andre terskelverdier enn de som er standard i litteraturen. Oppgavens analyse behandler dette som et empirisk valideringsspørsmål og rapporterer samsvarsprosenten eksplisitt som et datakvalitetsfunn.</w:t>
+        <w:t>XYZ er metodisk komplementær til ABC: en AX-artikkel er en svært god kandidat for sentralisert styring, mens en AZ-artikkel krever lokal beredskapslagring uavhengig av verdi. Suryaputri et al. (2022) viser at ABC/XYZ-matrisen gir substansielt bedre differensiering av bestillingspolicy sammenlignet med enkelt-kriterieanalyse. En sentral utfordring er at SAP-feltet ZZXYZ ikke oppdateres løpende; oppgaven behandler dette som et valideringsspørsmål og rapporterer samsvarsprosenten eksplisitt.</w:t>
       </w:r>
     </w:p>
     <w:p>
@@ -9495,298 +9050,19 @@
           <w:rFonts w:ascii="Times New Roman" w:hAnsi="Times New Roman" w:cs="Times New Roman"/>
           <w:sz w:val="24"/>
         </w:rPr>
-        <w:t>Economic Order Quantity (EOQ), også kjent som Wilson-modellen, er en klassisk lagerstyringsmodell som beregner den optimale bestillingsmengden som minimerer summen av årlige ordrekostnader og holdekostnader. Modellen er formulert som en minimering av totalkostnadsfunksjonen:</w:t>
+        <w:t>Economic Order Quantity (EOQ), også kjent som Wilson-modellen, beregner den optimale bestillingsmengden som minimerer summen av årlige ordrekostnader og holdekostnader (Ketkar &amp; Vaidya, 2014). I denne oppgaven benyttes EOQ primært for å identifisere artikler der faktisk bestillingsfrekvens avviker vesentlig fra den optimale, og der kostnadsavviket er kvantifiserbart. Den formelle modellformuleringen er gitt i kapittel 5.</w:t>
       </w:r>
     </w:p>
     <w:p>
       <w:pPr>
         <w:spacing w:line="360" w:lineRule="auto"/>
-        <w:jc w:val="center"/>
-      </w:pPr>
-      <m:oMath>
-        <m:r>
-          <m:t>TC(Q)=</m:t>
-        </m:r>
-        <m:f>
-          <m:fPr>
-            <m:type m:val="bar"/>
-          </m:fPr>
-          <m:num>
-            <m:r>
-              <m:t>D</m:t>
-            </m:r>
-          </m:num>
-          <m:den>
-            <m:r>
-              <m:t>Q</m:t>
-            </m:r>
-          </m:den>
-        </m:f>
-        <m:r>
-          <m:t>·S+</m:t>
-        </m:r>
-        <m:f>
-          <m:fPr>
-            <m:type m:val="bar"/>
-          </m:fPr>
-          <m:num>
-            <m:r>
-              <m:t>Q</m:t>
-            </m:r>
-          </m:num>
-          <m:den>
-            <m:r>
-              <m:t>2</m:t>
-            </m:r>
-          </m:den>
-        </m:f>
-        <m:r>
-          <m:t>·H</m:t>
-        </m:r>
-      </m:oMath>
-    </w:p>
-    <w:p>
-      <w:pPr>
-        <w:spacing w:line="360" w:lineRule="auto"/>
-      </w:pPr>
-      <w:r>
-        <w:rPr>
-          <w:rFonts w:ascii="Times New Roman" w:hAnsi="Times New Roman" w:cs="Times New Roman"/>
-          <w:sz w:val="24"/>
-        </w:rPr>
-        <w:t xml:space="preserve">der </w:t>
-      </w:r>
-      <m:oMath>
-        <m:r>
-          <m:t>D</m:t>
-        </m:r>
-      </m:oMath>
-      <w:r>
-        <w:rPr>
-          <w:rFonts w:ascii="Times New Roman" w:hAnsi="Times New Roman" w:cs="Times New Roman"/>
-          <w:sz w:val="24"/>
-        </w:rPr>
-        <w:t xml:space="preserve"> er årlig etterspørsel i enheter, </w:t>
-      </w:r>
-      <m:oMath>
-        <m:r>
-          <m:t>Q</m:t>
-        </m:r>
-      </m:oMath>
-      <w:r>
-        <w:rPr>
-          <w:rFonts w:ascii="Times New Roman" w:hAnsi="Times New Roman" w:cs="Times New Roman"/>
-          <w:sz w:val="24"/>
-        </w:rPr>
-        <w:t xml:space="preserve"> er bestillingsmengden, </w:t>
-      </w:r>
-      <m:oMath>
-        <m:r>
-          <m:t>S</m:t>
-        </m:r>
-      </m:oMath>
-      <w:r>
-        <w:rPr>
-          <w:rFonts w:ascii="Times New Roman" w:hAnsi="Times New Roman" w:cs="Times New Roman"/>
-          <w:sz w:val="24"/>
-        </w:rPr>
-        <w:t xml:space="preserve"> er kostnad per ordre (kroner per bestillingstransaksjon), og </w:t>
-      </w:r>
-      <m:oMath>
-        <m:r>
-          <m:t>H</m:t>
-        </m:r>
-      </m:oMath>
-      <w:r>
-        <w:rPr>
-          <w:rFonts w:ascii="Times New Roman" w:hAnsi="Times New Roman" w:cs="Times New Roman"/>
-          <w:sz w:val="24"/>
-        </w:rPr>
-        <w:t xml:space="preserve"> er holdekostnad per enhet per år (kroner). Minimering av </w:t>
-      </w:r>
-      <m:oMath>
-        <m:r>
-          <m:t>TC(Q)</m:t>
-        </m:r>
-      </m:oMath>
-      <w:r>
-        <w:rPr>
-          <w:rFonts w:ascii="Times New Roman" w:hAnsi="Times New Roman" w:cs="Times New Roman"/>
-          <w:sz w:val="24"/>
-        </w:rPr>
-        <w:t xml:space="preserve"> med hensyn til </w:t>
-      </w:r>
-      <m:oMath>
-        <m:r>
-          <m:t>Q</m:t>
-        </m:r>
-      </m:oMath>
-      <w:r>
-        <w:rPr>
-          <w:rFonts w:ascii="Times New Roman" w:hAnsi="Times New Roman" w:cs="Times New Roman"/>
-          <w:sz w:val="24"/>
-        </w:rPr>
-        <w:t xml:space="preserve"> gir den optimale bestillingsmengden:</w:t>
-      </w:r>
-    </w:p>
-    <w:p>
-      <w:pPr>
-        <w:spacing w:line="360" w:lineRule="auto"/>
-        <w:jc w:val="center"/>
-      </w:pPr>
-      <m:oMath>
-        <m:sSup>
-          <m:e>
-            <m:r>
-              <m:t>Q</m:t>
-            </m:r>
-          </m:e>
-          <m:sup>
-            <m:r>
-              <m:t>*</m:t>
-            </m:r>
-          </m:sup>
-        </m:sSup>
-        <m:r>
-          <m:t>=</m:t>
-        </m:r>
-        <m:rad>
-          <m:radPr>
-            <m:degHide m:val="on"/>
-          </m:radPr>
-          <m:deg/>
-          <m:e>
-            <m:f>
-              <m:fPr>
-                <m:type m:val="bar"/>
-              </m:fPr>
-              <m:num>
-                <m:r>
-                  <m:t>2DS</m:t>
-                </m:r>
-              </m:num>
-              <m:den>
-                <m:r>
-                  <m:t>H</m:t>
-                </m:r>
-              </m:den>
-            </m:f>
-          </m:e>
-        </m:rad>
-      </m:oMath>
-    </w:p>
-    <w:p>
-      <w:pPr>
-        <w:spacing w:line="360" w:lineRule="auto"/>
-      </w:pPr>
-      <w:r>
-        <w:rPr>
-          <w:rFonts w:ascii="Times New Roman" w:hAnsi="Times New Roman" w:cs="Times New Roman"/>
-          <w:sz w:val="24"/>
-        </w:rPr>
-        <w:t xml:space="preserve">Den tilhørende optimale bestillingsfrekvensen er </w:t>
-      </w:r>
-      <m:oMath>
-        <m:sSup>
-          <m:e>
-            <m:r>
-              <m:t>f</m:t>
-            </m:r>
-          </m:e>
-          <m:sup>
-            <m:r>
-              <m:t>*</m:t>
-            </m:r>
-          </m:sup>
-        </m:sSup>
-        <m:r>
-          <m:t>=D/</m:t>
-        </m:r>
-        <m:sSup>
-          <m:e>
-            <m:r>
-              <m:t>Q</m:t>
-            </m:r>
-          </m:e>
-          <m:sup>
-            <m:r>
-              <m:t>*</m:t>
-            </m:r>
-          </m:sup>
-        </m:sSup>
-      </m:oMath>
-      <w:r>
-        <w:rPr>
-          <w:rFonts w:ascii="Times New Roman" w:hAnsi="Times New Roman" w:cs="Times New Roman"/>
-          <w:sz w:val="24"/>
-        </w:rPr>
-        <w:t xml:space="preserve"> ordrer per år. Enhver avvik fra </w:t>
-      </w:r>
-      <m:oMath>
-        <m:sSup>
-          <m:e>
-            <m:r>
-              <m:t>f</m:t>
-            </m:r>
-          </m:e>
-          <m:sup>
-            <m:r>
-              <m:t>*</m:t>
-            </m:r>
-          </m:sup>
-        </m:sSup>
-      </m:oMath>
-      <w:r>
-        <w:rPr>
-          <w:rFonts w:ascii="Times New Roman" w:hAnsi="Times New Roman" w:cs="Times New Roman"/>
-          <w:sz w:val="24"/>
-        </w:rPr>
-        <w:t xml:space="preserve"> — enten mot for hyppige eller for sjeldne bestillinger — medfører unødvendige kostnader. I denne oppgaven benyttes EOQ primært for å identifisere artikler der faktisk bestillingsfrekvens avviker vesentlig fra </w:t>
-      </w:r>
-      <m:oMath>
-        <m:sSup>
-          <m:e>
-            <m:r>
-              <m:t>f</m:t>
-            </m:r>
-          </m:e>
-          <m:sup>
-            <m:r>
-              <m:t>*</m:t>
-            </m:r>
-          </m:sup>
-        </m:sSup>
-      </m:oMath>
-      <w:r>
-        <w:rPr>
-          <w:rFonts w:ascii="Times New Roman" w:hAnsi="Times New Roman" w:cs="Times New Roman"/>
-          <w:sz w:val="24"/>
-        </w:rPr>
-        <w:t>, og der kostnadsavviket er kvantifiserbart (Ketkar &amp; Vaidya, 2014).</w:t>
-      </w:r>
-    </w:p>
-    <w:p>
-      <w:pPr>
-        <w:spacing w:line="360" w:lineRule="auto"/>
-      </w:pPr>
-      <w:r>
-        <w:rPr>
-          <w:rFonts w:ascii="Times New Roman" w:hAnsi="Times New Roman" w:cs="Times New Roman"/>
-          <w:sz w:val="24"/>
-        </w:rPr>
-        <w:t>Modellen hviler på en rekke forutsetninger: konstant og kjent etterspørsel, øyeblikkelig leveranse (ingen ledetid), ingen kvantumsrabatter og lineær holdekostnad. I praksis brytes samtlige av disse forutsetningene i varierende grad. Hautaniemi og Pirttilä (1999) diskuterer dette i en MRP-kontekst og påpeker at EOQ i mange tilfeller overstiger faktisk etterspørsel per periode, noe som genererer suboptimale partistørrelser. Pujawan (2004) viser at unøyaktige lot-sizing-regler kan forplante seg som ordrevariabilitet oppover i forsyningskjeden — det såkalte bullwhip-fenomenet. I sykehuskontekst begrenses disse problemene noe av det faktum at medisinsk forbruksmateriell har relativt stabile etterspørselsmønstre for store volumartikler, men problemstillingen er like fullt relevant for Z-klassifiserte artikler.</w:t>
-      </w:r>
-    </w:p>
-    <w:p>
-      <w:pPr>
-        <w:spacing w:line="360" w:lineRule="auto"/>
-      </w:pPr>
-      <w:r>
-        <w:rPr>
-          <w:rFonts w:ascii="Times New Roman" w:hAnsi="Times New Roman" w:cs="Times New Roman"/>
-          <w:sz w:val="24"/>
-        </w:rPr>
-        <w:t xml:space="preserve">I denne oppgaven er parameterne satt til </w:t>
+      </w:pPr>
+      <w:r>
+        <w:rPr>
+          <w:rFonts w:ascii="Times New Roman" w:hAnsi="Times New Roman" w:cs="Times New Roman"/>
+          <w:sz w:val="24"/>
+        </w:rPr>
+        <w:t>Modellen forutsetter konstant etterspørsel, øyeblikkelig leveranse, ingen kvantumsrabatter og lineær holdekostnad — forutsetninger som i praksis brytes i varierende grad. Hautaniemi og Pirttilä (1999) påpeker at EOQ i mange tilfeller overstiger faktisk etterspørsel per periode, og Pujawan (2004) viser at suboptimale partistørrelser kan forplante seg som ordrevariabilitet oppover i forsyningskjeden. I sykehuskontekst begrenses dette noe av relativt stabile etterspørselsmønstre for volumartikler, men problemstillingen er relevant for Z-klassifiserte artikler. Parametervalgene (</w:t>
       </w:r>
       <m:oMath>
         <m:r>
@@ -9798,7 +9074,7 @@
           <w:rFonts w:ascii="Times New Roman" w:hAnsi="Times New Roman" w:cs="Times New Roman"/>
           <w:sz w:val="24"/>
         </w:rPr>
-        <w:t xml:space="preserve"> NOK og </w:t>
+        <w:t xml:space="preserve"> NOK, </w:t>
       </w:r>
       <m:oMath>
         <m:r>
@@ -9813,420 +9089,7 @@
           <w:rFonts w:ascii="Times New Roman" w:hAnsi="Times New Roman" w:cs="Times New Roman"/>
           <w:sz w:val="24"/>
         </w:rPr>
-        <w:t xml:space="preserve">, der </w:t>
-      </w:r>
-      <m:oMath>
-        <m:r>
-          <m:t>p</m:t>
-        </m:r>
-      </m:oMath>
-      <w:r>
-        <w:rPr>
-          <w:rFonts w:ascii="Times New Roman" w:hAnsi="Times New Roman" w:cs="Times New Roman"/>
-          <w:sz w:val="24"/>
-        </w:rPr>
-        <w:t xml:space="preserve"> er enhetsprisen fra MBEW. Sensitivitetsanalysen varierer </w:t>
-      </w:r>
-      <m:oMath>
-        <m:r>
-          <m:t>S∈{500,750,1</m:t>
-        </m:r>
-        <m:r>
-          <m:t>000}</m:t>
-        </m:r>
-      </m:oMath>
-      <w:r>
-        <w:rPr>
-          <w:rFonts w:ascii="Times New Roman" w:hAnsi="Times New Roman" w:cs="Times New Roman"/>
-          <w:sz w:val="24"/>
-        </w:rPr>
-        <w:t xml:space="preserve"> NOK og holdekostnadssatsen </w:t>
-      </w:r>
-      <m:oMath>
-        <m:r>
-          <m:t>∈{15</m:t>
-        </m:r>
-        <m:r>
-          <m:t>%,20</m:t>
-        </m:r>
-        <m:r>
-          <m:t>%,25</m:t>
-        </m:r>
-        <m:r>
-          <m:t>%}</m:t>
-        </m:r>
-      </m:oMath>
-      <w:r>
-        <w:rPr>
-          <w:rFonts w:ascii="Times New Roman" w:hAnsi="Times New Roman" w:cs="Times New Roman"/>
-          <w:sz w:val="24"/>
-        </w:rPr>
-        <w:t xml:space="preserve"> for å kartlegge robustheten i besparelsesestimatene.</w:t>
-      </w:r>
-    </w:p>
-    <w:p>
-      <w:pPr>
-        <w:spacing w:line="360" w:lineRule="auto"/>
-      </w:pPr>
-      <w:r>
-        <w:rPr>
-          <w:rFonts w:ascii="Times New Roman" w:hAnsi="Times New Roman" w:cs="Times New Roman"/>
-          <w:sz w:val="24"/>
-        </w:rPr>
-        <w:t xml:space="preserve">Totalkostnaden ved en gitt ordrefrekvens </w:t>
-      </w:r>
-      <m:oMath>
-        <m:r>
-          <m:t>f</m:t>
-        </m:r>
-      </m:oMath>
-      <w:r>
-        <w:rPr>
-          <w:rFonts w:ascii="Times New Roman" w:hAnsi="Times New Roman" w:cs="Times New Roman"/>
-          <w:sz w:val="24"/>
-        </w:rPr>
-        <w:t xml:space="preserve"> er:</w:t>
-      </w:r>
-    </w:p>
-    <w:p>
-      <w:pPr>
-        <w:spacing w:line="360" w:lineRule="auto"/>
-        <w:jc w:val="center"/>
-      </w:pPr>
-      <m:oMath>
-        <m:r>
-          <m:t>TC(f)=f·S+</m:t>
-        </m:r>
-        <m:f>
-          <m:fPr>
-            <m:type m:val="bar"/>
-          </m:fPr>
-          <m:num>
-            <m:r>
-              <m:t>D</m:t>
-            </m:r>
-          </m:num>
-          <m:den>
-            <m:r>
-              <m:t>2f</m:t>
-            </m:r>
-          </m:den>
-        </m:f>
-        <m:r>
-          <m:t>·H</m:t>
-        </m:r>
-      </m:oMath>
-    </w:p>
-    <w:p>
-      <w:pPr>
-        <w:spacing w:line="360" w:lineRule="auto"/>
-      </w:pPr>
-      <w:r>
-        <w:rPr>
-          <w:rFonts w:ascii="Times New Roman" w:hAnsi="Times New Roman" w:cs="Times New Roman"/>
-          <w:sz w:val="24"/>
-        </w:rPr>
-        <w:t xml:space="preserve">Optimal frekvens minimerer </w:t>
-      </w:r>
-      <m:oMath>
-        <m:r>
-          <m:t>TC(f)</m:t>
-        </m:r>
-      </m:oMath>
-      <w:r>
-        <w:rPr>
-          <w:rFonts w:ascii="Times New Roman" w:hAnsi="Times New Roman" w:cs="Times New Roman"/>
-          <w:sz w:val="24"/>
-        </w:rPr>
-        <w:t>:</w:t>
-      </w:r>
-    </w:p>
-    <w:p>
-      <w:pPr>
-        <w:spacing w:line="360" w:lineRule="auto"/>
-        <w:jc w:val="center"/>
-      </w:pPr>
-      <m:oMath>
-        <m:sSup>
-          <m:e>
-            <m:r>
-              <m:t>f</m:t>
-            </m:r>
-          </m:e>
-          <m:sup>
-            <m:r>
-              <m:t>*</m:t>
-            </m:r>
-          </m:sup>
-        </m:sSup>
-        <m:r>
-          <m:t>=</m:t>
-        </m:r>
-        <m:rad>
-          <m:radPr>
-            <m:degHide m:val="on"/>
-          </m:radPr>
-          <m:deg/>
-          <m:e>
-            <m:f>
-              <m:fPr>
-                <m:type m:val="bar"/>
-              </m:fPr>
-              <m:num>
-                <m:r>
-                  <m:t>DH</m:t>
-                </m:r>
-              </m:num>
-              <m:den>
-                <m:r>
-                  <m:t>2S</m:t>
-                </m:r>
-              </m:den>
-            </m:f>
-          </m:e>
-        </m:rad>
-      </m:oMath>
-    </w:p>
-    <w:p>
-      <w:pPr>
-        <w:spacing w:line="360" w:lineRule="auto"/>
-      </w:pPr>
-      <w:r>
-        <w:rPr>
-          <w:rFonts w:ascii="Times New Roman" w:hAnsi="Times New Roman" w:cs="Times New Roman"/>
-          <w:sz w:val="24"/>
-        </w:rPr>
-        <w:t xml:space="preserve">og EOQ fremkommer som </w:t>
-      </w:r>
-      <m:oMath>
-        <m:sSup>
-          <m:e>
-            <m:r>
-              <m:t>Q</m:t>
-            </m:r>
-          </m:e>
-          <m:sup>
-            <m:r>
-              <m:t>*</m:t>
-            </m:r>
-          </m:sup>
-        </m:sSup>
-        <m:r>
-          <m:t>=D/</m:t>
-        </m:r>
-        <m:sSup>
-          <m:e>
-            <m:r>
-              <m:t>f</m:t>
-            </m:r>
-          </m:e>
-          <m:sup>
-            <m:r>
-              <m:t>*</m:t>
-            </m:r>
-          </m:sup>
-        </m:sSup>
-      </m:oMath>
-      <w:r>
-        <w:rPr>
-          <w:rFonts w:ascii="Times New Roman" w:hAnsi="Times New Roman" w:cs="Times New Roman"/>
-          <w:sz w:val="24"/>
-        </w:rPr>
-        <w:t xml:space="preserve">. Kostnadsavviket for en artikkel med observert frekvens </w:t>
-      </w:r>
-      <m:oMath>
-        <m:sSub>
-          <m:e>
-            <m:r>
-              <m:t>f</m:t>
-            </m:r>
-          </m:e>
-          <m:sub>
-            <m:r>
-              <m:rPr>
-                <m:nor/>
-              </m:rPr>
-              <m:t>obs</m:t>
-            </m:r>
-          </m:sub>
-        </m:sSub>
-      </m:oMath>
-      <w:r>
-        <w:rPr>
-          <w:rFonts w:ascii="Times New Roman" w:hAnsi="Times New Roman" w:cs="Times New Roman"/>
-          <w:sz w:val="24"/>
-        </w:rPr>
-        <w:t xml:space="preserve"> er:</w:t>
-      </w:r>
-    </w:p>
-    <w:p>
-      <w:pPr>
-        <w:spacing w:line="360" w:lineRule="auto"/>
-        <w:jc w:val="center"/>
-      </w:pPr>
-      <m:oMath>
-        <m:r>
-          <m:t>ΔT</m:t>
-        </m:r>
-        <m:sSub>
-          <m:e>
-            <m:r>
-              <m:t>C</m:t>
-            </m:r>
-          </m:e>
-          <m:sub>
-            <m:r>
-              <m:t>i</m:t>
-            </m:r>
-          </m:sub>
-        </m:sSub>
-        <m:r>
-          <m:t>=TC(</m:t>
-        </m:r>
-        <m:sSub>
-          <m:e>
-            <m:r>
-              <m:t>f</m:t>
-            </m:r>
-          </m:e>
-          <m:sub>
-            <m:r>
-              <m:rPr>
-                <m:nor/>
-              </m:rPr>
-              <m:t>obs</m:t>
-            </m:r>
-            <m:r>
-              <m:t>,i</m:t>
-            </m:r>
-          </m:sub>
-        </m:sSub>
-        <m:r>
-          <m:t>)−TC(</m:t>
-        </m:r>
-        <m:sSubSup>
-          <m:e>
-            <m:r>
-              <m:t>f</m:t>
-            </m:r>
-          </m:e>
-          <m:sub>
-            <m:r>
-              <m:t>i</m:t>
-            </m:r>
-          </m:sub>
-          <m:sup>
-            <m:r>
-              <m:t>*</m:t>
-            </m:r>
-          </m:sup>
-        </m:sSubSup>
-        <m:r>
-          <m:t>)</m:t>
-        </m:r>
-      </m:oMath>
-    </w:p>
-    <w:p>
-      <w:pPr>
-        <w:spacing w:line="360" w:lineRule="auto"/>
-      </w:pPr>
-      <w:r>
-        <w:rPr>
-          <w:rFonts w:ascii="Times New Roman" w:hAnsi="Times New Roman" w:cs="Times New Roman"/>
-          <w:sz w:val="24"/>
-        </w:rPr>
-        <w:t>Samlet besparelse ved HVFS-overføring er:</w:t>
-      </w:r>
-    </w:p>
-    <w:p>
-      <w:pPr>
-        <w:spacing w:line="360" w:lineRule="auto"/>
-        <w:jc w:val="center"/>
-      </w:pPr>
-      <m:oMath>
-        <m:sSub>
-          <m:e>
-            <m:r>
-              <m:t>B</m:t>
-            </m:r>
-          </m:e>
-          <m:sub>
-            <m:r>
-              <m:rPr>
-                <m:nor/>
-              </m:rPr>
-              <m:t>HVFS</m:t>
-            </m:r>
-          </m:sub>
-        </m:sSub>
-        <m:r>
-          <m:t>=</m:t>
-        </m:r>
-        <m:nary>
-          <m:naryPr>
-            <m:chr m:val="∑"/>
-            <m:limLoc m:val="subSup"/>
-            <m:grow m:val="1"/>
-            <m:subHide m:val="off"/>
-            <m:supHide m:val="on"/>
-          </m:naryPr>
-          <m:sub>
-            <m:r>
-              <m:t>i∈</m:t>
-            </m:r>
-            <m:r>
-              <m:rPr>
-                <m:nor/>
-              </m:rPr>
-              <m:t>OVERFØR</m:t>
-            </m:r>
-          </m:sub>
-          <m:sup/>
-          <m:e>
-            <m:r>
-              <m:t>ΔT</m:t>
-            </m:r>
-          </m:e>
-        </m:nary>
-        <m:sSub>
-          <m:e>
-            <m:r>
-              <m:t>C</m:t>
-            </m:r>
-          </m:e>
-          <m:sub>
-            <m:r>
-              <m:t>i</m:t>
-            </m:r>
-          </m:sub>
-        </m:sSub>
-        <m:r>
-          <m:t>·g</m:t>
-        </m:r>
-      </m:oMath>
-    </w:p>
-    <w:p>
-      <w:pPr>
-        <w:spacing w:line="360" w:lineRule="auto"/>
-      </w:pPr>
-      <w:r>
-        <w:rPr>
-          <w:rFonts w:ascii="Times New Roman" w:hAnsi="Times New Roman" w:cs="Times New Roman"/>
-          <w:sz w:val="24"/>
-        </w:rPr>
-        <w:t xml:space="preserve">der </w:t>
-      </w:r>
-      <m:oMath>
-        <m:r>
-          <m:t>g</m:t>
-        </m:r>
-      </m:oMath>
-      <w:r>
-        <w:rPr>
-          <w:rFonts w:ascii="Times New Roman" w:hAnsi="Times New Roman" w:cs="Times New Roman"/>
-          <w:sz w:val="24"/>
-        </w:rPr>
-        <w:t xml:space="preserve"> er en gevinstrealiseringsgrad som reflekterer at ikke alle teoretiske besparelser lar seg realisere fullt ut i praksis. Den detaljerte modellformuleringen er beskrevet i kapittel 5.</w:t>
+        <w:t>) er begrunnet i kapittel 5, og sensitivitetsanalysen varierer begge for å kartlegge robustheten.</w:t>
       </w:r>
     </w:p>
     <w:p>
@@ -10263,7 +9126,7 @@
           <w:rFonts w:ascii="Times New Roman" w:hAnsi="Times New Roman" w:cs="Times New Roman"/>
           <w:sz w:val="24"/>
         </w:rPr>
-        <w:t xml:space="preserve"> klynger ved å minimere summen av kvadrerte euklidske avstander fra hvert datapunkt til tilhørende klyngesenter (sentroid). Algoritmen itererer over to steg: (1) tilordne hvert punkt til nærmeste sentroid, og (2) oppdatere sentroides som gjennomsnittet av tilordnede punkter. Prosessen gjentas til konvergens, det vil si at klyngetilhørigheten ikke lenger endres mellom iterasjoner (Pedregosa et al., 2011).</w:t>
+        <w:t xml:space="preserve"> klynger ved å minimere summen av kvadrerte euklidske avstander fra hvert datapunkt til tilhørende klyngesenter (Pedregosa et al., 2011). Optimalt antall klynger bestemmes via silhouette-score, der verdier over 0,3 anses akseptable (Pedregosa et al., 2011). Log-transformasjon og z-score-standardisering sikrer at variabler med ulik skala bidrar likeverdig til distanseberegningene; den tekniske spesifikasjonen er gitt i kapittel 5.</w:t>
       </w:r>
     </w:p>
     <w:p>
@@ -10275,97 +9138,7 @@
           <w:rFonts w:ascii="Times New Roman" w:hAnsi="Times New Roman" w:cs="Times New Roman"/>
           <w:sz w:val="24"/>
         </w:rPr>
-        <w:t xml:space="preserve">For å bestemme optimalt antall klynger </w:t>
-      </w:r>
-      <m:oMath>
-        <m:r>
-          <m:t>K</m:t>
-        </m:r>
-      </m:oMath>
-      <w:r>
-        <w:rPr>
-          <w:rFonts w:ascii="Times New Roman" w:hAnsi="Times New Roman" w:cs="Times New Roman"/>
-          <w:sz w:val="24"/>
-        </w:rPr>
-        <w:t xml:space="preserve"> benyttes to komplementære valideringsmetoder. Albue-metoden (elbow method) plotter intra-klyngevariansen (WCSS — Within-Cluster Sum of Squares) som funksjon av </w:t>
-      </w:r>
-      <m:oMath>
-        <m:r>
-          <m:t>K</m:t>
-        </m:r>
-      </m:oMath>
-      <w:r>
-        <w:rPr>
-          <w:rFonts w:ascii="Times New Roman" w:hAnsi="Times New Roman" w:cs="Times New Roman"/>
-          <w:sz w:val="24"/>
-        </w:rPr>
-        <w:t xml:space="preserve"> og identifiserer det punktet der marginalreduksjonen flater ut. Silhouette-score kvantifiserer dette mer presist: for hvert datapunkt beregnes et mål på separasjonen mellom klynger relativt til kohesjon innen klyngen, og gjennomsnittsscoren over alle punkter ligger mellom -1 og 1, der verdier over 0,3 anses som akseptable og verdier over 0,5 som gode (Pedregosa et al., 2011). I denne oppgaven er </w:t>
-      </w:r>
-      <m:oMath>
-        <m:r>
-          <m:t>K=3</m:t>
-        </m:r>
-      </m:oMath>
-      <w:r>
-        <w:rPr>
-          <w:rFonts w:ascii="Times New Roman" w:hAnsi="Times New Roman" w:cs="Times New Roman"/>
-          <w:sz w:val="24"/>
-        </w:rPr>
-        <w:t xml:space="preserve"> valgt på bakgrunn av begge kriterier.</w:t>
-      </w:r>
-    </w:p>
-    <w:p>
-      <w:pPr>
-        <w:spacing w:line="360" w:lineRule="auto"/>
-      </w:pPr>
-      <w:r>
-        <w:rPr>
-          <w:rFonts w:ascii="Times New Roman" w:hAnsi="Times New Roman" w:cs="Times New Roman"/>
-          <w:sz w:val="24"/>
-        </w:rPr>
-        <w:t>To tekniske forbehandlingstrinn er faglig motiverte og avgjørende for analysens validitet. Log-transformasjon (</w:t>
-      </w:r>
-      <m:oMath>
-        <m:r>
-          <m:rPr>
-            <m:sty m:val="p"/>
-          </m:rPr>
-          <m:t>log</m:t>
-        </m:r>
-        <m:r>
-          <m:t>(1+x)</m:t>
-        </m:r>
-      </m:oMath>
-      <w:r>
-        <w:rPr>
-          <w:rFonts w:ascii="Times New Roman" w:hAnsi="Times New Roman" w:cs="Times New Roman"/>
-          <w:sz w:val="24"/>
-        </w:rPr>
-        <w:t>) benyttes på skjevfordelte variabler som innkjøpsverdi og ordrefrekvens, da disse typisk har kraftige halefordelinger der noen få høyverdiartikler ellers vil dominere klyngedannelsen og maskere strukturen blant den store majoriteten av artikler. Z-score-standardisering (nullgjennomsnitt, enhetsstandaravvik) sikrer at variabler med ulik skala og enhet — kroner, ordrefrekvens og variasjonskoeffisient — bidrar likeverdig til distanseberegningene. Uten standardisering vil den absolutte skalaen til prisvariabler dominere over CV-variabler, noe som ville gi klynger styrt av verdi alene fremfor den kombinerte profilen analysen søker å avdekke.</w:t>
-      </w:r>
-    </w:p>
-    <w:p>
-      <w:pPr>
-        <w:spacing w:line="360" w:lineRule="auto"/>
-      </w:pPr>
-      <w:r>
-        <w:rPr>
-          <w:rFonts w:ascii="Times New Roman" w:hAnsi="Times New Roman" w:cs="Times New Roman"/>
-          <w:sz w:val="24"/>
-        </w:rPr>
-        <w:t>Srinivasan og Moon (1999) viser at klyngeanalyse for strategisk forsyningskjedeanalyse gir resultater nær optimale sammenlignet med helhetlige optimeringer, og at metoden er praktisk håndterbar for store sortiment. Sammenlignet med regelbaserte klassifiseringsmetoder alene har klyngeanalyse den fordelen at den er data-drevet og ikke forutsetter forhåndsdefinerte terskelverdier. Begrensningen er at K-means er sensitiv for initialiseringen og forutsetter et konvekst, sfærisk klyngemønster — noe som ikke alltid er oppfylt i lagerdata. I denne oppgaven håndteres initialiseringsproblematikken ved bruk av k-means++ initialisering og random_state = 42 for reproduserbarhet, og klyngeresultatene valideres mot silhouette-score for begge delsett i et 80/20-split.</w:t>
-      </w:r>
-    </w:p>
-    <w:p>
-      <w:pPr>
-        <w:spacing w:line="360" w:lineRule="auto"/>
-      </w:pPr>
-      <w:r>
-        <w:rPr>
-          <w:rFonts w:ascii="Times New Roman" w:hAnsi="Times New Roman" w:cs="Times New Roman"/>
-          <w:sz w:val="24"/>
-        </w:rPr>
-        <w:t>I lagerstyringssammenheng brukes K-means primært som et segmenteringsverktøy for å identifisere artikkelgrupper med felles profil på tvers av flere dimensjoner samtidig — ikke som en prediktiv modell (Srinivasan &amp; Moon, 1999). Valg av K via silhouette-score er metodisk standard i eksplorativ klyngeanalyse og reduserer analytisk bias ved at K bestemmes av datastrukturen, ikke av forhåndsdefinerte kategorier (Pedregosa et al., 2011). Det finnes begrenset sykehus-spesifikk litteratur på K-means i lagerklassifisering; Gurumurthy et al. (2021) er blant de få som eksplisitt benytter klyngeanalyse i en sykehuslogistikkontekst, noe som understreker at metodekombinasjonen i denne studien bidrar til å utvide det empiriske grunnlaget på feltet.</w:t>
+        <w:t>Sammenlignet med regelbaserte klassifiseringsmetoder har klyngeanalyse den fordelen at den er datadrevet og ikke forutsetter forhåndsdefinerte terskelverdier (Srinivasan &amp; Moon, 1999). Begrensningen er at K-means er sensitiv for initialisering og forutsetter konvekse klyngemønstre. Det finnes begrenset sykehus-spesifikk litteratur på K-means i lagerklassifisering; Gurumurthy et al. (2021) er blant de få som eksplisitt benytter klyngeanalyse i sykehuslogistikk, noe som understreker at metodekombinasjonen i denne studien bidrar til å utvide det empiriske grunnlaget.</w:t>
       </w:r>
     </w:p>
     <w:p>
@@ -10390,7 +9163,7 @@
           <w:rFonts w:ascii="Times New Roman" w:hAnsi="Times New Roman" w:cs="Times New Roman"/>
           <w:sz w:val="24"/>
         </w:rPr>
-        <w:t>Sykehuslogistikk skiller seg fra industriell lagerstyring på flere vesentlige punkter. Det mest fundamentale er at forsyningssvikt kan ha direkte kliniske konsekvenser — mangel på forbruksmateriell i en operasjonsstue er ikke sammenlignbart med et utsolgt produkt i en butikk. Bijvank og Vis (2012) modellerer dette som et tapte-salg-lagersystem (lost sales) der stockout har direkte operasjonell kostnad utover den rene anskaffelseskostnaden. Konsekvensen er at sykehus tradisjonelt har akseptert høyere sikkerhetslager og høyere lagerkostnader enn det som er kostnadsoptimalt, som en forsikring mot forsyningssvikt.</w:t>
+        <w:t>Sykehuslogistikk skiller seg fra industriell lagerstyring ved at forsyningssvikt kan ha direkte kliniske konsekvenser. Bijvank og Vis (2012) modellerer dette som et tapte-salg-lagersystem der stockout har direkte operasjonell kostnad, noe som medfører at sykehus tradisjonelt aksepterer høyere sikkerhetslager enn det som er kostnadsoptimalt. Moons et al. (2019) peker på at ytelsesmåling i sykehusforsyningskjeder er fragmentert, og at økonomiindikatorer må balanseres mot serviceindikatorer for klinisk tilgjengelighet. Kumar og Kumar (2015) identifiserer leveringstid, lagernivå og bestillingsmønster som drivende faktorer, mens Sirisawat et al. (2019) viser at KPI-basert klassifisering forutsetter tilgang til operative ERP-data — en forutsetning SE16H-tilnærmingen i denne studien direkte adresserer.</w:t>
       </w:r>
     </w:p>
     <w:p>
@@ -10402,31 +9175,7 @@
           <w:rFonts w:ascii="Times New Roman" w:hAnsi="Times New Roman" w:cs="Times New Roman"/>
           <w:sz w:val="24"/>
         </w:rPr>
-        <w:t>Moons et al. (2019) peker på at ytelsesmåling i interne sykehusforsyningskjeder er fragmentert og mangler konsensus om felles indikatorer. Fire kategorier av indikatorer identifiseres: kvalitet, tid, økonomi og produktivitet. For klassifiseringsformål er økonomiindikatorer — lagerbinding, ordrekostnader, fill rate — de mest operasjonaliserbare, men de må balanseres mot serviceindikatorene som reflekterer klinisk tilgjengelighet. Kumar og Kumar (2015) identifiserte 16 nøkkelfaktorer for sykehuslagerstyring gjennom ISM-analyse, der leveringstid, lagernivå og bestillingsmønster fremstår som drivende faktorer for systemets samlede ytelse. Sirisawat et al. (2019) bekrefter dette ved å vise at KPI-basert klassifisering i universitetssykehus forutsetter tilgang til operative data fra ERP-systemer — en forutsetning som SE16H-tilnærmingen i denne studien direkte adresserer.</w:t>
-      </w:r>
-    </w:p>
-    <w:p>
-      <w:pPr>
-        <w:spacing w:line="360" w:lineRule="auto"/>
-      </w:pPr>
-      <w:r>
-        <w:rPr>
-          <w:rFonts w:ascii="Times New Roman" w:hAnsi="Times New Roman" w:cs="Times New Roman"/>
-          <w:sz w:val="24"/>
-        </w:rPr>
-        <w:t>Saha og Ray (2019) gjennomgikk 137 studier på lagerstyringsmodeller i helsesektoren og fant at casestudier med empiriske data fra ERP-systemer er underrepresentert i litteraturen sammenlignet med teoretiske modeller. De fremhever behovet for forskning som benytter faktiske transaksjonsdata fra systemer som SAP for å validere klassifiseringsresultater mot operative parametere. Gupta et al. (2007) viser i en konkret sykehusstudie at ABC-analyse med SAP-data reduserte lagerkapitalbindingen med om lag 10–15 prosent over en periode, noe som illustrerer det praktiske besparelsespotensialet av systematisk klassifiseringsarbeid.</w:t>
-      </w:r>
-    </w:p>
-    <w:p>
-      <w:pPr>
-        <w:spacing w:line="360" w:lineRule="auto"/>
-      </w:pPr>
-      <w:r>
-        <w:rPr>
-          <w:rFonts w:ascii="Times New Roman" w:hAnsi="Times New Roman" w:cs="Times New Roman"/>
-          <w:sz w:val="24"/>
-        </w:rPr>
-        <w:t>SAP S/4HANA er i dag det dominerende ERP-systemet i norske helseforetak, og LIBRA-prosjektet standardiserer plattformen på tvers av Helse Vest. Denne standardiseringen er en forutsetning for at en felles, datadrevet klassifiseringsmodell kan implementeres med overføringsverdi fra Helse Bergen til de øvrige helseforetakene i regionen. Fragapane et al. (2019) understreker at overgangen til sentraliserte APL-leveranser (avdelingspakkede leveranser) krever et systematisk klassifiseringsgrunnlag for å avgjøre hvilke artikler som egner seg for sentralisering versus lokal lagring nær bruksstedet. de Vries (2011) advarer imidlertid mot å undervurdere de organisatoriske barrierene: interessentkonflikter mellom logistikk, klinisk personell og økonomiavdelinger kan forsinke eller undergrave rasjonelle omstillingsbeslutninger selv der datagrunnlaget er godt.</w:t>
+        <w:t>Saha og Ray (2019) fant at casestudier med empiriske ERP-data er underrepresentert i litteraturen, og Gupta et al. (2007) viser at ABC-analyse med SAP-data reduserte lagerkapitalbindingen med 10–15 % i en sykehusstudie. Fragapane et al. (2019) understreker at sentraliserte APL-leveranser krever et systematisk klassifiseringsgrunnlag, mens de Vries (2011) advarer mot å undervurdere organisatoriske barrierer ved slike omstillinger.</w:t>
       </w:r>
     </w:p>
     <w:p>
@@ -11060,19 +9809,7 @@
           <w:rFonts w:ascii="Times New Roman" w:hAnsi="Times New Roman" w:cs="Times New Roman"/>
           <w:sz w:val="24"/>
         </w:rPr>
-        <w:t>Helse Bergen HF er det største helseforetaket i Helse Vest RHF og er organisert under den statlige spesialisthelsetjenesten. Foretaket drifter Haukeland Universitetssykehus — Norges nest største sykehus — og har ansvar for spesialisthelsetjenester til en befolkning på om lag 460 000 innbyggere i 18 kommuner i Hordaland. Med om lag 14 000 ansatte er Helse Bergen en av de største arbeidsgiverne på Vestlandet, og driftskostnadene er tilsvarende betydelige. Foretaket håndterer et bredt spekter av medisinske spesialiteter og har en kompleks intern logistikk som forsyner avdelinger over et stort geografisk anleggsareal.</w:t>
-      </w:r>
-    </w:p>
-    <w:p>
-      <w:pPr>
-        <w:spacing w:line="360" w:lineRule="auto"/>
-      </w:pPr>
-      <w:r>
-        <w:rPr>
-          <w:rFonts w:ascii="Times New Roman" w:hAnsi="Times New Roman" w:cs="Times New Roman"/>
-          <w:sz w:val="24"/>
-        </w:rPr>
-        <w:t>Helse Vest RHF koordinerer de fire helseforetakene Helse Bergen, Helse Stavanger, Helse Fonna og Helse Førde. Regionale fellesfunksjoner — inkludert IKT-infrastruktur og forsyningskjedekoordinering — ivaretas i samarbeid mellom foretakene. En regionalt harmonisert tilnærming til materialforvaltning har i senere år fått økt prioritet, drevet av behovet for effektivisering og stordriftsfordeler på tvers av foretakene.</w:t>
+        <w:t>Helse Bergen HF er det største helseforetaket i Helse Vest RHF og drifter Haukeland Universitetssykehus med ansvar for spesialisthelsetjenester til om lag 460 000 innbyggere. Helse Vest koordinerer fire helseforetak (Bergen, Stavanger, Fonna, Førde), og en regionalt harmonisert tilnærming til materialforvaltning har fått økt prioritet for å oppnå stordriftsfordeler.</w:t>
       </w:r>
     </w:p>
     <w:p>
@@ -12977,7 +11714,56 @@
           <w:rFonts w:ascii="Times New Roman" w:hAnsi="Times New Roman" w:cs="Times New Roman"/>
           <w:sz w:val="24"/>
         </w:rPr>
-        <w:t>Råuttrekket inneholder 1 006 unike artikkelnumre. Populasjonsavgrensningen beskrives i detalj i avsnitt 4.3 nedenfor, og reduserer dette til 709 aktive artikler. For forbruksdata er det benyttet bevegelsestyper (BWART) 201 og 647 fra MSEG, som representerer henholdsvis vareforbruk til kostnadssted og spesialforbruk. Disse to bevegelsesstypene fanger det reelle forbruket ut fra lager og utelukker interne overføringer og returer som ville ha forvrengt etterspørselsestimatet. Innkjøpsdata er hentet fra EKKO/EKPO/EKBE, som gir faktiske ordrelinjer og varemottak; disse benyttes for ABC-verdiberegning og for estimering av faktisk ordrefrekvens. Leveringstidsdata er hentet fra EINE (feltet WETAG), men dekker kun 6 % av artiklene; se beslutning D-05 under.</w:t>
+        <w:t>Råuttrekket inneholder 1 006 unike artikkelnumre. Populasjonsavgrensningen beskrives i detalj i avsnitt 4.3 nedenfor, og reduserer dette til 709 aktive artikler. For forbruksdata er det benyttet bevegelsestyper (BWART) 201 og 647 fra MSEG, som representerer henholdsvis vareforbruk til kostnadssted og spesialforbruk. Disse to bevegelsesstypene fanger det reelle forbruket ut fra lager og utelukker interne overføringer og returer som ville ha forvrengt etterspørselsestimatet. Innkjøpsdata er hentet fra EKKO/EKPO/EKBE, som gir faktiske ordrelinjer og varemottak; disse benyttes for ABC-verdiberegning og for estimering av faktisk ordrefrekvens. Leveringstidsdata er hentet fra EINE (feltet WETAG), men dekker kun 6 % av artiklene; se beslutning D-05 under. Figur 4 gir en samlet oversikt over fordelingen av nøkkelvariablar i det endelige datasettet på 709 artikler.</w:t>
+      </w:r>
+    </w:p>
+    <w:p>
+      <w:r>
+        <w:drawing>
+          <wp:inline xmlns:a="http://schemas.openxmlformats.org/drawingml/2006/main" xmlns:pic="http://schemas.openxmlformats.org/drawingml/2006/picture">
+            <wp:extent cx="5400000" cy="3324897"/>
+            <wp:docPr id="6" name="Picture 6"/>
+            <wp:cNvGraphicFramePr>
+              <a:graphicFrameLocks noChangeAspect="1"/>
+            </wp:cNvGraphicFramePr>
+            <a:graphic>
+              <a:graphicData uri="http://schemas.openxmlformats.org/drawingml/2006/picture">
+                <pic:pic>
+                  <pic:nvPicPr>
+                    <pic:cNvPr id="0" name="Fig04_Dataoversikt.png"/>
+                    <pic:cNvPicPr/>
+                  </pic:nvPicPr>
+                  <pic:blipFill>
+                    <a:blip r:embed="rId24"/>
+                    <a:stretch>
+                      <a:fillRect/>
+                    </a:stretch>
+                  </pic:blipFill>
+                  <pic:spPr>
+                    <a:xfrm>
+                      <a:off x="0" y="0"/>
+                      <a:ext cx="5400000" cy="3324897"/>
+                    </a:xfrm>
+                    <a:prstGeom prst="rect"/>
+                  </pic:spPr>
+                </pic:pic>
+              </a:graphicData>
+            </a:graphic>
+          </wp:inline>
+        </w:drawing>
+      </w:r>
+    </w:p>
+    <w:p>
+      <w:pPr>
+        <w:jc w:val="center"/>
+      </w:pPr>
+      <w:r>
+        <w:rPr>
+          <w:rFonts w:ascii="Times New Roman" w:hAnsi="Times New Roman"/>
+          <w:i/>
+          <w:sz w:val="20"/>
+        </w:rPr>
+        <w:t>Figur 4. Dataoversikt: fordeling av nøkkelvariablar for 709 artiklar ved WERKS 3300, LGORT 3001. Generert med støtte fra Claude (Anthropic, 2026).</w:t>
       </w:r>
     </w:p>
     <w:p>
@@ -13629,141 +12415,9 @@
       <w:r>
         <w:rPr>
           <w:rFonts w:ascii="Times New Roman" w:hAnsi="Times New Roman" w:cs="Times New Roman"/>
-          <w:b/>
-          <w:sz w:val="24"/>
-        </w:rPr>
-        <w:t>D-01 – Populasjonsavgrensning.</w:t>
-      </w:r>
-      <w:r>
-        <w:rPr>
-          <w:rFonts w:ascii="Times New Roman" w:hAnsi="Times New Roman" w:cs="Times New Roman"/>
-          <w:sz w:val="24"/>
-        </w:rPr>
-        <w:t xml:space="preserve"> Råuttrekket fra MARD inneholdt 1 006 artikkelnumre. Av disse er 297 ekskludert fordi de har verken registrert forbruk i MSEG (</w:t>
-      </w:r>
-      <m:oMath>
-        <m:sSub>
-          <m:e>
-            <m:r>
-              <m:t>D</m:t>
-            </m:r>
-          </m:e>
-          <m:sub>
-            <m:r>
-              <m:t>A</m:t>
-            </m:r>
-          </m:sub>
-        </m:sSub>
-        <m:r>
-          <m:t>NNUAL=0</m:t>
-        </m:r>
-      </m:oMath>
-      <w:r>
-        <w:rPr>
-          <w:rFonts w:ascii="Times New Roman" w:hAnsi="Times New Roman" w:cs="Times New Roman"/>
-          <w:sz w:val="24"/>
-        </w:rPr>
-        <w:t>) og null beholdning (TOTAL_STOCK = 0). Disse artiklene er operasjonelt inaktive og utenfor analyseformålet. De resterende 709 artiklene utgjør populasjonen for alle videre analyser.</w:t>
-      </w:r>
-    </w:p>
-    <w:p>
-      <w:pPr>
-        <w:spacing w:line="360" w:lineRule="auto"/>
-      </w:pPr>
-      <w:r>
-        <w:rPr>
-          <w:rFonts w:ascii="Times New Roman" w:hAnsi="Times New Roman" w:cs="Times New Roman"/>
-          <w:b/>
-          <w:sz w:val="24"/>
-        </w:rPr>
-        <w:t>D-02 – PEINH-korrigering.</w:t>
-      </w:r>
-      <w:r>
-        <w:rPr>
-          <w:rFonts w:ascii="Times New Roman" w:hAnsi="Times New Roman" w:cs="Times New Roman"/>
-          <w:sz w:val="24"/>
-        </w:rPr>
-        <w:t xml:space="preserve"> SAP-feltet STPRS i MBEW inneholder standardpris per prisenhet, der prisenheten er angitt i PEINH. PEINH er vanligvis 1, men er i mange tilfeller satt til 10 eller 100 – særlig for lavprisartikler der prisen er satt per 10 eller per 100 enheter. Uten PEINH-korrigering ville enhetsprisen for disse artiklene bli overvurdert med faktor 10 eller 100, noe som ville ha forplantet seg til feil i ABC-rangering, EOQ-parametere og besparelsesestimat. Korreksjon er implementert ved formelen UNIT_PRICE = STPRS ÷ PEINH.</w:t>
-      </w:r>
-    </w:p>
-    <w:p>
-      <w:pPr>
-        <w:spacing w:line="360" w:lineRule="auto"/>
-      </w:pPr>
-      <w:r>
-        <w:rPr>
-          <w:rFonts w:ascii="Times New Roman" w:hAnsi="Times New Roman" w:cs="Times New Roman"/>
-          <w:b/>
-          <w:sz w:val="24"/>
-        </w:rPr>
-        <w:t>D-03 – Beregnet ABC-verdi.</w:t>
-      </w:r>
-      <w:r>
-        <w:rPr>
-          <w:rFonts w:ascii="Times New Roman" w:hAnsi="Times New Roman" w:cs="Times New Roman"/>
-          <w:sz w:val="24"/>
-        </w:rPr>
-        <w:t xml:space="preserve"> ABC-analyse krever en verdi per artikkel. Primærkilden er den faktiske innkjøpsverdien fra EKPO (TOTAL_NETWR), som dekker 505 av 709 artikler. For de resterende 204 artiklene – der TOTAL_NETWR er null eller mangler – er ABC-verdien beregnet som årsforbruk multiplisert med enhetspris (D_ANNUAL × UNIT_PRICE). Denne fremgangsmåten er konsistent med standard ABC-litteratur, der verdi defineres som forbruksvolum ganger enhetspris når direkte innkjøpsverdi ikke er tilgjengelig (Silaen et al., 2023). Et alternativ ville vært å ekskludere disse artiklene. Dette ble vurdert og forkastet av tre grunner: (1) ekskludering ville gi et systematisk skjevt utvalg, siden fraværet av EKPO-data primært skyldes ikke-standardisert anskaffelsespraksis — nettopp de artiklene som kan ha høyest potensial for sentralisering; (2) 204 artikler utgjør 28,8 % av populasjonen, noe som ville svekket representativiteten vesentlig; og (3) D_ANNUAL er observert fra MSEG, ikke anslått, slik at proksien kun introduserer usikkerhet i prisleddet, ikke i forbruksvolum.</w:t>
-      </w:r>
-    </w:p>
-    <w:p>
-      <w:pPr>
-        <w:spacing w:line="360" w:lineRule="auto"/>
-      </w:pPr>
-      <w:r>
-        <w:rPr>
-          <w:rFonts w:ascii="Times New Roman" w:hAnsi="Times New Roman" w:cs="Times New Roman"/>
-          <w:b/>
-          <w:sz w:val="24"/>
-        </w:rPr>
-        <w:t>D-04 – CV-basert XYZ i stedet for SAP ZZXYZ.</w:t>
-      </w:r>
-      <w:r>
-        <w:rPr>
-          <w:rFonts w:ascii="Times New Roman" w:hAnsi="Times New Roman" w:cs="Times New Roman"/>
-          <w:sz w:val="24"/>
-        </w:rPr>
-        <w:t xml:space="preserve"> SAP S/4HANA inneholder et eget klassifiseringsfelt, ZZXYZ, som representerer systemets registrerte XYZ-kategori. En validering mot den beregnede CV-klassifiseringen viste at bare 33 % av artiklene er samsvarende. Avviket skyldes primært at ZZXYZ ikke er blitt systematisk oppdatert i takt med endringer i forbruksmønstre. Analysen benytter derfor CV beregnet direkte fra månedlig MSEG-forbruk over 24 måneder som grunnlag for XYZ-klassifisering, mens ZZXYZ brukes som valideringsreferanse. Modellenes matematiske spesifikasjon er beskrevet i kapittel 5.</w:t>
-      </w:r>
-    </w:p>
-    <w:p>
-      <w:pPr>
-        <w:spacing w:line="360" w:lineRule="auto"/>
-      </w:pPr>
-      <w:r>
-        <w:rPr>
-          <w:rFonts w:ascii="Times New Roman" w:hAnsi="Times New Roman" w:cs="Times New Roman"/>
-          <w:b/>
-          <w:sz w:val="24"/>
-        </w:rPr>
-        <w:t>D-05 – Leveringstid-fallback.</w:t>
-      </w:r>
-      <w:r>
-        <w:rPr>
-          <w:rFonts w:ascii="Times New Roman" w:hAnsi="Times New Roman" w:cs="Times New Roman"/>
-          <w:sz w:val="24"/>
-        </w:rPr>
-        <w:t xml:space="preserve"> EOQ-modellen benytter leveringstid som parameter for beregning av bestillingspunkt. EINE-tabellen inneholder feltet WETAG (leveringstid i dager), men dette feltet er kun utfylt for 6 % av artiklene i populasjonen (43 av 709). For de resterende 94 % benyttes en fallback-verdi på 14 kalenderdager, som tilsvarer en typisk leveringstid for forbruksmateriell fra grossist til sykehus. Implikasjoner av denne antagelsen er diskutert i avsnitt 4.4.</w:t>
-      </w:r>
-    </w:p>
-    <w:p>
-      <w:pPr>
-        <w:spacing w:line="360" w:lineRule="auto"/>
-      </w:pPr>
-      <w:r>
-        <w:rPr>
-          <w:rFonts w:ascii="Times New Roman" w:hAnsi="Times New Roman" w:cs="Times New Roman"/>
-          <w:b/>
-          <w:sz w:val="24"/>
-        </w:rPr>
-        <w:t>D-06 til D-08</w:t>
-      </w:r>
-      <w:r>
-        <w:rPr>
-          <w:rFonts w:ascii="Times New Roman" w:hAnsi="Times New Roman" w:cs="Times New Roman"/>
-          <w:sz w:val="24"/>
-        </w:rPr>
-        <w:t xml:space="preserve"> er dokumentert i Tabell 5 og implementert direkte i Python-scriptet. D-08 – annualiseringen av ordrefrekvens – er særlig viktig for konsistens mellom faktisk og optimal frekvens i EOQ-avviksanalysen. Siden analyseperioden er 24 måneder, annualiseres faktisk ordretelling ved å multiplisere med faktoren 12/24, slik at ACTUAL_FREQ er direkte sammenlignbar med den beregnede EOQ-frekvensen på årsbasis.</w:t>
+          <w:sz w:val="24"/>
+        </w:rPr>
+        <w:t>De viktigste beslutningene utdypes kort: D-03 benytter beregnet verdi (D_ANNUAL × UNIT_PRICE) for 204 artikler uten EKPO-innkjøpsdata, fordi ekskludering ville gi et systematisk skjevt utvalg (28,8 % av populasjonen). D-04 erstatter SAP-feltet ZZXYZ med CV beregnet fra MSEG-forbruk, da kun 33 % av artiklene hadde samsvarende klasse. D-05 benytter en leveringstids-fallback på 14 dager for 94 % av artiklene der EINE-data mangler; implikasjoner er diskutert i avsnitt 4.4.</w:t>
       </w:r>
     </w:p>
     <w:p>
@@ -13783,7 +12437,7 @@
         <w:drawing>
           <wp:inline xmlns:a="http://schemas.openxmlformats.org/drawingml/2006/main" xmlns:pic="http://schemas.openxmlformats.org/drawingml/2006/picture">
             <wp:extent cx="5400000" cy="1315966"/>
-            <wp:docPr id="6" name="Picture 6"/>
+            <wp:docPr id="7" name="Picture 7"/>
             <wp:cNvGraphicFramePr>
               <a:graphicFrameLocks noChangeAspect="1"/>
             </wp:cNvGraphicFramePr>
@@ -13795,7 +12449,7 @@
                     <pic:cNvPicPr/>
                   </pic:nvPicPr>
                   <pic:blipFill>
-                    <a:blip r:embed="rId24"/>
+                    <a:blip r:embed="rId25"/>
                     <a:stretch>
                       <a:fillRect/>
                     </a:stretch>
@@ -17448,7 +16102,7 @@
         <w:drawing>
           <wp:inline xmlns:a="http://schemas.openxmlformats.org/drawingml/2006/main" xmlns:pic="http://schemas.openxmlformats.org/drawingml/2006/picture">
             <wp:extent cx="5400000" cy="4265546"/>
-            <wp:docPr id="7" name="Picture 7"/>
+            <wp:docPr id="8" name="Picture 8"/>
             <wp:cNvGraphicFramePr>
               <a:graphicFrameLocks noChangeAspect="1"/>
             </wp:cNvGraphicFramePr>
@@ -17460,7 +16114,7 @@
                     <pic:cNvPicPr/>
                   </pic:nvPicPr>
                   <pic:blipFill>
-                    <a:blip r:embed="rId25"/>
+                    <a:blip r:embed="rId26"/>
                     <a:stretch>
                       <a:fillRect/>
                     </a:stretch>
@@ -17690,15 +16344,15 @@
           <w:rFonts w:ascii="Times New Roman" w:hAnsi="Times New Roman" w:cs="Times New Roman"/>
           <w:sz w:val="24"/>
         </w:rPr>
-        <w:t>Pareto-grensene 80 % og 95 % ble deretter lagt på den kumulative kurven, som vist i Figur 4 nedenfor. Kurvens form – en bratt stigning tidlig etterfulgt av en lang flat hale – viser at verdikonsentrasjonen følger Pareto-mønsteret. Av de 709 artiklene fikk 704 en ABC-klasse (182 A, 184 B, 338 C); de resterende 5 artiklene har null beregnet verdi etter D-02/D-03 og kunne ikke ABC-rangeres — disse rapporteres i MANGLER\_DATA-kategorien. Endelig fordeling mellom A-, B- og C-artikler presenteres i Tabell 8 i kapittel 7.</w:t>
+        <w:t>Pareto-grensene 80 % og 95 % ble deretter lagt på den kumulative kurven, som vist i Figur 5 nedenfor. Kurvens form – en bratt stigning tidlig etterfulgt av en lang flat hale – viser at verdikonsentrasjonen følger Pareto-mønsteret. Av de 709 artiklene fikk 704 en ABC-klasse (182 A, 184 B, 338 C); de resterende 5 artiklene har null beregnet verdi etter D-02/D-03 og kunne ikke ABC-rangeres — disse rapporteres i MANGLER\_DATA-kategorien. Endelig fordeling mellom A-, B- og C-artikler presenteres i Tabell 8 i kapittel 7.</w:t>
       </w:r>
     </w:p>
     <w:p>
       <w:r>
         <w:drawing>
           <wp:inline xmlns:a="http://schemas.openxmlformats.org/drawingml/2006/main" xmlns:pic="http://schemas.openxmlformats.org/drawingml/2006/picture">
-            <wp:extent cx="5400000" cy="1761100"/>
-            <wp:docPr id="8" name="Picture 8"/>
+            <wp:extent cx="5400000" cy="1753522"/>
+            <wp:docPr id="9" name="Picture 9"/>
             <wp:cNvGraphicFramePr>
               <a:graphicFrameLocks noChangeAspect="1"/>
             </wp:cNvGraphicFramePr>
@@ -17706,11 +16360,11 @@
               <a:graphicData uri="http://schemas.openxmlformats.org/drawingml/2006/picture">
                 <pic:pic>
                   <pic:nvPicPr>
-                    <pic:cNvPr id="0" name="Fig04_ABC_Pareto.png"/>
+                    <pic:cNvPr id="0" name="Fig05_ABC_Pareto.png"/>
                     <pic:cNvPicPr/>
                   </pic:nvPicPr>
                   <pic:blipFill>
-                    <a:blip r:embed="rId26"/>
+                    <a:blip r:embed="rId27"/>
                     <a:stretch>
                       <a:fillRect/>
                     </a:stretch>
@@ -17718,7 +16372,7 @@
                   <pic:spPr>
                     <a:xfrm>
                       <a:off x="0" y="0"/>
-                      <a:ext cx="5400000" cy="1761100"/>
+                      <a:ext cx="5400000" cy="1753522"/>
                     </a:xfrm>
                     <a:prstGeom prst="rect"/>
                   </pic:spPr>
@@ -17739,7 +16393,7 @@
           <w:i/>
           <w:sz w:val="20"/>
         </w:rPr>
-        <w:t>Figur 4. ABC Pareto-kurve: kumulativ verdiandel for 709 artikler rangert etter årsverdi, med grenser ved 80 % (A/B) og 95 % (B/C). Generert med støtte fra Claude (Anthropic, 2026).</w:t>
+        <w:t>Figur 5. ABC Pareto-kurve: kumulativ verdiandel for 709 artikler rangert etter årsverdi, med grenser ved 80 % (A/B) og 95 % (B/C). Generert med støtte fra Claude (Anthropic, 2026).</w:t>
       </w:r>
     </w:p>
     <w:p>
@@ -17917,7 +16571,7 @@
           <w:rFonts w:ascii="Times New Roman" w:hAnsi="Times New Roman" w:cs="Times New Roman"/>
           <w:sz w:val="24"/>
         </w:rPr>
-        <w:t>ABC- og XYZ-klassifiseringene ble kombinert til en ni-felts kryssmatrise, som vist i Figur 5. Matrisen gir et øyeblikksbilde av populasjonens sammensetning langs de to dimensjonene og danner inngangsdataene for regelmotoren i avsnitt 6.5. Fullstendige celleanntall er gjengitt i Figur 5; univariate XYZ-fordelingar presenteres i Tabell 9 i kapittel 7.</w:t>
+        <w:t>ABC- og XYZ-klassifiseringene ble kombinert til en ni-felts kryssmatrise, som vist i Figur 6. Matrisen gir et øyeblikksbilde av populasjonens sammensetning langs de to dimensjonene og danner inngangsdataene for regelmotoren i avsnitt 6.5. Fullstendige celleanntall er gjengitt i Figur 6; univariate XYZ-fordelingar presenteres i Tabell 9 i kapittel 7.</w:t>
       </w:r>
     </w:p>
     <w:p>
@@ -17925,7 +16579,7 @@
         <w:drawing>
           <wp:inline xmlns:a="http://schemas.openxmlformats.org/drawingml/2006/main" xmlns:pic="http://schemas.openxmlformats.org/drawingml/2006/picture">
             <wp:extent cx="5400000" cy="5216475"/>
-            <wp:docPr id="9" name="Picture 9"/>
+            <wp:docPr id="10" name="Picture 10"/>
             <wp:cNvGraphicFramePr>
               <a:graphicFrameLocks noChangeAspect="1"/>
             </wp:cNvGraphicFramePr>
@@ -17933,11 +16587,11 @@
               <a:graphicData uri="http://schemas.openxmlformats.org/drawingml/2006/picture">
                 <pic:pic>
                   <pic:nvPicPr>
-                    <pic:cNvPr id="0" name="Fig05_ABC_XYZ_Matrise.png"/>
+                    <pic:cNvPr id="0" name="Fig06_ABC_XYZ_Matrise.png"/>
                     <pic:cNvPicPr/>
                   </pic:nvPicPr>
                   <pic:blipFill>
-                    <a:blip r:embed="rId27"/>
+                    <a:blip r:embed="rId28"/>
                     <a:stretch>
                       <a:fillRect/>
                     </a:stretch>
@@ -17966,7 +16620,7 @@
           <w:i/>
           <w:sz w:val="20"/>
         </w:rPr>
-        <w:t>Figur 5. ABC/XYZ-kryssmatrise: antall artikler per kombinasjon (709 artikler, WERKS 3300 / LGORT 3001). Generert med støtte fra Claude (Anthropic, 2026).</w:t>
+        <w:t>Figur 6. ABC/XYZ-kryssmatrise: antall artikler per kombinasjon (709 artikler, WERKS 3300 / LGORT 3001). Generert med støtte fra Claude (Anthropic, 2026).</w:t>
       </w:r>
     </w:p>
     <w:p>
@@ -18383,7 +17037,7 @@
         <w:drawing>
           <wp:inline xmlns:a="http://schemas.openxmlformats.org/drawingml/2006/main" xmlns:pic="http://schemas.openxmlformats.org/drawingml/2006/picture">
             <wp:extent cx="5400000" cy="2236624"/>
-            <wp:docPr id="10" name="Picture 10"/>
+            <wp:docPr id="11" name="Picture 11"/>
             <wp:cNvGraphicFramePr>
               <a:graphicFrameLocks noChangeAspect="1"/>
             </wp:cNvGraphicFramePr>
@@ -18391,11 +17045,11 @@
               <a:graphicData uri="http://schemas.openxmlformats.org/drawingml/2006/picture">
                 <pic:pic>
                   <pic:nvPicPr>
-                    <pic:cNvPr id="0" name="Fig06_EOQ_Avvik.png"/>
+                    <pic:cNvPr id="0" name="Fig07_EOQ_Avvik.png"/>
                     <pic:cNvPicPr/>
                   </pic:nvPicPr>
                   <pic:blipFill>
-                    <a:blip r:embed="rId28"/>
+                    <a:blip r:embed="rId29"/>
                     <a:stretch>
                       <a:fillRect/>
                     </a:stretch>
@@ -18424,7 +17078,7 @@
           <w:i/>
           <w:sz w:val="20"/>
         </w:rPr>
-        <w:t>Figur 6. EOQ-avvik: relativ frekvensavvik (FREQ_AVVIK) for artikler med tilstrekkelige data, med terskel ved τ_f = 1,5. Generert med støtte fra Claude (Anthropic, 2026).</w:t>
+        <w:t>Figur 7. EOQ-avvik: relativ frekvensavvik (FREQ_AVVIK) for artikler med tilstrekkelige data, med terskel ved τ_f = 1,5. Generert med støtte fra Claude (Anthropic, 2026).</w:t>
       </w:r>
     </w:p>
     <w:p>
@@ -18436,7 +17090,7 @@
           <w:rFonts w:ascii="Times New Roman" w:hAnsi="Times New Roman" w:cs="Times New Roman"/>
           <w:sz w:val="24"/>
         </w:rPr>
-        <w:t xml:space="preserve">Figur 6 viser at fordelingen er sterkt høyreskjev: majoriteten av artiklene med EOQ-data har et FREQ\_AVVIK over terskelen på 1,5. Artikler under terskelen («OK») opererer nær EOQ-optimalt nivå. For 222 av de 487 artiklene med EOQ-data mangler innkjøpshistorikk i EKBE for analyseperioden, noe som innebærer at faktisk ordrefrekvens er null; disse artiklene inngår i «OK»-kategorien da det ikke kan påvises overbestilling. Totale </w:t>
+        <w:t xml:space="preserve">Figur 7 viser at fordelingen er sterkt høyreskjev: majoriteten av artiklene med EOQ-data har et FREQ\_AVVIK over terskelen på 1,5. Artikler under terskelen («OK») opererer nær EOQ-optimalt nivå. For 222 av de 487 artiklene med EOQ-data mangler innkjøpshistorikk i EKBE for analyseperioden, noe som innebærer at faktisk ordrefrekvens er null; disse artiklene inngår i «OK»-kategorien da det ikke kan påvises overbestilling. Totale </w:t>
       </w:r>
       <m:oMath>
         <m:r>
@@ -18639,15 +17293,15 @@
           <w:rFonts w:ascii="Times New Roman" w:hAnsi="Times New Roman" w:cs="Times New Roman"/>
           <w:sz w:val="24"/>
         </w:rPr>
-        <w:t>, 3, 4, 5, 6 og 7 på treningsdataene. For hvert K ble gjennomsnittlig silhouette-score beregnet. Figur 7 viser silhouette-profilen over K-søket.</w:t>
+        <w:t>, 3, 4, 5, 6 og 7 på treningsdataene. For hvert K ble gjennomsnittlig silhouette-score beregnet. Figur 8 viser silhouette-profilen over K-søket.</w:t>
       </w:r>
     </w:p>
     <w:p>
       <w:r>
         <w:drawing>
           <wp:inline xmlns:a="http://schemas.openxmlformats.org/drawingml/2006/main" xmlns:pic="http://schemas.openxmlformats.org/drawingml/2006/picture">
-            <wp:extent cx="5400000" cy="2130326"/>
-            <wp:docPr id="11" name="Picture 11"/>
+            <wp:extent cx="5400000" cy="2119335"/>
+            <wp:docPr id="12" name="Picture 12"/>
             <wp:cNvGraphicFramePr>
               <a:graphicFrameLocks noChangeAspect="1"/>
             </wp:cNvGraphicFramePr>
@@ -18655,11 +17309,11 @@
               <a:graphicData uri="http://schemas.openxmlformats.org/drawingml/2006/picture">
                 <pic:pic>
                   <pic:nvPicPr>
-                    <pic:cNvPr id="0" name="Fig07_Silhouette.png"/>
+                    <pic:cNvPr id="0" name="Fig08_Silhouette.png"/>
                     <pic:cNvPicPr/>
                   </pic:nvPicPr>
                   <pic:blipFill>
-                    <a:blip r:embed="rId29"/>
+                    <a:blip r:embed="rId30"/>
                     <a:stretch>
                       <a:fillRect/>
                     </a:stretch>
@@ -18667,7 +17321,7 @@
                   <pic:spPr>
                     <a:xfrm>
                       <a:off x="0" y="0"/>
-                      <a:ext cx="5400000" cy="2130326"/>
+                      <a:ext cx="5400000" cy="2119335"/>
                     </a:xfrm>
                     <a:prstGeom prst="rect"/>
                   </pic:spPr>
@@ -18688,7 +17342,7 @@
           <w:i/>
           <w:sz w:val="20"/>
         </w:rPr>
-        <w:t>Figur 7. Silhouette-score for K = 2–7 (treningsdata, n = 389): K = 3 gir høyest score (0,383). Generert med støtte fra Claude (Anthropic, 2026).</w:t>
+        <w:t>Figur 8. Silhouette-score for K = 2–7 (treningsdata, n = 389): K = 3 gir høyest score (0,383). Generert med støtte fra Claude (Anthropic, 2026).</w:t>
       </w:r>
     </w:p>
     <w:p>
@@ -18808,7 +17462,7 @@
         <w:drawing>
           <wp:inline xmlns:a="http://schemas.openxmlformats.org/drawingml/2006/main" xmlns:pic="http://schemas.openxmlformats.org/drawingml/2006/picture">
             <wp:extent cx="5400000" cy="2303899"/>
-            <wp:docPr id="12" name="Picture 12"/>
+            <wp:docPr id="13" name="Picture 13"/>
             <wp:cNvGraphicFramePr>
               <a:graphicFrameLocks noChangeAspect="1"/>
             </wp:cNvGraphicFramePr>
@@ -18816,11 +17470,11 @@
               <a:graphicData uri="http://schemas.openxmlformats.org/drawingml/2006/picture">
                 <pic:pic>
                   <pic:nvPicPr>
-                    <pic:cNvPr id="0" name="Fig08_Kmeans_Klynger.png"/>
+                    <pic:cNvPr id="0" name="Fig09_Kmeans_Klynger.png"/>
                     <pic:cNvPicPr/>
                   </pic:nvPicPr>
                   <pic:blipFill>
-                    <a:blip r:embed="rId30"/>
+                    <a:blip r:embed="rId31"/>
                     <a:stretch>
                       <a:fillRect/>
                     </a:stretch>
@@ -18849,7 +17503,7 @@
           <w:i/>
           <w:sz w:val="20"/>
         </w:rPr>
-        <w:t>Figur 8. K-means klyngeresultat (K = 3): artikler plottet langs z(ln CV) og z(ln verdi), farge etter klynge. K_OVERFØR-klyngen er markert med stjerne (★). Generert med støtte fra Claude (Anthropic, 2026).</w:t>
+        <w:t>Figur 9. K-means klyngeresultat (K = 3): artikler plottet langs z(ln CV) og z(ln verdi), farge etter klynge. K_OVERFØR-klyngen er markert med stjerne (★). Generert med støtte fra Claude (Anthropic, 2026).</w:t>
       </w:r>
     </w:p>
     <w:p>
@@ -18861,15 +17515,15 @@
           <w:rFonts w:ascii="Times New Roman" w:hAnsi="Times New Roman" w:cs="Times New Roman"/>
           <w:sz w:val="24"/>
         </w:rPr>
-        <w:t>Figur 8 viser at de tre klyngene er rimelig separert i feature-rommet, særlig K\_OVERFØR-klyngen (grønn), som skiller seg fra de øvrige ved sin kombinasjon av lav CV og høy verdi. For å tolke innholdet i hver klynge viser Figur 9 gjennomsnittlig standardisert verdi per feature for de tre klyngene.</w:t>
+        <w:t>Figur 9 viser at de tre klyngene er rimelig separert i feature-rommet, særlig K\_OVERFØR-klyngen (grønn), som skiller seg fra de øvrige ved sin kombinasjon av lav CV og høy verdi. For å tolke innholdet i hver klynge viser Figur 10 gjennomsnittlig standardisert verdi per feature for de tre klyngene.</w:t>
       </w:r>
     </w:p>
     <w:p>
       <w:r>
         <w:drawing>
           <wp:inline xmlns:a="http://schemas.openxmlformats.org/drawingml/2006/main" xmlns:pic="http://schemas.openxmlformats.org/drawingml/2006/picture">
-            <wp:extent cx="5400000" cy="2647506"/>
-            <wp:docPr id="13" name="Picture 13"/>
+            <wp:extent cx="5400000" cy="2645224"/>
+            <wp:docPr id="14" name="Picture 14"/>
             <wp:cNvGraphicFramePr>
               <a:graphicFrameLocks noChangeAspect="1"/>
             </wp:cNvGraphicFramePr>
@@ -18877,11 +17531,11 @@
               <a:graphicData uri="http://schemas.openxmlformats.org/drawingml/2006/picture">
                 <pic:pic>
                   <pic:nvPicPr>
-                    <pic:cNvPr id="0" name="Fig09_Kmeans_Profil.png"/>
+                    <pic:cNvPr id="0" name="Fig10_Kmeans_Profil.png"/>
                     <pic:cNvPicPr/>
                   </pic:nvPicPr>
                   <pic:blipFill>
-                    <a:blip r:embed="rId31"/>
+                    <a:blip r:embed="rId32"/>
                     <a:stretch>
                       <a:fillRect/>
                     </a:stretch>
@@ -18889,7 +17543,7 @@
                   <pic:spPr>
                     <a:xfrm>
                       <a:off x="0" y="0"/>
-                      <a:ext cx="5400000" cy="2647506"/>
+                      <a:ext cx="5400000" cy="2645224"/>
                     </a:xfrm>
                     <a:prstGeom prst="rect"/>
                   </pic:spPr>
@@ -18910,7 +17564,7 @@
           <w:i/>
           <w:sz w:val="20"/>
         </w:rPr>
-        <w:t>Figur 9. Klyngeprofiler for K-means (K=3): gjennomsnittlig z-score per feature per klynge. K\_OVERFØR-klyngen (grønn) kjennetegnes av lav CV og høy verdi. Generert med støtte fra Claude (Anthropic, 2026).</w:t>
+        <w:t>Figur 10. Klyngeprofiler for K-means (K=3): gjennomsnittlig z-score per feature per klynge. K\_OVERFØR-klyngen (grønn) kjennetegnes av lav CV og høy verdi. Generert med støtte fra Claude (Anthropic, 2026).</w:t>
       </w:r>
     </w:p>
     <w:p>
@@ -18922,7 +17576,7 @@
           <w:rFonts w:ascii="Times New Roman" w:hAnsi="Times New Roman" w:cs="Times New Roman"/>
           <w:sz w:val="24"/>
         </w:rPr>
-        <w:t xml:space="preserve">Figur 9 bekrefter at K\_OVERFØR-klyngen (Klynge 3, </w:t>
+        <w:t xml:space="preserve">Figur 10 bekrefter at K\_OVERFØR-klyngen (Klynge 3, </w:t>
       </w:r>
       <m:oMath>
         <m:r>
@@ -19181,7 +17835,7 @@
           <w:rFonts w:ascii="Times New Roman" w:hAnsi="Times New Roman" w:cs="Times New Roman"/>
           <w:sz w:val="24"/>
         </w:rPr>
-        <w:t>, for å kartlegge robustheten av besparelsesestimatet overfor usikkerhet i modellantagelsene. Figur 10 viser den endelige fordelingen av regelmotor-anbefalinger og estimert EOQ-besparelse under tre scenarier, mens detaljerte besparelsestall og sensitivitetsintervaller presenteres i avsnitt 7.5–7.6.</w:t>
+        <w:t>, for å kartlegge robustheten av besparelsesestimatet overfor usikkerhet i modellantagelsene. Figur 11 viser den endelige fordelingen av regelmotor-anbefalinger og estimert EOQ-besparelse under tre scenarier, mens detaljerte besparelsestall og sensitivitetsintervaller presenteres i avsnitt 7.5–7.6.</w:t>
       </w:r>
     </w:p>
     <w:p>
@@ -19189,7 +17843,7 @@
         <w:drawing>
           <wp:inline xmlns:a="http://schemas.openxmlformats.org/drawingml/2006/main" xmlns:pic="http://schemas.openxmlformats.org/drawingml/2006/picture">
             <wp:extent cx="5400000" cy="2236257"/>
-            <wp:docPr id="14" name="Picture 14"/>
+            <wp:docPr id="15" name="Picture 15"/>
             <wp:cNvGraphicFramePr>
               <a:graphicFrameLocks noChangeAspect="1"/>
             </wp:cNvGraphicFramePr>
@@ -19197,11 +17851,11 @@
               <a:graphicData uri="http://schemas.openxmlformats.org/drawingml/2006/picture">
                 <pic:pic>
                   <pic:nvPicPr>
-                    <pic:cNvPr id="0" name="Fig10_Regelmotor_Besparelse.png"/>
+                    <pic:cNvPr id="0" name="Fig11_Regelmotor_Besparelse.png"/>
                     <pic:cNvPicPr/>
                   </pic:nvPicPr>
                   <pic:blipFill>
-                    <a:blip r:embed="rId32"/>
+                    <a:blip r:embed="rId33"/>
                     <a:stretch>
                       <a:fillRect/>
                     </a:stretch>
@@ -19230,7 +17884,7 @@
           <w:i/>
           <w:sz w:val="20"/>
         </w:rPr>
-        <w:t>Figur 10. Regelmotor og besparelsesanalyse: fordeling av HVFS-anbefalinger (venstre) og estimert årlig EOQ-besparelse under tre realiseringsscenarier (høyre). 709 artikler, WERKS 3300 / LGORT 3001. Generert med støtte fra Claude (Anthropic, 2026).</w:t>
+        <w:t>Figur 11. Regelmotor og besparelsesanalyse: fordeling av HVFS-anbefalinger (venstre) og estimert årlig EOQ-besparelse under tre realiseringsscenarier (høyre). 709 artikler, WERKS 3300 / LGORT 3001. Generert med støtte fra Claude (Anthropic, 2026).</w:t>
       </w:r>
     </w:p>
     <w:p>
@@ -19711,7 +18365,7 @@
           <w:rFonts w:ascii="Times New Roman" w:hAnsi="Times New Roman" w:cs="Times New Roman"/>
           <w:sz w:val="24"/>
         </w:rPr>
-        <w:t>182 A-artikler utgjør 25,7 % av populasjonen og representerer om lag 80 % av den totale lagerverdien. A-klassens andel er noe høyere enn den kanoniske 20 %-regelen i Pareto-prinsippet, noe som reflekterer at Helse Bergens sortiment inneholder et begrenset antall høyverdige forbruksartikler med stort volum. 184 B-artikler (26,0 %) dekker ytterligere 15 % av verdien, slik at A- og B-artiklene til sammen (366 artikler, 51,6 %) står for om lag 95 % av verdibindingen. De resterende 338 C-artiklene (47,7 % av populasjonen) dekker de siste 5 % av verdien — en typisk Pareto-fordeling der nesten halvparten av artiklene samlet har marginal verdibetydning. 5 artikler (0,7 %) kunne ikke ABC-klassifiseres grunnet manglende verdidata etter beslutningene D-02 og D-03. Pareto-kurven er presentert som Figur 4 i kapittel 6. Det sterke Pareto-mønsteret bekrefter at differensiert lagerstyring — med tettere oppfølging av A-artikler og enklere håndtering av C-artikler — er faglig begrunnet for dette sortimentet.</w:t>
+        <w:t>Fordelingen viser et tydelig Pareto-mønster: A- og B-artiklene (366 artikler, 51,6 %) står for ~95 % av verdibindingen, mens 338 C-artikler (47,7 %) dekker de resterende 5 %. A-klassens andel på 25,7 % er noe høyere enn den kanoniske 20 %-regelen, men konsistent med sykehussortiment der få høyverdige artikler dominerer. Pareto-kurven er presentert som Figur 5 i kapittel 6.</w:t>
       </w:r>
     </w:p>
     <w:p>
@@ -20117,7 +18771,7 @@
           <w:rFonts w:ascii="Times New Roman" w:hAnsi="Times New Roman" w:cs="Times New Roman"/>
           <w:sz w:val="24"/>
         </w:rPr>
-        <w:t>Sammenligningen med SAP-feltet ZZXYZ viste 33 % samsvar mellom systemregistrert og beregnet klasse (125 av 375 artikler med data i begge kilder). Valideringen er begrenset til de 375 artiklene der ZZXYZ-feltet er utfylt i MDMA; for de øvrige 334 artiklene mangler systemklassifisering. Tabell 10 oppsummerer kryssvalideringen. Det lave samsvaret på 33 % understreker at SAP-feltets ZZXYZ ikke er systematisk oppdatert og bør erstattes med beregnet CV-klasse som primær XYZ-indikator. ABC/XYZ-kryssmatrisen er presentert som Figur 5 i kapittel 6; fullstendige celleanntall er gjengitt der.</w:t>
+        <w:t>Sammenligningen med SAP-feltet ZZXYZ viste 33 % samsvar mellom systemregistrert og beregnet klasse (125 av 375 artikler med data i begge kilder). Valideringen er begrenset til de 375 artiklene der ZZXYZ-feltet er utfylt i MDMA; for de øvrige 334 artiklene mangler systemklassifisering. Tabell 10 oppsummerer kryssvalideringen. Det lave samsvaret på 33 % understreker at SAP-feltets ZZXYZ ikke er systematisk oppdatert og bør erstattes med beregnet CV-klasse som primær XYZ-indikator. ABC/XYZ-kryssmatrisen er presentert som Figur 6 i kapittel 6; fullstendige celleanntall er gjengitt der.</w:t>
       </w:r>
     </w:p>
     <w:tbl>
@@ -21078,7 +19732,7 @@
           <w:rFonts w:ascii="Times New Roman" w:hAnsi="Times New Roman" w:cs="Times New Roman"/>
           <w:sz w:val="24"/>
         </w:rPr>
-        <w:t xml:space="preserve"> for alle 487 artikler er kr 2 333 441 per år. Dette representerer det totale kostnadsoverskuddet som genereres av at faktisk ordrepraksis avviker fra EOQ-optimal; det er ikke direkte det samme som det realisable besparelsespotensialet, da kun artikler i OVERFØR\_HVFS-kategorien inngår i besparelsesberegningen (se avsnitt 7.6). Fordelingen av FREQ\_AVVIK er illustrert i Figur 6 i kapittel 6.</w:t>
+        <w:t xml:space="preserve"> for alle 487 artikler er kr 2 333 441 per år. Dette representerer det totale kostnadsoverskuddet som genereres av at faktisk ordrepraksis avviker fra EOQ-optimal; det er ikke direkte det samme som det realisable besparelsespotensialet, da kun artikler i OVERFØR\_HVFS-kategorien inngår i besparelsesberegningen (se avsnitt 7.6). Fordelingen av FREQ\_AVVIK er illustrert i Figur 7 i kapittel 6.</w:t>
       </w:r>
     </w:p>
     <w:p>
@@ -21633,7 +20287,7 @@
           <w:rFonts w:ascii="Times New Roman" w:hAnsi="Times New Roman" w:cs="Times New Roman"/>
           <w:sz w:val="24"/>
         </w:rPr>
-        <w:t xml:space="preserve"> kr 7 005 — den høyeste av alle tre klynger. Profilen viser at denne klyngen samler artikler som er verdifulle, stabile og overbestilte, noe som gjør dem til naturlige kandidater for sentralisering. K\_OVERFØR-flagget settes automatisk basert på rangering av klyngenes gjennomsnittlige CV (stigende) og verdi (synkende). Klyngeprofilen i feature-rommet er visualisert i Figur 8 i kapittel 6.</w:t>
+        <w:t xml:space="preserve"> kr 7 005 — den høyeste av alle tre klynger. Profilen viser at denne klyngen samler artikler som er verdifulle, stabile og overbestilte, noe som gjør dem til naturlige kandidater for sentralisering. K\_OVERFØR-flagget settes automatisk basert på rangering av klyngenes gjennomsnittlige CV (stigende) og verdi (synkende). Klyngeprofilen i feature-rommet er visualisert i Figur 9 i kapittel 6.</w:t>
       </w:r>
     </w:p>
     <w:p>
@@ -22112,7 +20766,7 @@
           <w:rFonts w:ascii="Times New Roman" w:hAnsi="Times New Roman" w:cs="Times New Roman"/>
           <w:sz w:val="24"/>
         </w:rPr>
-        <w:t>257 artikler (36,2 %) beholdes lokalt, primært grunnet Z-klassifisering (R1: 144 artikler) eller CY-profil (R2: 113 artikler). Z-override (R1) er den enkeltregelen som fanger flest artikler, noe som bekrefter at uforutsigbart forbruksmønster er den vanligste kontraindikasjonen mot sentralisering i dette sortimentet. 284 artikler (40,1 %) sendes til manuell vurdering — artikler der de kvantitative signalene fra ABC, XYZ, EOQ og K-means ikke er tilstrekkelig entydige til å generere en automatisert anbefaling. 23 artikler (3,2 %) mangler tilstrekkelig data for klassifisering. Fordelingen er visualisert i Figur 10 i kapittel 6.</w:t>
+        <w:t>257 artikler (36,2 %) beholdes lokalt, primært grunnet Z-klassifisering (R1: 144 artikler) eller CY-profil (R2: 113 artikler). Z-override (R1) er den enkeltregelen som fanger flest artikler, noe som bekrefter at uforutsigbart forbruksmønster er den vanligste kontraindikasjonen mot sentralisering i dette sortimentet. 284 artikler (40,1 %) sendes til manuell vurdering — artikler der de kvantitative signalene fra ABC, XYZ, EOQ og K-means ikke er tilstrekkelig entydige til å generere en automatisert anbefaling. 23 artikler (3,2 %) mangler tilstrekkelig data for klassifisering. Fordelingen er visualisert i Figur 11 i kapittel 6.</w:t>
       </w:r>
     </w:p>
     <w:p>
@@ -22447,18 +21101,6 @@
           <w:rFonts w:ascii="Times New Roman" w:hAnsi="Times New Roman" w:cs="Times New Roman"/>
           <w:sz w:val="24"/>
         </w:rPr>
-        <w:t>Samlet teoretisk ΔTC for de 117 artiklene: kr 602 020 per år.</w:t>
-      </w:r>
-    </w:p>
-    <w:p>
-      <w:pPr>
-        <w:spacing w:line="360" w:lineRule="auto"/>
-      </w:pPr>
-      <w:r>
-        <w:rPr>
-          <w:rFonts w:ascii="Times New Roman" w:hAnsi="Times New Roman" w:cs="Times New Roman"/>
-          <w:sz w:val="24"/>
-        </w:rPr>
         <w:t>Base case-besparelsen er kr 451 515 per år (</w:t>
       </w:r>
       <m:oMath>
@@ -22471,31 +21113,7 @@
           <w:rFonts w:ascii="Times New Roman" w:hAnsi="Times New Roman" w:cs="Times New Roman"/>
           <w:sz w:val="24"/>
         </w:rPr>
-        <w:t>). Worst case-estimatet er kr 301 010 per år (</w:t>
-      </w:r>
-      <m:oMath>
-        <m:r>
-          <m:t>g=50</m:t>
-        </m:r>
-      </m:oMath>
-      <w:r>
-        <w:rPr>
-          <w:rFonts w:ascii="Times New Roman" w:hAnsi="Times New Roman" w:cs="Times New Roman"/>
-          <w:sz w:val="24"/>
-        </w:rPr>
-        <w:t>), og best case er kr 602 020 per år (</w:t>
-      </w:r>
-      <m:oMath>
-        <m:r>
-          <m:t>g=100</m:t>
-        </m:r>
-      </m:oMath>
-      <w:r>
-        <w:rPr>
-          <w:rFonts w:ascii="Times New Roman" w:hAnsi="Times New Roman" w:cs="Times New Roman"/>
-          <w:sz w:val="24"/>
-        </w:rPr>
-        <w:t xml:space="preserve">). Den samlede </w:t>
+        <w:t xml:space="preserve">) av et samlet teoretisk </w:t>
       </w:r>
       <m:oMath>
         <m:r>
@@ -22519,7 +21137,19 @@
           <w:rFonts w:ascii="Times New Roman" w:hAnsi="Times New Roman" w:cs="Times New Roman"/>
           <w:sz w:val="24"/>
         </w:rPr>
-        <w:t xml:space="preserve"> for de 117 artiklene er kr 602 020 per år; dette er det fulle teoretiske besparelsespotensialet dersom alle 117 artikler oppnår EOQ-optimal ordrefrekvens etter overføring. Gevinstrealiseringsgraden g reflekterer at implementeringsfriksjon, endrede leverandøravtaler og SAP-parameterjusteringer gjør det urealistisk å oppnå 100 % av det teoretiske potensialet.</w:t>
+        <w:t xml:space="preserve"> på kr 602 020. Gevinstrealiseringsgraden </w:t>
+      </w:r>
+      <m:oMath>
+        <m:r>
+          <m:t>g</m:t>
+        </m:r>
+      </m:oMath>
+      <w:r>
+        <w:rPr>
+          <w:rFonts w:ascii="Times New Roman" w:hAnsi="Times New Roman" w:cs="Times New Roman"/>
+          <w:sz w:val="24"/>
+        </w:rPr>
+        <w:t xml:space="preserve"> reflekterer at implementeringsfriksjon og SAP-parameterjusteringer gjør det urealistisk å oppnå 100 % av det teoretiske potensialet.</w:t>
       </w:r>
     </w:p>
     <w:p>
@@ -22636,7 +21266,7 @@
           <w:rFonts w:ascii="Times New Roman" w:hAnsi="Times New Roman" w:cs="Times New Roman"/>
           <w:sz w:val="24"/>
         </w:rPr>
-        <w:t>A-kategorien omfatter 182 artikler, tilsvarende 25,7 % av populasjonen og om lag 80 % av den totale verdibindingen. Dette samsvarer nært med Pareto-prinsippets klassiske formulering, som tilsier at rundt 20 % av artiklene typisk bærer 80 % av verdien (Gupta et al., 2007). At A-andelen i dette datasettet er noe høyere enn den kanoniske 20 %-grensen, er konsistent med funn fra tilsvarende sykehuslagerstudier: Bijvank og Vis (2012) påpeker at sykehuslagre gjerne har en mer konsentrert verdidistribusjon enn industrilager, fordi sortimentet inkluderer få, høyverdige forbruksartikler med høy omløpshastighet. Den observerte fordelingen gir dermed analytisk støtte til å prioritere A-artiklene i overføringsvurderingen, noe regelmotoren reflekterer gjennom at A/B-artikler utløser de sterkeste overføringssignalene.</w:t>
+        <w:t>A-kategoriens 182 artikler (25,7 % av populasjonen, ~80 % av verdien) samsvarer med Pareto-prinsippet. At A-andelen er noe høyere enn den kanoniske 20 %, er konsistent med Bijvank og Vis (2012), som påpeker at sykehuslagre gjerne har en mer konsentrert verdidistribusjon enn industrilager.</w:t>
       </w:r>
     </w:p>
     <w:p>
@@ -22648,7 +21278,7 @@
           <w:rFonts w:ascii="Times New Roman" w:hAnsi="Times New Roman" w:cs="Times New Roman"/>
           <w:sz w:val="24"/>
         </w:rPr>
-        <w:t>At 33 % av artiklene har samsvarende klasse mellom ZZXYZ og beregnet CV er et lavt samsvarsresultat, men ikke overraskende i lys av litteraturen. Van Kampen et al. (2012) understreker at systemregistrerte klassifiseringer i ERP-systemer raskt mister aktualitet dersom de ikke oppdateres i takt med endringer i forbruksmønstre. Nowotyńska (2013) finner tilsvarende i sin XYZ-studie: statiske systemkategorier og dynamisk beregnet CV divergerer systematisk over tid. Funnet i denne studien – at to av tre artikler har avvikende klasse – gir empirisk støtte til argumentet om at CV-beregning direkte fra transaksjonsdata er nødvendig for en pålitelig klassifisering.</w:t>
+        <w:t>Det lave samsvaret (33 %) mellom ZZXYZ og beregnet CV er forventet: van Kampen et al. (2012) understreker at systemregistrerte klassifiseringer raskt mister aktualitet, og Nowotyńska (2013) finner tilsvarende divergens. Funnet gir empirisk støtte til at CV-beregning fra transaksjonsdata er nødvendig for pålitelig klassifisering.</w:t>
       </w:r>
     </w:p>
     <w:p>
@@ -22660,7 +21290,7 @@
           <w:rFonts w:ascii="Times New Roman" w:hAnsi="Times New Roman" w:cs="Times New Roman"/>
           <w:sz w:val="24"/>
         </w:rPr>
-        <w:t>Silhouette-scoren på 0,383 (treningsdata) og 0,368 (testdata) er over minstekravet på 0,3 som Ketkar og Vaidya (2014) angir for akseptabel klyngestruktur i eksplorativ analyse. Scoren er likevel ikke sterk etter absolutte mål, og indikerer at klyngene overlapper i noen grad. Dette er forventet i et lagerklassifiseringsproblem der artikler langs et kontinuum av verdi og variasjon ikke naturlig danner skarpt separerte grupper. Srinivasan og Moon (1999) påpeker at K-means i forsyningskjedeanalyse typisk gir moderate silhouette-verdier, og at nytteverdien av klyngingen i dette domenet ligger i profildifferensiering fremfor absolutt separasjon. Differansen på 0,015 mellom trenings- og testsilhouette indikerer at modellen generaliserer akseptabelt til usett data.</w:t>
+        <w:t>Silhouette-scoren (0,383 trening, 0,368 test) er over minstekravet 0,3 for eksplorativ analyse (Ketkar &amp; Vaidya, 2014), men moderat — noe som er typisk for lagerklassifiseringsproblemer der artikler ikke naturlig danner skarpt separerte grupper (Srinivasan &amp; Moon, 1999). Differansen på 0,015 indikerer akseptabel generalisering.</w:t>
       </w:r>
     </w:p>
     <w:p>
@@ -22672,7 +21302,7 @@
           <w:rFonts w:ascii="Times New Roman" w:hAnsi="Times New Roman" w:cs="Times New Roman"/>
           <w:sz w:val="24"/>
         </w:rPr>
-        <w:t>Base case-estimatet på kr 451 515 per år er basert på 117 artikler og representerer en konservativ beregning; best case gir kr 602 020. Disse tallene er ikke direkte sammenlignbare med studier som rapporterer besparelser i prosent av omsetning, men størrelsesordenen er i tråd med hva Moons et al. (2019) rapporterer for interne logistikkforbedringer i europeiske sykehus: moderate, men operasjonelt vesentlige gevinster ved optimalisert bestillingspraksis. Volland et al. (2017) understreker at materialhåndteringseffektivitet i sykehus i liten grad handler om store enkeltgevinster, men om akkumulerte forbedringer i ordreadministrasjon over tid – noe besparelsesmodellen i denne studien er utformet for å fange.</w:t>
+        <w:t>Base case-besparelsen (kr 451 515/år) er i tråd med Moons et al. (2019), som rapporterer moderate, men operasjonelt vesentlige gevinster ved optimalisert bestillingspraksis i europeiske sykehus.</w:t>
       </w:r>
     </w:p>
     <w:p>
@@ -23449,26 +22079,11 @@
           <w:rFonts w:ascii="Times New Roman" w:hAnsi="Times New Roman" w:cs="Times New Roman"/>
           <w:sz w:val="24"/>
         </w:rPr>
-        <w:t xml:space="preserve">Besparelsesformelen </w:t>
+        <w:t xml:space="preserve">Realiseringsgraden </w:t>
       </w:r>
       <m:oMath>
         <m:r>
-          <m:t>B=∑ΔT</m:t>
-        </m:r>
-        <m:sSub>
-          <m:e>
-            <m:r>
-              <m:t>C</m:t>
-            </m:r>
-          </m:e>
-          <m:sub>
-            <m:r>
-              <m:t>i</m:t>
-            </m:r>
-          </m:sub>
-        </m:sSub>
-        <m:r>
-          <m:t>×g</m:t>
+          <m:t>g</m:t>
         </m:r>
       </m:oMath>
       <w:r>
@@ -23476,7 +22091,7 @@
           <w:rFonts w:ascii="Times New Roman" w:hAnsi="Times New Roman" w:cs="Times New Roman"/>
           <w:sz w:val="24"/>
         </w:rPr>
-        <w:t xml:space="preserve"> benytter g som en antatt realiseringsgrad for den teoretiske EOQ-gevinsten. Det er avgjørende å presisere at g ikke er empirisk estimert fra historiske data, men er et scenarioparameter valgt for å reflektere ulike grader av implementeringssuksess. En realiseringsgrad på 75 % (base case) er et plausibelt anslag, men ikke en prognose. Den faktiske gevinsten vil avhenge av gjennomføringskvaliteten i HVFS-implementeringen, leverandørenes evne til å levere i henhold til konsoliderte ordrer og Helse Bergens interne kapasitet til å revidere SAP-parametere. Analysen identifiserer et klart besparelsespotensial, men implementering krever organisatorisk endring — herunder revidering av innkjøpsprosesser, oppdatering av SAP MM-parametere og forankring hos klinisk personell og logistikkfunksjon. Sensitivitetsanalysen over 27 scenarier synliggjør bredden i dette usikkerhetsintervallet og er ment å kompensere for at g ikke er empirisk fundert.</w:t>
+        <w:t xml:space="preserve"> i besparelsesformelen er et scenarioparameter, ikke en empirisk prognose. Den faktiske gevinsten avhenger av gjennomføringskvalitet, leverandørenes kapasitet og Helse Bergens evne til å revidere SAP-parametere. Sensitivitetsanalysen over 27 scenarier synliggjør bredden i usikkerhetsintervallet.</w:t>
       </w:r>
     </w:p>
     <w:p>
@@ -23488,7 +22103,7 @@
           <w:rFonts w:ascii="Times New Roman" w:hAnsi="Times New Roman" w:cs="Times New Roman"/>
           <w:sz w:val="24"/>
         </w:rPr>
-        <w:t>Leveringstidsfallbacken på 14 dager gjelder 94 % av artiklene og er den enkeltantagelsen som potensielt har størst konsekvens for bestillingspunktberegninger. For EOQ-avviksanalysen, som er frekvensbasert, er den direkte effekten begrenset; men for en fremtidig ROP-analyse vil kalibrering av faktiske leveringstider per leverandør og artikkel være avgjørende. Helse Bergen bør prioritere å berike EINE-tabellen med faktiske WETAG-verdier som en del av det løpende SAP MM-vedlikeholdet.</w:t>
+        <w:t>Leveringstidsfallbacken på 14 dager (94 % av artiklene) har begrenset direkte effekt på den frekvensbaserte EOQ-analysen, men vil være avgjørende for en fremtidig ROP-analyse. Analyseperioden 2024–2025 kan fortsatt være påvirket av ettervirkninger fra COVID-19-pandemien, noe som kan gi misvisende CV for enkeltartikler.</w:t>
       </w:r>
     </w:p>
     <w:p>
@@ -23500,19 +22115,7 @@
           <w:rFonts w:ascii="Times New Roman" w:hAnsi="Times New Roman" w:cs="Times New Roman"/>
           <w:sz w:val="24"/>
         </w:rPr>
-        <w:t>Analyseperioden 2024–2025 er valgt for å reflektere normal drift, men det kan ikke utelukkes at forbruksmønstre i denne perioden fortsatt er påvirket av ettervirkninger fra COVID-19-pandemien, som medførte betydelige forstyrrelser i forsyningskjeder og forbruksmønstre i helsesektoren (Volland et al., 2017). Artikler som ble hamstret eller substituert under pandemien kan ha unormalt høy eller lav CV i analyseperioden, noe som kan gi misvisende XYZ-klassifisering for disse spesifikke artiklene.</w:t>
-      </w:r>
-    </w:p>
-    <w:p>
-      <w:pPr>
-        <w:spacing w:line="360" w:lineRule="auto"/>
-      </w:pPr>
-      <w:r>
-        <w:rPr>
-          <w:rFonts w:ascii="Times New Roman" w:hAnsi="Times New Roman" w:cs="Times New Roman"/>
-          <w:sz w:val="24"/>
-        </w:rPr>
-        <w:t xml:space="preserve">K-means er kjent for å være sensitiv overfor valget av K, og ulike K-verdier vil gi ulike klyngeprofiler og dermed ulike K_OVERFØR-populasjoner (Srinivasan &amp; Moon, 1999). Det automatiske K-valget via silhouette minimerer analytisk bias, men eliminerer ikke usikkerheten: med </w:t>
+        <w:t xml:space="preserve">K-means er sensitiv overfor valget av K (Srinivasan &amp; Moon, 1999): med </w:t>
       </w:r>
       <m:oMath>
         <m:r>
@@ -23536,7 +22139,7 @@
           <w:rFonts w:ascii="Times New Roman" w:hAnsi="Times New Roman" w:cs="Times New Roman"/>
           <w:sz w:val="24"/>
         </w:rPr>
-        <w:t xml:space="preserve"> ville klyngestrukturen og den tilhørende overføringslisten sett annerledes ut. Sensitiviteten overfor K-valg bør anerkjennes som en begrensning ved tolkning av K_OVERFØR-signalet i regelmotoren. I tillegg er K-means sensitiv overfor feature-scaling: standardiseringen via z-score gir de tre featurene lik vekt i klyngingen, men dette er en normativ beslutning — ikke en empirisk begrunnet vekting. Dersom verdi burde tillegges større vekt enn CV i en klinisk kontekst, ville klyngestrukturen endres tilsvarende.</w:t>
+        <w:t xml:space="preserve"> ville klyngestrukturen sett annerledes ut. Z-score-standardiseringen gir de tre featurene lik vekt — en normativ beslutning som påvirker klyngeresultatene. CV-koeffisienten har en kjent svakhet ved lavt forbruksvolum, der enkeltutleveringer kan gi kunstig høy eller lav CV.</w:t>
       </w:r>
     </w:p>
     <w:p>
@@ -23548,31 +22151,7 @@
           <w:rFonts w:ascii="Times New Roman" w:hAnsi="Times New Roman" w:cs="Times New Roman"/>
           <w:sz w:val="24"/>
         </w:rPr>
-        <w:t>CV-koeffisienten som grunnlag for XYZ-klassifisering har en kjent svakhet ved lav etterspørsel: artikler med svært lavt forbruksvolum kan få kunstig lav CV dersom de har jevnt, men minimalt forbruk, eller kunstig høy CV fra én enkelt utlevering i en ellers stille periode. For de 144 artiklene som er klassifisert som Z (</w:t>
-      </w:r>
-      <m:oMath>
-        <m:r>
-          <m:t>CV&gt;1,0</m:t>
-        </m:r>
-      </m:oMath>
-      <w:r>
-        <w:rPr>
-          <w:rFonts w:ascii="Times New Roman" w:hAnsi="Times New Roman" w:cs="Times New Roman"/>
-          <w:sz w:val="24"/>
-        </w:rPr>
-        <w:t>) bør det derfor ikke utelukkes at enkelte av disse har uregelmessig CV primært grunnet lavt volum fremfor genuint uforutsigbart forbruksmønster.</w:t>
-      </w:r>
-    </w:p>
-    <w:p>
-      <w:pPr>
-        <w:spacing w:line="360" w:lineRule="auto"/>
-      </w:pPr>
-      <w:r>
-        <w:rPr>
-          <w:rFonts w:ascii="Times New Roman" w:hAnsi="Times New Roman" w:cs="Times New Roman"/>
-          <w:sz w:val="24"/>
-        </w:rPr>
-        <w:t>For 204 artikler uten EKPO-data er ABC-verdien beregnet, ikke observert. Dersom UNIT_PRICE for disse artiklene avviker fra faktisk innkjøpspris, vil ABC-rangeringen for dem være upresis. I verste fall kan en artikkel med faktisk høy innkjøpsverdi mangle EKPO-data nettopp fordi den anskaffes utenfor standard innkjøpsprosess – for eksempel som hastebestilling – noe som vil underestimere verdien og potensielt klassifisere den feil i ABC-hierarkiet. Denne begrensningen anbefales adressert ved å sikre at samtlige artikler i LGORT 3001 har fullstendige EKPO-oppføringer i SAP.</w:t>
+        <w:t>For 204 artikler uten EKPO-data er ABC-verdien beregnet fra D_ANNUAL × UNIT_PRICE. Dersom standardprisen avviker fra faktisk innkjøpspris, vil ABC-rangeringen for disse artiklene være upresis.</w:t>
       </w:r>
     </w:p>
     <w:p>
@@ -23928,102 +22507,52 @@
           <w:rFonts w:ascii="Times New Roman" w:hAnsi="Times New Roman" w:cs="Times New Roman"/>
           <w:sz w:val="24"/>
         </w:rPr>
-        <w:t>Studien åpner for flere retninger innen videre forskning og metodeutvikling:</w:t>
-      </w:r>
-    </w:p>
-    <w:p>
-      <w:pPr>
-        <w:spacing w:line="360" w:lineRule="auto"/>
-      </w:pPr>
+        <w:t xml:space="preserve">Studien åpner for tre retninger innen videre forskning: (1) En </w:t>
+      </w:r>
       <w:r>
         <w:rPr>
           <w:rFonts w:ascii="Times New Roman" w:hAnsi="Times New Roman" w:cs="Times New Roman"/>
           <w:b/>
           <w:sz w:val="24"/>
         </w:rPr>
-        <w:t>ROP-modul.</w:t>
-      </w:r>
-      <w:r>
-        <w:rPr>
-          <w:rFonts w:ascii="Times New Roman" w:hAnsi="Times New Roman" w:cs="Times New Roman"/>
-          <w:sz w:val="24"/>
-        </w:rPr>
-        <w:t xml:space="preserve"> Den nåværende analysen (versjon 2.7 av Python-scriptet) inkluderer ikke beregning av bestillingspunkt (ROP – Reorder Point). En ROP-modul vil kreve pålitelige leveringstidsdata per artikkel og et valgt servicenivå, og vil gi et mer komplett bilde av den optimale lagerstyringspolicyen. Ettersom LEAD_TIME-data i dag mangler for 94 % av artiklene, er et nødvendig forarbeid å berike EINE-tabellen med faktiske leveringstider fra leverandøravtaler. En oppfølgingsstudie som integrerer ROP-analyse vil kunne gi anbefalinger ikke bare om </w:t>
-      </w:r>
-      <w:r>
-        <w:rPr>
-          <w:rFonts w:ascii="Times New Roman" w:hAnsi="Times New Roman" w:cs="Times New Roman"/>
-          <w:i/>
-          <w:sz w:val="24"/>
-        </w:rPr>
-        <w:t>hvem</w:t>
-      </w:r>
-      <w:r>
-        <w:rPr>
-          <w:rFonts w:ascii="Times New Roman" w:hAnsi="Times New Roman" w:cs="Times New Roman"/>
-          <w:sz w:val="24"/>
-        </w:rPr>
-        <w:t xml:space="preserve"> som skal overføres, men også om </w:t>
-      </w:r>
-      <w:r>
-        <w:rPr>
-          <w:rFonts w:ascii="Times New Roman" w:hAnsi="Times New Roman" w:cs="Times New Roman"/>
-          <w:i/>
-          <w:sz w:val="24"/>
-        </w:rPr>
-        <w:t>hvordan</w:t>
-      </w:r>
-      <w:r>
-        <w:rPr>
-          <w:rFonts w:ascii="Times New Roman" w:hAnsi="Times New Roman" w:cs="Times New Roman"/>
-          <w:sz w:val="24"/>
-        </w:rPr>
-        <w:t xml:space="preserve"> lagernivåene skal settes etter overføring.</w:t>
-      </w:r>
-    </w:p>
-    <w:p>
-      <w:pPr>
-        <w:spacing w:line="360" w:lineRule="auto"/>
-      </w:pPr>
+        <w:t>ROP-modul</w:t>
+      </w:r>
+      <w:r>
+        <w:rPr>
+          <w:rFonts w:ascii="Times New Roman" w:hAnsi="Times New Roman" w:cs="Times New Roman"/>
+          <w:sz w:val="24"/>
+        </w:rPr>
+        <w:t xml:space="preserve"> som integrerer bestillingspunktberegning vil kreve at EINE-tabellen berikes med faktiske leveringstider, men vil gi anbefalinger om lagernivåer etter overføring. (2) </w:t>
+      </w:r>
       <w:r>
         <w:rPr>
           <w:rFonts w:ascii="Times New Roman" w:hAnsi="Times New Roman" w:cs="Times New Roman"/>
           <w:b/>
           <w:sz w:val="24"/>
         </w:rPr>
-        <w:t>Leverandørkonsolidering.</w:t>
-      </w:r>
-      <w:r>
-        <w:rPr>
-          <w:rFonts w:ascii="Times New Roman" w:hAnsi="Times New Roman" w:cs="Times New Roman"/>
-          <w:sz w:val="24"/>
-        </w:rPr>
-        <w:t xml:space="preserve"> Studien analyserer artikler på individnivå, men tar ikke stilling til leverandørstruktur. En komplementær analyse av innkjøpsdata fra EKKO/EKPO kan avdekke muligheter for leverandørkonsolidering – det vil si om flere av HVFS-kandidatene leveres av de samme leverandørene, og om konsoliderte ordrer kan gi ytterligere besparelser utover ordrefrekvensoptimalisering. En slik analyse er særlig relevant i lys av NorEngros sin rolle som grossistoperatør for HVFS.</w:t>
-      </w:r>
-    </w:p>
-    <w:p>
-      <w:pPr>
-        <w:spacing w:line="360" w:lineRule="auto"/>
-      </w:pPr>
+        <w:t>Leverandørkonsolidering</w:t>
+      </w:r>
+      <w:r>
+        <w:rPr>
+          <w:rFonts w:ascii="Times New Roman" w:hAnsi="Times New Roman" w:cs="Times New Roman"/>
+          <w:sz w:val="24"/>
+        </w:rPr>
+        <w:t xml:space="preserve"> via analyse av EKKO/EKPO kan avdekke om HVFS-kandidatene leveres av felles leverandører, noe som kan gi ytterligere besparelser utover ordrefrekvensoptimalisering. (3) </w:t>
+      </w:r>
       <w:r>
         <w:rPr>
           <w:rFonts w:ascii="Times New Roman" w:hAnsi="Times New Roman" w:cs="Times New Roman"/>
           <w:b/>
           <w:sz w:val="24"/>
         </w:rPr>
-        <w:t>Replikering til andre WERKS i Helse Vest.</w:t>
-      </w:r>
-    </w:p>
-    <w:p>
-      <w:pPr>
-        <w:spacing w:line="360" w:lineRule="auto"/>
-      </w:pPr>
-      <w:r>
-        <w:rPr>
-          <w:rFonts w:ascii="Times New Roman" w:hAnsi="Times New Roman" w:cs="Times New Roman"/>
-          <w:sz w:val="24"/>
-        </w:rPr>
-        <w:t>Metoderammeverket i denne studien er fullt reproduserbart og kan i prinsippet anvendes på tilsvarende SAP-datastrukturer ved de øvrige helseforetakene i Helse Vest – Helse Stavanger, Helse Fonna og Helse Førde. En komparativ studie på tvers av WERKS-enheter vil gi grunnlag for å vurdere om HVFS-sentraliseringen bør differensieres per foretak, og om de metodiske funnene fra Helse Bergen er representative for regionen som helhet. En slik replikering vil styrke både den interne og eksterne validiteten til rammeverket som LIBRA-prosjektet nå utvikler.</w:t>
+        <w:t>Replikering</w:t>
+      </w:r>
+      <w:r>
+        <w:rPr>
+          <w:rFonts w:ascii="Times New Roman" w:hAnsi="Times New Roman" w:cs="Times New Roman"/>
+          <w:sz w:val="24"/>
+        </w:rPr>
+        <w:t xml:space="preserve"> av rammeverket til andre WERKS i Helse Vest (Stavanger, Fonna, Førde) vil styrke den eksterne validiteten og gi grunnlag for differensiert HVFS-sentralisering per foretak.</w:t>
       </w:r>
     </w:p>
     <w:p>
@@ -26047,7 +24576,7 @@
       </w:r>
     </w:p>
     <w:sectPr>
-      <w:footerReference w:type="default" r:id="rId40"/>
+      <w:footerReference w:type="default" r:id="rId41"/>
       <w:pgSz w:w="11907" w:h="16840"/>
       <w:pgMar w:top="1417" w:right="1417" w:bottom="1417" w:left="1701" w:header="720" w:footer="403" w:gutter="0"/>
       <w:pgNumType w:start="1"/>

</xml_diff>

<commit_message>
Fiks sensitivitetsanalyse og småfeil i analysescript og rapport
- Sensitivitet: rekn frekvensavvik på nytt per (S, h)-kombinasjon i staden for å bruke base-case FREQ_AVVIK_PCT
- Sensitivitet: bruk ΔTC×g-modell (konsistent med modul 7) i staden for gammal f×S×r-formel
- Versjonsnummer i print: v2.5 → v2.7
- Kommentarreferanse: D-03 → D-06 (MSEG_STATUS)
- Rapport: rett parameterliste i sensitivitetsomtale frå «S, h og g» til «S, h og τ_f»
- Bygg Word-dokument på nytt

Co-Authored-By: Claude Opus 4.6 (1M context) <noreply@anthropic.com>
</commit_message>
<xml_diff>
--- a/005 report/LOG650_Rapport_v5.docx
+++ b/005 report/LOG650_Rapport_v5.docx
@@ -17826,9 +17826,18 @@
         <w:t xml:space="preserve"> og </w:t>
       </w:r>
       <m:oMath>
-        <m:r>
-          <m:t>g</m:t>
-        </m:r>
+        <m:sSub>
+          <m:e>
+            <m:r>
+              <m:t>τ</m:t>
+            </m:r>
+          </m:e>
+          <m:sub>
+            <m:r>
+              <m:t>f</m:t>
+            </m:r>
+          </m:sub>
+        </m:sSub>
       </m:oMath>
       <w:r>
         <w:rPr>

</xml_diff>

<commit_message>
Fiks 4 feil i analysescript, oppdater sensitivitetsdata og rapport
- ABC fallback: trigger også for TOTAL_NETWR <= 0, ikkje berre NaN (D-07)
- Sensitivitetsanalyse: reberekn kandidatsett per scenario i staden for
  å låse til base-case (OVERFØR_HVFS ∩ FOR_MANGE_ORDRER)
- K-means: legg til 7. farge for K=7 (hindrar IndexError)
- ABC/XYZ-oppsummering: fillna(0) etter reindex (hindrar int(NaN)-krasj)
- Rapport § 7.6 og § 9.1: legg til B_HVFS sensitivitetsrange (176–764 T)
- Word-dokument regenerert

Co-Authored-By: Claude Opus 4.6 (1M context) <noreply@anthropic.com>
</commit_message>
<xml_diff>
--- a/005 report/LOG650_Rapport_v5.docx
+++ b/005 report/LOG650_Rapport_v5.docx
@@ -21203,7 +21203,43 @@
           <w:rFonts w:ascii="Times New Roman" w:hAnsi="Times New Roman" w:cs="Times New Roman"/>
           <w:sz w:val="24"/>
         </w:rPr>
-        <w:t xml:space="preserve"> for hele populasjonen (487 artikler) varierer mellom kr 1 602 464 og kr 3 068 757 per år avhengig av parametervalg. Den dominerende usikkerhetsfaktoren er ordrekostnad S: en økning fra 500 til 1 000 NOK nær dobler det beregnede kostnadsavviket, da ordrekostnaden inngår lineært i totalkostnadsfunksjonen. Holdesats h har en moderat effekt, mens terskelparameteren </w:t>
+        <w:t xml:space="preserve"> for hele populasjonen (487 artikler) varierer mellom kr 1 602 464 og kr 3 068 757 per år avhengig av parametervalg. Besparelsesestimatet </w:t>
+      </w:r>
+      <m:oMath>
+        <m:sSub>
+          <m:e>
+            <m:r>
+              <m:t>B</m:t>
+            </m:r>
+          </m:e>
+          <m:sub>
+            <m:r>
+              <m:rPr>
+                <m:nor/>
+              </m:rPr>
+              <m:t>HVFS</m:t>
+            </m:r>
+          </m:sub>
+        </m:sSub>
+      </m:oMath>
+      <w:r>
+        <w:rPr>
+          <w:rFonts w:ascii="Times New Roman" w:hAnsi="Times New Roman" w:cs="Times New Roman"/>
+          <w:sz w:val="24"/>
+        </w:rPr>
+        <w:t xml:space="preserve"> (</w:t>
+      </w:r>
+      <m:oMath>
+        <m:r>
+          <m:t>g=75</m:t>
+        </m:r>
+      </m:oMath>
+      <w:r>
+        <w:rPr>
+          <w:rFonts w:ascii="Times New Roman" w:hAnsi="Times New Roman" w:cs="Times New Roman"/>
+          <w:sz w:val="24"/>
+        </w:rPr>
+        <w:t xml:space="preserve">) varierer mellom kr 176 374 og kr 763 903 per år over de 27 scenariene, der kandidatsettet (OVERFØR\_HVFS ∩ FOR\_MANGE\_ORDRER) reberegnes for hvert scenario. Den dominerende usikkerhetsfaktoren er ordrekostnad S: en økning fra 500 til 1 000 NOK nær dobler det beregnede kostnadsavviket, da ordrekostnaden inngår lineært i totalkostnadsfunksjonen. Holdesats h har en moderat effekt, mens terskelparameteren </w:t>
       </w:r>
       <m:oMath>
         <m:sSub>
@@ -22354,7 +22390,43 @@
           <w:rFonts w:ascii="Times New Roman" w:hAnsi="Times New Roman" w:cs="Times New Roman"/>
           <w:sz w:val="24"/>
         </w:rPr>
-        <w:t xml:space="preserve"> for hele populasjonen (487 artikler) varierer mellom kr 1 602 464 og kr 3 068 757 per år avhengig av parametervalg. Dette synliggjør at besparelsesestimatet er moderat sensitivt overfor forutsetningene om ordrekostnad og holdesats, men forblir positivt og vesentlig over alle 27 scenarier.</w:t>
+        <w:t xml:space="preserve"> for hele populasjonen (487 artikler) varierer mellom kr 1 602 464 og kr 3 068 757 per år, og at </w:t>
+      </w:r>
+      <m:oMath>
+        <m:sSub>
+          <m:e>
+            <m:r>
+              <m:t>B</m:t>
+            </m:r>
+          </m:e>
+          <m:sub>
+            <m:r>
+              <m:rPr>
+                <m:nor/>
+              </m:rPr>
+              <m:t>HVFS</m:t>
+            </m:r>
+          </m:sub>
+        </m:sSub>
+      </m:oMath>
+      <w:r>
+        <w:rPr>
+          <w:rFonts w:ascii="Times New Roman" w:hAnsi="Times New Roman" w:cs="Times New Roman"/>
+          <w:sz w:val="24"/>
+        </w:rPr>
+        <w:t xml:space="preserve"> (</w:t>
+      </w:r>
+      <m:oMath>
+        <m:r>
+          <m:t>g=75</m:t>
+        </m:r>
+      </m:oMath>
+      <w:r>
+        <w:rPr>
+          <w:rFonts w:ascii="Times New Roman" w:hAnsi="Times New Roman" w:cs="Times New Roman"/>
+          <w:sz w:val="24"/>
+        </w:rPr>
+        <w:t>) varierer mellom kr 176 374 og kr 763 903 per år avhengig av parametervalg. Dette synliggjør at besparelsesestimatet er moderat sensitivt overfor forutsetningene om ordrekostnad og holdesats, men forblir positivt og vesentlig over alle 27 scenarier.</w:t>
       </w:r>
     </w:p>
     <w:p>

</xml_diff>

<commit_message>
Fiks 3 inkonsistensar mellom analysescript og rapport
1. TIL_VURDERING → VURDER_NÆRMERE i rapport og flytskjema (match scriptet)
2. Figur 10 → Figur 11 (feil figurhenvisning i kap. 6)
3. 11 scripts/Fig00–Fig10 → 12 scripts/Fig00–Fig11 i Vedlegg B

Regenerert Fig03 og Fig11, bygd Word-dokument på nytt.

Co-Authored-By: Claude Opus 4.6 (1M context) <noreply@anthropic.com>
</commit_message>
<xml_diff>
--- a/005 report/LOG650_Rapport_v5.docx
+++ b/005 report/LOG650_Rapport_v5.docx
@@ -4633,7 +4633,7 @@
           <w:rFonts w:ascii="Times New Roman" w:hAnsi="Times New Roman"/>
           <w:sz w:val="24"/>
         </w:rPr>
-        <w:t xml:space="preserve">Analysen kombinerer fire metoder i en integrert rørledning: ABC-klassifisering basert på Pareto-prinsippet, XYZ-klassifisering basert på variasjonskoeffisient (CV), EOQ-avviksanalyse med parametere S = 750 kr og h = 20 % av enhetspris, og K-means klyngeanalyse med automatisk K-valg via silhouette-score. Resultatene sammenstilles i en regelmotor med åtte beslutningsregler som klassifiserer hver artikkel i én av tre kategorier: OVERFØR_HVFS, BEHOLD_LOKALT eller TIL_VURDERING.</w:t>
+        <w:t xml:space="preserve">Analysen kombinerer fire metoder i en integrert rørledning: ABC-klassifisering basert på Pareto-prinsippet, XYZ-klassifisering basert på variasjonskoeffisient (CV), EOQ-avviksanalyse med parametere S = 750 kr og h = 20 % av enhetspris, og K-means klyngeanalyse med automatisk K-valg via silhouette-score. Resultatene sammenstilles i en regelmotor med åtte beslutningsregler som klassifiserer hver artikkel i én av tre kategorier: OVERFØR_HVFS, BEHOLD_LOKALT eller VURDER_NÆRMERE.</w:t>
       </w:r>
     </w:p>
     <w:p>
@@ -4659,7 +4659,7 @@
           <w:rFonts w:ascii="Times New Roman" w:hAnsi="Times New Roman"/>
           <w:sz w:val="24"/>
         </w:rPr>
-        <w:t xml:space="preserve">Studien konkluderer med at multikriterieklassifisering og klyngeanalyse av SAP-transaksjonsdata gir et operasjonelt anvendbart grunnlag for å identifisere HVFS-overføringskandidater ved Helse Bergen. Sentralisering anbefales, men forutsetter aktiv justering av SAP MM-parametere og en strukturert manuell gjennomgang av TIL VURDERING-gruppen for å realisere det estimerte besparelsespotensialet.</w:t>
+        <w:t xml:space="preserve">Studien konkluderer med at multikriterieklassifisering og klyngeanalyse av SAP-transaksjonsdata gir et operasjonelt anvendbart grunnlag for å identifisere HVFS-overføringskandidater ved Helse Bergen. Sentralisering anbefales, men forutsetter aktiv justering av SAP MM-parametere og en strukturert manuell gjennomgang av VURDER NÆRMERE-gruppen for å realisere det estimerte besparelsespotensialet.</w:t>
       </w:r>
     </w:p>
     <w:p>
@@ -17905,7 +17905,7 @@
           <w:rFonts w:ascii="Times New Roman" w:hAnsi="Times New Roman" w:cs="Times New Roman"/>
           <w:sz w:val="24"/>
         </w:rPr>
-        <w:t>Figur 10 viser at 145 artikler (20,5 % av populasjonen) anbefales overført til HVFS, mens 257 artikler (36,2 %) beholdes lokalt basert på Z-klasse eller CY-kombinasjon. Kategorien TIL VURDERING er den største enkeltgruppen med 284 artikler (40,1 %), noe som reflekterer at mange artikler har en profil der de ulike analysene ikke gir entydige signaler. Dette er et forventet utfall gitt at regelmotoren er utformet for å unngå feilaktige overføringsanbefalinger: usikre tilfeller sendes til manuell vurdering fremfor å tvinges inn i en binær beslutning. Fordelingen av anbefalinger per regel er som følger: R1 (Z-override) fanget 144 artikler, R2 (CY) fanget 113, R3 (A/B + X + FOR\_MANGE) fanget 91, R4 (A/B + X + K\_OVERFØR) fanget 26, R5 (A/B + Y + K\_OVERFØR) fanget 28, og R6–R8 sendte de resterende 284 artiklene til manuell vurdering. At TIL\_VURDERING er den største enkeltgruppen er et bevisst designvalg: regelmotoren er utformet for høy presisjon i OVERFØR-anbefalingene, og aksepterer at dette medfører en større andel artikler som krever manuell gjennomgang. Fullstendige resultat- og besparelsestabeller presenteres i kapittel 7.</w:t>
+        <w:t>Figur 11 viser at 145 artikler (20,5 % av populasjonen) anbefales overført til HVFS, mens 257 artikler (36,2 %) beholdes lokalt basert på Z-klasse eller CY-kombinasjon. Kategorien VURDER NÆRMERE er den største enkeltgruppen med 284 artikler (40,1 %), noe som reflekterer at mange artikler har en profil der de ulike analysene ikke gir entydige signaler. Dette er et forventet utfall gitt at regelmotoren er utformet for å unngå feilaktige overføringsanbefalinger: usikre tilfeller sendes til manuell vurdering fremfor å tvinges inn i en binær beslutning. Fordelingen av anbefalinger per regel er som følger: R1 (Z-override) fanget 144 artikler, R2 (CY) fanget 113, R3 (A/B + X + FOR\_MANGE) fanget 91, R4 (A/B + X + K\_OVERFØR) fanget 26, R5 (A/B + Y + K\_OVERFØR) fanget 28, og R6–R8 sendte de resterende 284 artiklene til manuell vurdering. At VURDER\_NÆRMERE er den største enkeltgruppen er et bevisst designvalg: regelmotoren er utformet for høy presisjon i OVERFØR-anbefalingene, og aksepterer at dette medfører en større andel artikler som krever manuell gjennomgang. Fullstendige resultat- og besparelsestabeller presenteres i kapittel 7.</w:t>
       </w:r>
     </w:p>
     <w:p>
@@ -20570,7 +20570,7 @@
                 <w:rFonts w:ascii="Times New Roman" w:hAnsi="Times New Roman"/>
                 <w:sz w:val="22"/>
               </w:rPr>
-              <w:t>TIL_VURDERING</w:t>
+              <w:t>VURDER_NÆRMERE</w:t>
             </w:r>
           </w:p>
         </w:tc>
@@ -22501,7 +22501,7 @@
           <w:b/>
           <w:sz w:val="24"/>
         </w:rPr>
-        <w:t>2. Gjennomgå de 284 artiklene i TIL VURDERING manuelt.</w:t>
+        <w:t>2. Gjennomgå de 284 artiklene i VURDER NÆRMERE manuelt.</w:t>
       </w:r>
     </w:p>
     <w:p>
@@ -24496,7 +24496,7 @@
           <w:rFonts w:ascii="Times New Roman" w:hAnsi="Times New Roman" w:cs="Times New Roman"/>
           <w:sz w:val="24"/>
         </w:rPr>
-        <w:t xml:space="preserve"> 11 separate Python-scripts (`plot_*.py`) som genererer figurane Fig00–Fig10 i konsistent stil (serif-font, 300 dpi, felles fargepalett).</w:t>
+        <w:t xml:space="preserve"> 12 separate Python-scripts (`plot_*.py`) som genererer figurane Fig00–Fig11 i konsistent stil (serif-font, 300 dpi, felles fargepalett).</w:t>
       </w:r>
     </w:p>
     <w:p>

</xml_diff>

<commit_message>
Rett tre formelle feil mot kompendiet: forord, språk og figurnummerering
1. Forord: «bacheloroppgaven» → «rapporten» (LOG650 er ikkje bachelor)
2. Vedlegg A–C: nynorsk → konsekvent bokmål gjennom heile rapporten
3. Figurar renummerert frå 0–11 til 1–12 (standard akademisk nummerering)

Co-Authored-By: Claude Opus 4.6 (1M context) <noreply@anthropic.com>
</commit_message>
<xml_diff>
--- a/005 report/LOG650_Rapport_v5.docx
+++ b/005 report/LOG650_Rapport_v5.docx
@@ -4492,7 +4492,7 @@
           <w:rFonts w:ascii="Times New Roman" w:hAnsi="Times New Roman"/>
           <w:sz w:val="24"/>
         </w:rPr>
-        <w:t xml:space="preserve">Denne bacheloroppgaven er skrevet som avsluttende arbeid i studiet LOG650 Forskningsprosjekt: Logistikk og kunstig intelligens ved Høgskolen i Molde, vårsemesteret 2026.</w:t>
+        <w:t xml:space="preserve">Denne rapporten er skrevet som avsluttende arbeid i emnet LOG650 Forskningsprosjekt: Logistikk og kunstig intelligens ved Høgskolen i Molde, vårsemesteret 2026.</w:t>
       </w:r>
     </w:p>
     <w:p>
@@ -9664,7 +9664,7 @@
           <w:rFonts w:ascii="Times New Roman" w:hAnsi="Times New Roman" w:cs="Times New Roman"/>
           <w:sz w:val="24"/>
         </w:rPr>
-        <w:t xml:space="preserve">Denne oppgaven opererer innenfor et konseptuelt rammeverk som beskriver en sekvensiell analysemodell fra rådata til beslutningsanbefaling. Modellen kombinerer deterministisk klassifisering (ABC og XYZ) med eksplorativ segmentering (K-means): de regelbaserte metodene produserer reproduserbare klasser ut fra forhåndsdefinerte grenseverdier, mens K-means avdekker datadrevne gruppestrukturer uten forhåndsbestemte grenser. Rammeverket er illustrert i Figur 0 og setter de fire metodene i et logisk avhengighetsforhold: ABC og XYZ er uavhengige analysedimensjoner som beregnes parallelt fra henholdsvis innkjøpsdata (EKPO/EKBE) og forbruksdata (MSEG). EOQ-avviksanalysen supplerer med en tredje dimensjon — kostnadseffektiviteten av nåværende bestillingspraksis. K-means klyngeanalyse er eksplorativ og avdekker datadrevne gruppestrukturer som ikke er forhåndsbestemt av regelgrenser. Regelmotor-trinnet integrerer alle fire dimensjoner til én anbefaling per artikkel: </w:t>
+        <w:t xml:space="preserve">Denne oppgaven opererer innenfor et konseptuelt rammeverk som beskriver en sekvensiell analysemodell fra rådata til beslutningsanbefaling. Modellen kombinerer deterministisk klassifisering (ABC og XYZ) med eksplorativ segmentering (K-means): de regelbaserte metodene produserer reproduserbare klasser ut fra forhåndsdefinerte grenseverdier, mens K-means avdekker datadrevne gruppestrukturer uten forhåndsbestemte grenser. Rammeverket er illustrert i Figur 1 og setter de fire metodene i et logisk avhengighetsforhold: ABC og XYZ er uavhengige analysedimensjoner som beregnes parallelt fra henholdsvis innkjøpsdata (EKPO/EKBE) og forbruksdata (MSEG). EOQ-avviksanalysen supplerer med en tredje dimensjon — kostnadseffektiviteten av nåværende bestillingspraksis. K-means klyngeanalyse er eksplorativ og avdekker datadrevne gruppestrukturer som ikke er forhåndsbestemt av regelgrenser. Regelmotor-trinnet integrerer alle fire dimensjoner til én anbefaling per artikkel: </w:t>
       </w:r>
       <w:r>
         <w:rPr>
@@ -9758,7 +9758,7 @@
           <w:i/>
           <w:sz w:val="20"/>
         </w:rPr>
-        <w:t>Figur 0. Konseptuelt rammeverk – fra SAP-data til HVFS-anbefaling. Generert med støtte fra Claude (Anthropic, 2026).</w:t>
+        <w:t>Figur 1. Konseptuelt rammeverk – fra SAP-data til HVFS-anbefaling. Generert med støtte fra Claude (Anthropic, 2026).</w:t>
       </w:r>
     </w:p>
     <w:p>
@@ -9770,7 +9770,7 @@
           <w:rFonts w:ascii="Times New Roman" w:hAnsi="Times New Roman" w:cs="Times New Roman"/>
           <w:sz w:val="24"/>
         </w:rPr>
-        <w:t>Figur 0 refererer til dette rammeverket. Den detaljerte matematiske formuleringen av alle modellkomponenter — parameterdefinisjonene, formlene og grenseverdiene — presenteres i kapittel 5.</w:t>
+        <w:t>Figur 1 refererer til dette rammeverket. Den detaljerte matematiske formuleringen av alle modellkomponenter — parameterdefinisjonene, formlene og grenseverdiene — presenteres i kapittel 5.</w:t>
       </w:r>
     </w:p>
     <w:p>
@@ -9821,7 +9821,7 @@
           <w:rFonts w:ascii="Times New Roman" w:hAnsi="Times New Roman" w:cs="Times New Roman"/>
           <w:sz w:val="24"/>
         </w:rPr>
-        <w:t>Helse Bergen er i SAP S/4HANA registrert under anleggskode (WERKS) 3300. Det operative forsyningslageret for medisinsk forbruksmateriell er tilordnet lagersted (LGORT) 3001 under dette anlegget. Lageret håndterer anskaffelse, mottak, lagring og distribusjon av forbruksartikler til kliniske avdelinger. Innkjøp gjennomføres via innkjøpsgruppe 300 og 3000 i SAP, med bestillingstype ZNB som er Helse Bergens lokale bestillingstype for forsyningslageret. Alle varebevegelser — forbruk ut til avdeling (BWART 201 og 647) og varemottak inn fra leverandør (BWART 101) — er registrert som transaksjonsdata i SAP og utgjør det primære datagrunnlaget for denne oppgaven. Foretakets organisasjonsmessige plassering i Helse Vest og SAP-strukturen er illustrert i Figur 1. Tabell 3 oppsummerer nøkkeltallene for casevirksomheten.</w:t>
+        <w:t>Helse Bergen er i SAP S/4HANA registrert under anleggskode (WERKS) 3300. Det operative forsyningslageret for medisinsk forbruksmateriell er tilordnet lagersted (LGORT) 3001 under dette anlegget. Lageret håndterer anskaffelse, mottak, lagring og distribusjon av forbruksartikler til kliniske avdelinger. Innkjøp gjennomføres via innkjøpsgruppe 300 og 3000 i SAP, med bestillingstype ZNB som er Helse Bergens lokale bestillingstype for forsyningslageret. Alle varebevegelser — forbruk ut til avdeling (BWART 201 og 647) og varemottak inn fra leverandør (BWART 101) — er registrert som transaksjonsdata i SAP og utgjør det primære datagrunnlaget for denne oppgaven. Foretakets organisasjonsmessige plassering i Helse Vest og SAP-strukturen er illustrert i Figur 2. Tabell 3 oppsummerer nøkkeltallene for casevirksomheten.</w:t>
       </w:r>
     </w:p>
     <w:tbl>
@@ -10485,7 +10485,7 @@
           <w:i/>
           <w:sz w:val="20"/>
         </w:rPr>
-        <w:t>Figur 1. Lagerstruktur – Helse Vest forsyningskjede (forenklet). Generert med støtte fra Claude (Anthropic, 2026).</w:t>
+        <w:t>Figur 2. Lagerstruktur – Helse Vest forsyningskjede (forenklet). Generert med støtte fra Claude (Anthropic, 2026).</w:t>
       </w:r>
     </w:p>
     <w:p>
@@ -10595,7 +10595,7 @@
           <w:rFonts w:ascii="Times New Roman" w:hAnsi="Times New Roman" w:cs="Times New Roman"/>
           <w:sz w:val="24"/>
         </w:rPr>
-        <w:t>Datapipelinen fra råuttrekk til analyseresultat er illustrert i Figur 2. En sentral datakvalitetsutfordring er at enhetspris i MBEW (feltet STPRS) ikke er per stykk, men per prisenhet (PEINH), som ofte er 10 eller 100 for medisinsk forbruksmateriell. Korrekt enhetspris beregnes derfor som STPRS ÷ PEINH. I tillegg mangler 204 artikler innkjøpsdata fra EKPO i analyseperioden, noe som nødvendiggjør en alternativ verdiberegning basert på annualisert forbruk og enhetspris. Disse og øvrige datakvalitetsbeslutninger er dokumentert i kapittel 4.</w:t>
+        <w:t>Datapipelinen fra råuttrekk til analyseresultat er illustrert i Figur 3. En sentral datakvalitetsutfordring er at enhetspris i MBEW (feltet STPRS) ikke er per stykk, men per prisenhet (PEINH), som ofte er 10 eller 100 for medisinsk forbruksmateriell. Korrekt enhetspris beregnes derfor som STPRS ÷ PEINH. I tillegg mangler 204 artikler innkjøpsdata fra EKPO i analyseperioden, noe som nødvendiggjør en alternativ verdiberegning basert på annualisert forbruk og enhetspris. Disse og øvrige datakvalitetsbeslutninger er dokumentert i kapittel 4.</w:t>
       </w:r>
     </w:p>
     <w:p>
@@ -11714,7 +11714,7 @@
           <w:rFonts w:ascii="Times New Roman" w:hAnsi="Times New Roman" w:cs="Times New Roman"/>
           <w:sz w:val="24"/>
         </w:rPr>
-        <w:t>Råuttrekket inneholder 1 006 unike artikkelnumre. Populasjonsavgrensningen beskrives i detalj i avsnitt 4.3 nedenfor, og reduserer dette til 709 aktive artikler. For forbruksdata er det benyttet bevegelsestyper (BWART) 201 og 647 fra MSEG, som representerer henholdsvis vareforbruk til kostnadssted og spesialforbruk. Disse to bevegelsesstypene fanger det reelle forbruket ut fra lager og utelukker interne overføringer og returer som ville ha forvrengt etterspørselsestimatet. Innkjøpsdata er hentet fra EKKO/EKPO/EKBE, som gir faktiske ordrelinjer og varemottak; disse benyttes for ABC-verdiberegning og for estimering av faktisk ordrefrekvens. Leveringstidsdata er hentet fra EINE (feltet WETAG), men dekker kun 6 % av artiklene; se beslutning D-05 under. Figur 4 gir en samlet oversikt over fordelingen av nøkkelvariablar i det endelige datasettet på 709 artikler.</w:t>
+        <w:t>Råuttrekket inneholder 1 006 unike artikkelnumre. Populasjonsavgrensningen beskrives i detalj i avsnitt 4.3 nedenfor, og reduserer dette til 709 aktive artikler. For forbruksdata er det benyttet bevegelsestyper (BWART) 201 og 647 fra MSEG, som representerer henholdsvis vareforbruk til kostnadssted og spesialforbruk. Disse to bevegelsesstypene fanger det reelle forbruket ut fra lager og utelukker interne overføringer og returer som ville ha forvrengt etterspørselsestimatet. Innkjøpsdata er hentet fra EKKO/EKPO/EKBE, som gir faktiske ordrelinjer og varemottak; disse benyttes for ABC-verdiberegning og for estimering av faktisk ordrefrekvens. Leveringstidsdata er hentet fra EINE (feltet WETAG), men dekker kun 6 % av artiklene; se beslutning D-05 under. Figur 5 gir en samlet oversikt over fordelingen av nøkkelvariablar i det endelige datasettet på 709 artikler.</w:t>
       </w:r>
     </w:p>
     <w:p>
@@ -11763,7 +11763,7 @@
           <w:i/>
           <w:sz w:val="20"/>
         </w:rPr>
-        <w:t>Figur 4. Dataoversikt: fordeling av nøkkelvariablar for 709 artiklar ved WERKS 3300, LGORT 3001. Generert med støtte fra Claude (Anthropic, 2026).</w:t>
+        <w:t>Figur 5. Dataoversikt: fordeling av nøkkelvariabler for 709 artikler ved WERKS 3300, LGORT 3001. Generert med støtte fra Claude (Anthropic, 2026).</w:t>
       </w:r>
     </w:p>
     <w:p>
@@ -12478,7 +12478,7 @@
           <w:i/>
           <w:sz w:val="20"/>
         </w:rPr>
-        <w:t>Figur 2. Analysepipeline: fra SAP-rådata til HVFS-anbefaling. Generert med støtte fra Claude (Anthropic, 2026).</w:t>
+        <w:t>Figur 3. Analysepipeline: fra SAP-rådata til HVFS-anbefaling. Generert med støtte fra Claude (Anthropic, 2026).</w:t>
       </w:r>
     </w:p>
     <w:p>
@@ -16143,7 +16143,7 @@
           <w:i/>
           <w:sz w:val="20"/>
         </w:rPr>
-        <w:t>Figur 3. Regelmotor: sekvensiell beslutningsflyt for HVFS-anbefaling (R1–R8). Generert med støtte fra Claude (Anthropic, 2026).</w:t>
+        <w:t>Figur 4. Regelmotor: sekvensiell beslutningsflyt for HVFS-anbefaling (R1–R8). Generert med støtte fra Claude (Anthropic, 2026).</w:t>
       </w:r>
     </w:p>
     <w:p>
@@ -16344,7 +16344,7 @@
           <w:rFonts w:ascii="Times New Roman" w:hAnsi="Times New Roman" w:cs="Times New Roman"/>
           <w:sz w:val="24"/>
         </w:rPr>
-        <w:t>Pareto-grensene 80 % og 95 % ble deretter lagt på den kumulative kurven, som vist i Figur 5 nedenfor. Kurvens form – en bratt stigning tidlig etterfulgt av en lang flat hale – viser at verdikonsentrasjonen følger Pareto-mønsteret. Av de 709 artiklene fikk 704 en ABC-klasse (182 A, 184 B, 338 C); de resterende 5 artiklene har null beregnet verdi etter D-02/D-03 og kunne ikke ABC-rangeres — disse rapporteres i MANGLER\_DATA-kategorien. Endelig fordeling mellom A-, B- og C-artikler presenteres i Tabell 8 i kapittel 7.</w:t>
+        <w:t>Pareto-grensene 80 % og 95 % ble deretter lagt på den kumulative kurven, som vist i Figur 6 nedenfor. Kurvens form – en bratt stigning tidlig etterfulgt av en lang flat hale – viser at verdikonsentrasjonen følger Pareto-mønsteret. Av de 709 artiklene fikk 704 en ABC-klasse (182 A, 184 B, 338 C); de resterende 5 artiklene har null beregnet verdi etter D-02/D-03 og kunne ikke ABC-rangeres — disse rapporteres i MANGLER\_DATA-kategorien. Endelig fordeling mellom A-, B- og C-artikler presenteres i Tabell 8 i kapittel 7.</w:t>
       </w:r>
     </w:p>
     <w:p>
@@ -16393,7 +16393,7 @@
           <w:i/>
           <w:sz w:val="20"/>
         </w:rPr>
-        <w:t>Figur 5. ABC Pareto-kurve: kumulativ verdiandel for 709 artikler rangert etter årsverdi, med grenser ved 80 % (A/B) og 95 % (B/C). Generert med støtte fra Claude (Anthropic, 2026).</w:t>
+        <w:t>Figur 6. ABC Pareto-kurve: kumulativ verdiandel for 709 artikler rangert etter årsverdi, med grenser ved 80 % (A/B) og 95 % (B/C). Generert med støtte fra Claude (Anthropic, 2026).</w:t>
       </w:r>
     </w:p>
     <w:p>
@@ -16571,7 +16571,7 @@
           <w:rFonts w:ascii="Times New Roman" w:hAnsi="Times New Roman" w:cs="Times New Roman"/>
           <w:sz w:val="24"/>
         </w:rPr>
-        <w:t>ABC- og XYZ-klassifiseringene ble kombinert til en ni-felts kryssmatrise, som vist i Figur 6. Matrisen gir et øyeblikksbilde av populasjonens sammensetning langs de to dimensjonene og danner inngangsdataene for regelmotoren i avsnitt 6.5. Fullstendige celleanntall er gjengitt i Figur 6; univariate XYZ-fordelingar presenteres i Tabell 9 i kapittel 7.</w:t>
+        <w:t>ABC- og XYZ-klassifiseringene ble kombinert til en ni-felts kryssmatrise, som vist i Figur 7. Matrisen gir et øyeblikksbilde av populasjonens sammensetning langs de to dimensjonene og danner inngangsdataene for regelmotoren i avsnitt 6.5. Fullstendige celleanntall er gjengitt i Figur 7; univariate XYZ-fordelingar presenteres i Tabell 9 i kapittel 7.</w:t>
       </w:r>
     </w:p>
     <w:p>
@@ -16620,7 +16620,7 @@
           <w:i/>
           <w:sz w:val="20"/>
         </w:rPr>
-        <w:t>Figur 6. ABC/XYZ-kryssmatrise: antall artikler per kombinasjon (709 artikler, WERKS 3300 / LGORT 3001). Generert med støtte fra Claude (Anthropic, 2026).</w:t>
+        <w:t>Figur 7. ABC/XYZ-kryssmatrise: antall artikler per kombinasjon (709 artikler, WERKS 3300 / LGORT 3001). Generert med støtte fra Claude (Anthropic, 2026).</w:t>
       </w:r>
     </w:p>
     <w:p>
@@ -16939,7 +16939,7 @@
           <w:rFonts w:ascii="Times New Roman" w:hAnsi="Times New Roman" w:cs="Times New Roman"/>
           <w:sz w:val="24"/>
         </w:rPr>
-        <w:t xml:space="preserve"> ble beregnet per artikkel. Fordelingen av dette avviket er illustrert i Figur 6 nedenfor. Terskelen </w:t>
+        <w:t xml:space="preserve"> ble beregnet per artikkel. Fordelingen av dette avviket er illustrert i Figur 7 nedenfor. Terskelen </w:t>
       </w:r>
       <m:oMath>
         <m:sSub>
@@ -17078,7 +17078,7 @@
           <w:i/>
           <w:sz w:val="20"/>
         </w:rPr>
-        <w:t>Figur 7. EOQ-avvik: relativ frekvensavvik (FREQ_AVVIK) for artikler med tilstrekkelige data, med terskel ved τ_f = 1,5. Generert med støtte fra Claude (Anthropic, 2026).</w:t>
+        <w:t>Figur 8. EOQ-avvik: relativ frekvensavvik (FREQ_AVVIK) for artikler med tilstrekkelige data, med terskel ved τ_f = 1,5. Generert med støtte fra Claude (Anthropic, 2026).</w:t>
       </w:r>
     </w:p>
     <w:p>
@@ -17090,7 +17090,7 @@
           <w:rFonts w:ascii="Times New Roman" w:hAnsi="Times New Roman" w:cs="Times New Roman"/>
           <w:sz w:val="24"/>
         </w:rPr>
-        <w:t xml:space="preserve">Figur 7 viser at fordelingen er sterkt høyreskjev: majoriteten av artiklene med EOQ-data har et FREQ\_AVVIK over terskelen på 1,5. Artikler under terskelen («OK») opererer nær EOQ-optimalt nivå. For 222 av de 487 artiklene med EOQ-data mangler innkjøpshistorikk i EKBE for analyseperioden, noe som innebærer at faktisk ordrefrekvens er null; disse artiklene inngår i «OK»-kategorien da det ikke kan påvises overbestilling. Totale </w:t>
+        <w:t xml:space="preserve">Figur 8 viser at fordelingen er sterkt høyreskjev: majoriteten av artiklene med EOQ-data har et FREQ\_AVVIK over terskelen på 1,5. Artikler under terskelen («OK») opererer nær EOQ-optimalt nivå. For 222 av de 487 artiklene med EOQ-data mangler innkjøpshistorikk i EKBE for analyseperioden, noe som innebærer at faktisk ordrefrekvens er null; disse artiklene inngår i «OK»-kategorien da det ikke kan påvises overbestilling. Totale </w:t>
       </w:r>
       <m:oMath>
         <m:r>
@@ -17293,7 +17293,7 @@
           <w:rFonts w:ascii="Times New Roman" w:hAnsi="Times New Roman" w:cs="Times New Roman"/>
           <w:sz w:val="24"/>
         </w:rPr>
-        <w:t>, 3, 4, 5, 6 og 7 på treningsdataene. For hvert K ble gjennomsnittlig silhouette-score beregnet. Figur 8 viser silhouette-profilen over K-søket.</w:t>
+        <w:t>, 3, 4, 5, 6 og 7 på treningsdataene. For hvert K ble gjennomsnittlig silhouette-score beregnet. Figur 9 viser silhouette-profilen over K-søket.</w:t>
       </w:r>
     </w:p>
     <w:p>
@@ -17342,7 +17342,7 @@
           <w:i/>
           <w:sz w:val="20"/>
         </w:rPr>
-        <w:t>Figur 8. Silhouette-score for K = 2–7 (treningsdata, n = 389): K = 3 gir høyest score (0,383). Generert med støtte fra Claude (Anthropic, 2026).</w:t>
+        <w:t>Figur 9. Silhouette-score for K = 2–7 (treningsdata, n = 389): K = 3 gir høyest score (0,383). Generert med støtte fra Claude (Anthropic, 2026).</w:t>
       </w:r>
     </w:p>
     <w:p>
@@ -17454,7 +17454,7 @@
           <w:rFonts w:ascii="Times New Roman" w:hAnsi="Times New Roman" w:cs="Times New Roman"/>
           <w:sz w:val="24"/>
         </w:rPr>
-        <w:t xml:space="preserve"> (mange unødvendige ordrer). Figur 8 visualiserer klyngestrukturen i et to-dimensjonalt projeksjon langs de to mest informative featurene.</w:t>
+        <w:t xml:space="preserve"> (mange unødvendige ordrer). Figur 9 visualiserer klyngestrukturen i et to-dimensjonalt projeksjon langs de to mest informative featurene.</w:t>
       </w:r>
     </w:p>
     <w:p>
@@ -17503,7 +17503,7 @@
           <w:i/>
           <w:sz w:val="20"/>
         </w:rPr>
-        <w:t>Figur 9. K-means klyngeresultat (K = 3): artikler plottet langs z(ln CV) og z(ln verdi), farge etter klynge. K_OVERFØR-klyngen er markert med stjerne (★). Generert med støtte fra Claude (Anthropic, 2026).</w:t>
+        <w:t>Figur 10. K-means klyngeresultat (K = 3): artikler plottet langs z(ln CV) og z(ln verdi), farge etter klynge. K_OVERFØR-klyngen er markert med stjerne (★). Generert med støtte fra Claude (Anthropic, 2026).</w:t>
       </w:r>
     </w:p>
     <w:p>
@@ -17515,7 +17515,7 @@
           <w:rFonts w:ascii="Times New Roman" w:hAnsi="Times New Roman" w:cs="Times New Roman"/>
           <w:sz w:val="24"/>
         </w:rPr>
-        <w:t>Figur 9 viser at de tre klyngene er rimelig separert i feature-rommet, særlig K\_OVERFØR-klyngen (grønn), som skiller seg fra de øvrige ved sin kombinasjon av lav CV og høy verdi. For å tolke innholdet i hver klynge viser Figur 10 gjennomsnittlig standardisert verdi per feature for de tre klyngene.</w:t>
+        <w:t>Figur 10 viser at de tre klyngene er rimelig separert i feature-rommet, særlig K\_OVERFØR-klyngen (grønn), som skiller seg fra de øvrige ved sin kombinasjon av lav CV og høy verdi. For å tolke innholdet i hver klynge viser Figur 11 gjennomsnittlig standardisert verdi per feature for de tre klyngene.</w:t>
       </w:r>
     </w:p>
     <w:p>
@@ -17564,7 +17564,7 @@
           <w:i/>
           <w:sz w:val="20"/>
         </w:rPr>
-        <w:t>Figur 10. Klyngeprofiler for K-means (K=3): gjennomsnittlig z-score per feature per klynge. K\_OVERFØR-klyngen (grønn) kjennetegnes av lav CV og høy verdi. Generert med støtte fra Claude (Anthropic, 2026).</w:t>
+        <w:t>Figur 11. Klyngeprofiler for K-means (K=3): gjennomsnittlig z-score per feature per klynge. K\_OVERFØR-klyngen (grønn) kjennetegnes av lav CV og høy verdi. Generert med støtte fra Claude (Anthropic, 2026).</w:t>
       </w:r>
     </w:p>
     <w:p>
@@ -17576,7 +17576,7 @@
           <w:rFonts w:ascii="Times New Roman" w:hAnsi="Times New Roman" w:cs="Times New Roman"/>
           <w:sz w:val="24"/>
         </w:rPr>
-        <w:t xml:space="preserve">Figur 10 bekrefter at K\_OVERFØR-klyngen (Klynge 3, </w:t>
+        <w:t xml:space="preserve">Figur 11 bekrefter at K\_OVERFØR-klyngen (Klynge 3, </w:t>
       </w:r>
       <m:oMath>
         <m:r>
@@ -17844,7 +17844,7 @@
           <w:rFonts w:ascii="Times New Roman" w:hAnsi="Times New Roman" w:cs="Times New Roman"/>
           <w:sz w:val="24"/>
         </w:rPr>
-        <w:t>, for å kartlegge robustheten av besparelsesestimatet overfor usikkerhet i modellantagelsene. Figur 11 viser den endelige fordelingen av regelmotor-anbefalinger og estimert EOQ-besparelse under tre scenarier, mens detaljerte besparelsestall og sensitivitetsintervaller presenteres i avsnitt 7.5–7.6.</w:t>
+        <w:t>, for å kartlegge robustheten av besparelsesestimatet overfor usikkerhet i modellantagelsene. Figur 12 viser den endelige fordelingen av regelmotor-anbefalinger og estimert EOQ-besparelse under tre scenarier, mens detaljerte besparelsestall og sensitivitetsintervaller presenteres i avsnitt 7.5–7.6.</w:t>
       </w:r>
     </w:p>
     <w:p>
@@ -17893,7 +17893,7 @@
           <w:i/>
           <w:sz w:val="20"/>
         </w:rPr>
-        <w:t>Figur 11. Regelmotor og besparelsesanalyse: fordeling av HVFS-anbefalinger (venstre) og estimert årlig EOQ-besparelse under tre realiseringsscenarier (høyre). 709 artikler, WERKS 3300 / LGORT 3001. Generert med støtte fra Claude (Anthropic, 2026).</w:t>
+        <w:t>Figur 12. Regelmotor og besparelsesanalyse: fordeling av HVFS-anbefalinger (venstre) og estimert årlig EOQ-besparelse under tre realiseringsscenarier (høyre). 709 artikler, WERKS 3300 / LGORT 3001. Generert med støtte fra Claude (Anthropic, 2026).</w:t>
       </w:r>
     </w:p>
     <w:p>
@@ -17905,7 +17905,7 @@
           <w:rFonts w:ascii="Times New Roman" w:hAnsi="Times New Roman" w:cs="Times New Roman"/>
           <w:sz w:val="24"/>
         </w:rPr>
-        <w:t>Figur 11 viser at 145 artikler (20,5 % av populasjonen) anbefales overført til HVFS, mens 257 artikler (36,2 %) beholdes lokalt basert på Z-klasse eller CY-kombinasjon. Kategorien VURDER NÆRMERE er den største enkeltgruppen med 284 artikler (40,1 %), noe som reflekterer at mange artikler har en profil der de ulike analysene ikke gir entydige signaler. Dette er et forventet utfall gitt at regelmotoren er utformet for å unngå feilaktige overføringsanbefalinger: usikre tilfeller sendes til manuell vurdering fremfor å tvinges inn i en binær beslutning. Fordelingen av anbefalinger per regel er som følger: R1 (Z-override) fanget 144 artikler, R2 (CY) fanget 113, R3 (A/B + X + FOR\_MANGE) fanget 91, R4 (A/B + X + K\_OVERFØR) fanget 26, R5 (A/B + Y + K\_OVERFØR) fanget 28, og R6–R8 sendte de resterende 284 artiklene til manuell vurdering. At VURDER\_NÆRMERE er den største enkeltgruppen er et bevisst designvalg: regelmotoren er utformet for høy presisjon i OVERFØR-anbefalingene, og aksepterer at dette medfører en større andel artikler som krever manuell gjennomgang. Fullstendige resultat- og besparelsestabeller presenteres i kapittel 7.</w:t>
+        <w:t>Figur 12 viser at 145 artikler (20,5 % av populasjonen) anbefales overført til HVFS, mens 257 artikler (36,2 %) beholdes lokalt basert på Z-klasse eller CY-kombinasjon. Kategorien VURDER NÆRMERE er den største enkeltgruppen med 284 artikler (40,1 %), noe som reflekterer at mange artikler har en profil der de ulike analysene ikke gir entydige signaler. Dette er et forventet utfall gitt at regelmotoren er utformet for å unngå feilaktige overføringsanbefalinger: usikre tilfeller sendes til manuell vurdering fremfor å tvinges inn i en binær beslutning. Fordelingen av anbefalinger per regel er som følger: R1 (Z-override) fanget 144 artikler, R2 (CY) fanget 113, R3 (A/B + X + FOR\_MANGE) fanget 91, R4 (A/B + X + K\_OVERFØR) fanget 26, R5 (A/B + Y + K\_OVERFØR) fanget 28, og R6–R8 sendte de resterende 284 artiklene til manuell vurdering. At VURDER\_NÆRMERE er den største enkeltgruppen er et bevisst designvalg: regelmotoren er utformet for høy presisjon i OVERFØR-anbefalingene, og aksepterer at dette medfører en større andel artikler som krever manuell gjennomgang. Fullstendige resultat- og besparelsestabeller presenteres i kapittel 7.</w:t>
       </w:r>
     </w:p>
     <w:p>
@@ -18374,7 +18374,7 @@
           <w:rFonts w:ascii="Times New Roman" w:hAnsi="Times New Roman" w:cs="Times New Roman"/>
           <w:sz w:val="24"/>
         </w:rPr>
-        <w:t>Fordelingen viser et tydelig Pareto-mønster: A- og B-artiklene (366 artikler, 51,6 %) står for ~95 % av verdibindingen, mens 338 C-artikler (47,7 %) dekker de resterende 5 %. A-klassens andel på 25,7 % er noe høyere enn den kanoniske 20 %-regelen, men konsistent med sykehussortiment der få høyverdige artikler dominerer. Pareto-kurven er presentert som Figur 5 i kapittel 6.</w:t>
+        <w:t>Fordelingen viser et tydelig Pareto-mønster: A- og B-artiklene (366 artikler, 51,6 %) står for ~95 % av verdibindingen, mens 338 C-artikler (47,7 %) dekker de resterende 5 %. A-klassens andel på 25,7 % er noe høyere enn den kanoniske 20 %-regelen, men konsistent med sykehussortiment der få høyverdige artikler dominerer. Pareto-kurven er presentert som Figur 6 i kapittel 6.</w:t>
       </w:r>
     </w:p>
     <w:p>
@@ -18780,7 +18780,7 @@
           <w:rFonts w:ascii="Times New Roman" w:hAnsi="Times New Roman" w:cs="Times New Roman"/>
           <w:sz w:val="24"/>
         </w:rPr>
-        <w:t>Sammenligningen med SAP-feltet ZZXYZ viste 33 % samsvar mellom systemregistrert og beregnet klasse (125 av 375 artikler med data i begge kilder). Valideringen er begrenset til de 375 artiklene der ZZXYZ-feltet er utfylt i MDMA; for de øvrige 334 artiklene mangler systemklassifisering. Tabell 10 oppsummerer kryssvalideringen. Det lave samsvaret på 33 % understreker at SAP-feltets ZZXYZ ikke er systematisk oppdatert og bør erstattes med beregnet CV-klasse som primær XYZ-indikator. ABC/XYZ-kryssmatrisen er presentert som Figur 6 i kapittel 6; fullstendige celleanntall er gjengitt der.</w:t>
+        <w:t>Sammenligningen med SAP-feltet ZZXYZ viste 33 % samsvar mellom systemregistrert og beregnet klasse (125 av 375 artikler med data i begge kilder). Valideringen er begrenset til de 375 artiklene der ZZXYZ-feltet er utfylt i MDMA; for de øvrige 334 artiklene mangler systemklassifisering. Tabell 10 oppsummerer kryssvalideringen. Det lave samsvaret på 33 % understreker at SAP-feltets ZZXYZ ikke er systematisk oppdatert og bør erstattes med beregnet CV-klasse som primær XYZ-indikator. ABC/XYZ-kryssmatrisen er presentert som Figur 7 i kapittel 6; fullstendige celleanntall er gjengitt der.</w:t>
       </w:r>
     </w:p>
     <w:tbl>
@@ -19741,7 +19741,7 @@
           <w:rFonts w:ascii="Times New Roman" w:hAnsi="Times New Roman" w:cs="Times New Roman"/>
           <w:sz w:val="24"/>
         </w:rPr>
-        <w:t xml:space="preserve"> for alle 487 artikler er kr 2 333 441 per år. Dette representerer det totale kostnadsoverskuddet som genereres av at faktisk ordrepraksis avviker fra EOQ-optimal; det er ikke direkte det samme som det realisable besparelsespotensialet, da kun artikler i OVERFØR\_HVFS-kategorien inngår i besparelsesberegningen (se avsnitt 7.6). Fordelingen av FREQ\_AVVIK er illustrert i Figur 7 i kapittel 6.</w:t>
+        <w:t xml:space="preserve"> for alle 487 artikler er kr 2 333 441 per år. Dette representerer det totale kostnadsoverskuddet som genereres av at faktisk ordrepraksis avviker fra EOQ-optimal; det er ikke direkte det samme som det realisable besparelsespotensialet, da kun artikler i OVERFØR\_HVFS-kategorien inngår i besparelsesberegningen (se avsnitt 7.6). Fordelingen av FREQ\_AVVIK er illustrert i Figur 8 i kapittel 6.</w:t>
       </w:r>
     </w:p>
     <w:p>
@@ -20296,7 +20296,7 @@
           <w:rFonts w:ascii="Times New Roman" w:hAnsi="Times New Roman" w:cs="Times New Roman"/>
           <w:sz w:val="24"/>
         </w:rPr>
-        <w:t xml:space="preserve"> kr 7 005 — den høyeste av alle tre klynger. Profilen viser at denne klyngen samler artikler som er verdifulle, stabile og overbestilte, noe som gjør dem til naturlige kandidater for sentralisering. K\_OVERFØR-flagget settes automatisk basert på rangering av klyngenes gjennomsnittlige CV (stigende) og verdi (synkende). Klyngeprofilen i feature-rommet er visualisert i Figur 9 i kapittel 6.</w:t>
+        <w:t xml:space="preserve"> kr 7 005 — den høyeste av alle tre klynger. Profilen viser at denne klyngen samler artikler som er verdifulle, stabile og overbestilte, noe som gjør dem til naturlige kandidater for sentralisering. K\_OVERFØR-flagget settes automatisk basert på rangering av klyngenes gjennomsnittlige CV (stigende) og verdi (synkende). Klyngeprofilen i feature-rommet er visualisert i Figur 10 i kapittel 6.</w:t>
       </w:r>
     </w:p>
     <w:p>
@@ -20775,7 +20775,7 @@
           <w:rFonts w:ascii="Times New Roman" w:hAnsi="Times New Roman" w:cs="Times New Roman"/>
           <w:sz w:val="24"/>
         </w:rPr>
-        <w:t>257 artikler (36,2 %) beholdes lokalt, primært grunnet Z-klassifisering (R1: 144 artikler) eller CY-profil (R2: 113 artikler). Z-override (R1) er den enkeltregelen som fanger flest artikler, noe som bekrefter at uforutsigbart forbruksmønster er den vanligste kontraindikasjonen mot sentralisering i dette sortimentet. 284 artikler (40,1 %) sendes til manuell vurdering — artikler der de kvantitative signalene fra ABC, XYZ, EOQ og K-means ikke er tilstrekkelig entydige til å generere en automatisert anbefaling. 23 artikler (3,2 %) mangler tilstrekkelig data for klassifisering. Fordelingen er visualisert i Figur 11 i kapittel 6.</w:t>
+        <w:t>257 artikler (36,2 %) beholdes lokalt, primært grunnet Z-klassifisering (R1: 144 artikler) eller CY-profil (R2: 113 artikler). Z-override (R1) er den enkeltregelen som fanger flest artikler, noe som bekrefter at uforutsigbart forbruksmønster er den vanligste kontraindikasjonen mot sentralisering i dette sortimentet. 284 artikler (40,1 %) sendes til manuell vurdering — artikler der de kvantitative signalene fra ABC, XYZ, EOQ og K-means ikke er tilstrekkelig entydige til å generere en automatisert anbefaling. 23 artikler (3,2 %) mangler tilstrekkelig data for klassifisering. Fordelingen er visualisert i Figur 12 i kapittel 6.</w:t>
       </w:r>
     </w:p>
     <w:p>
@@ -24354,7 +24354,7 @@
                 <w:rFonts w:ascii="Times New Roman" w:hAnsi="Times New Roman"/>
                 <w:sz w:val="22"/>
               </w:rPr>
-              <w:t>Varegruppebeskriving</w:t>
+              <w:t>Vareguppebeskrivelse</w:t>
             </w:r>
           </w:p>
         </w:tc>
@@ -24416,7 +24416,7 @@
                 <w:rFonts w:ascii="Times New Roman" w:hAnsi="Times New Roman"/>
                 <w:sz w:val="22"/>
               </w:rPr>
-              <w:t>709 aktive artiklar, 21 kolonnar</w:t>
+              <w:t>709 aktive artikler, 21 kolonner</w:t>
             </w:r>
           </w:p>
         </w:tc>
@@ -24431,7 +24431,7 @@
           <w:rFonts w:ascii="Times New Roman" w:hAnsi="Times New Roman" w:cs="Times New Roman"/>
           <w:sz w:val="24"/>
         </w:rPr>
-        <w:t>Alle datavalgsbeslutningar (D-01 til D-08) er dokumenterte i Tabell 5 i hovudteksten.</w:t>
+        <w:t>Alle datavalgsbeslutninger (D-01 til D-08) er dokumentert i Tabell 5 i hovedteksten.</w:t>
       </w:r>
     </w:p>
     <w:p>
@@ -24456,7 +24456,7 @@
           <w:rFonts w:ascii="Times New Roman" w:hAnsi="Times New Roman" w:cs="Times New Roman"/>
           <w:sz w:val="24"/>
         </w:rPr>
-        <w:t>Analyseverktøyet er implementert i Python 3.13 og består av to hovudkomponentar:</w:t>
+        <w:t>Analyseverktøyet er implementert i Python 3.13 og består av to hovedkomponenter:</w:t>
       </w:r>
     </w:p>
     <w:p>
@@ -24469,14 +24469,14 @@
           <w:b/>
           <w:sz w:val="24"/>
         </w:rPr>
-        <w:t>Hovudscript:</w:t>
-      </w:r>
-      <w:r>
-        <w:rPr>
-          <w:rFonts w:ascii="Times New Roman" w:hAnsi="Times New Roman" w:cs="Times New Roman"/>
-          <w:sz w:val="24"/>
-        </w:rPr>
-        <w:t xml:space="preserve"> `LOG650_analyse_v2_7.py` — deterministisk analysepipeline som les MASTERFILE V1.xlsx og produserer alle klassifiseringar, K-means-modellen, regelmotoranbefalingar og besparelsesestimater. Outputformat: Excel (LOG650_Resultater.xlsx) med separate ark for kvart analysesteg.</w:t>
+        <w:t>Hovedscript:</w:t>
+      </w:r>
+      <w:r>
+        <w:rPr>
+          <w:rFonts w:ascii="Times New Roman" w:hAnsi="Times New Roman" w:cs="Times New Roman"/>
+          <w:sz w:val="24"/>
+        </w:rPr>
+        <w:t xml:space="preserve"> `LOG650_analyse_v2_7.py` — deterministisk analysepipeline som leser MASTERFILE V1.xlsx og produserer alle klassifiseringer, K-means-modellen, regelmotoranbefalinger og besparelsesestimater. Outputformat: Excel (LOG650_Resultater.xlsx) med separate ark for hvert analysesteg.</w:t>
       </w:r>
     </w:p>
     <w:p>
@@ -24496,7 +24496,7 @@
           <w:rFonts w:ascii="Times New Roman" w:hAnsi="Times New Roman" w:cs="Times New Roman"/>
           <w:sz w:val="24"/>
         </w:rPr>
-        <w:t xml:space="preserve"> 12 separate Python-scripts (`plot_*.py`) som genererer figurane Fig00–Fig11 i konsistent stil (serif-font, 300 dpi, felles fargepalett).</w:t>
+        <w:t xml:space="preserve"> 12 separate Python-scripts (`plot_*.py`) som genererer figurene Fig00–Fig11 i konsistent stil (serif-font, 300 dpi, felles fargepalett).</w:t>
       </w:r>
     </w:p>
     <w:p>
@@ -24516,7 +24516,7 @@
           <w:rFonts w:ascii="Times New Roman" w:hAnsi="Times New Roman" w:cs="Times New Roman"/>
           <w:sz w:val="24"/>
         </w:rPr>
-        <w:t xml:space="preserve"> pandas 2.x (datastrukturar), scikit-learn 1.x (KMeans, StandardScaler, silhouette_score), matplotlib 3.x (visualisering), openpyxl (Excel I/O).</w:t>
+        <w:t xml:space="preserve"> pandas 2.x (datastrukturer), scikit-learn 1.x (KMeans, StandardScaler, silhouette_score), matplotlib 3.x (visualisering), openpyxl (Excel I/O).</w:t>
       </w:r>
     </w:p>
     <w:p>
@@ -24529,14 +24529,14 @@
           <w:b/>
           <w:sz w:val="24"/>
         </w:rPr>
-        <w:t>Reproduserbarheit:</w:t>
-      </w:r>
-      <w:r>
-        <w:rPr>
-          <w:rFonts w:ascii="Times New Roman" w:hAnsi="Times New Roman" w:cs="Times New Roman"/>
-          <w:sz w:val="24"/>
-        </w:rPr>
-        <w:t xml:space="preserve"> Alle scripts brukar `random_state=42` for deterministisk output. Gjentatt kjøring med same inputdata gir identiske resultat.</w:t>
+        <w:t>Reproduserbarhet:</w:t>
+      </w:r>
+      <w:r>
+        <w:rPr>
+          <w:rFonts w:ascii="Times New Roman" w:hAnsi="Times New Roman" w:cs="Times New Roman"/>
+          <w:sz w:val="24"/>
+        </w:rPr>
+        <w:t xml:space="preserve"> Alle scripts bruker `random_state=42` for deterministisk output. Gjentatt kjøring med samme inputdata gir identiske resultater.</w:t>
       </w:r>
     </w:p>
     <w:p>
@@ -24548,7 +24548,7 @@
           <w:rFonts w:ascii="Times New Roman" w:hAnsi="Times New Roman" w:cs="Times New Roman"/>
           <w:sz w:val="24"/>
         </w:rPr>
-        <w:t>Fullstendig kildekode er tilgjengeleg i prosjektets GitHub-repository.</w:t>
+        <w:t>Fullstendig kildekode er tilgjengelig i prosjektets GitHub-repository.</w:t>
       </w:r>
     </w:p>
     <w:p>
@@ -24573,7 +24573,7 @@
           <w:rFonts w:ascii="Times New Roman" w:hAnsi="Times New Roman" w:cs="Times New Roman"/>
           <w:sz w:val="24"/>
         </w:rPr>
-        <w:t>I denne oppgåva er KI-verktøyet Claude (Anthropic, 2026) brukt som støtteverktøy i tre delar av arbeidet, i samsvar med Høgskolen i Molde sine retningslinjer for bruk av KI på hjemmeeksamen.</w:t>
+        <w:t>I denne rapporten er KI-verktøyet Claude (Anthropic, 2026) brukt som støtteverktøy i tre deler av arbeidet, i samsvar med Høgskolen i Molde sine retningslinjer for bruk av KI på hjemmeeksamen.</w:t>
       </w:r>
     </w:p>
     <w:p>
@@ -24586,14 +24586,14 @@
           <w:b/>
           <w:sz w:val="24"/>
         </w:rPr>
-        <w:t>1. Kode og algoritmar.</w:t>
-      </w:r>
-      <w:r>
-        <w:rPr>
-          <w:rFonts w:ascii="Times New Roman" w:hAnsi="Times New Roman" w:cs="Times New Roman"/>
-          <w:sz w:val="24"/>
-        </w:rPr>
-        <w:t xml:space="preserve"> Claude vart brukt til kodestøtte og feilsøking i Python-scriptet (`LOG650_analyse_v2_7.py`) som implementerer ABC-, XYZ-, EOQ- og K-means-analysen. Verktøyet vart brukt til å forstå kodelogikk, feilsøke syntaksfeil og generere foreløpige kodeutdrag som seinare vart tilpassa og integrert. All kode er gjennomgått, testa og modifisert av forfattaren for å sikre korrektheit. Den endelege implementasjonen, tolkinga av resultat og presentasjonen av numeriske verdiar er forfattarens ansvar. Alle scripts brukar `random_state=42` for deterministisk og reproduserbar output.</w:t>
+        <w:t>1. Kode og algoritmer.</w:t>
+      </w:r>
+      <w:r>
+        <w:rPr>
+          <w:rFonts w:ascii="Times New Roman" w:hAnsi="Times New Roman" w:cs="Times New Roman"/>
+          <w:sz w:val="24"/>
+        </w:rPr>
+        <w:t xml:space="preserve"> Claude ble brukt til kodestøtte og feilsøking i Python-scriptet (`LOG650_analyse_v2_7.py`) som implementerer ABC-, XYZ-, EOQ- og K-means-analysen. Verktøyet ble brukt til å forstå kodelogikk, feilsøke syntaksfeil og generere foreløpige kodeutdrag som senere ble tilpasset og integrert. All kode er gjennomgått, testet og modifisert av forfatteren for å sikre korrekthet. Den endelige implementasjonen, tolkningen av resultater og presentasjonen av numeriske verdier er forfatterens ansvar. Alle scripts bruker `random_state=42` for deterministisk og reproduserbar output.</w:t>
       </w:r>
     </w:p>
     <w:p>
@@ -24606,14 +24606,14 @@
           <w:b/>
           <w:sz w:val="24"/>
         </w:rPr>
-        <w:t>2. Figurar og tabellar.</w:t>
-      </w:r>
-      <w:r>
-        <w:rPr>
-          <w:rFonts w:ascii="Times New Roman" w:hAnsi="Times New Roman" w:cs="Times New Roman"/>
-          <w:sz w:val="24"/>
-        </w:rPr>
-        <w:t xml:space="preserve"> Alle 11 figurar (Fig00–Fig10) er genererte med matplotlib-scripts der Claude bidrog til utforming av layout, fargepalett og aksetitlar. Figurane er basert på analyseresultat produsert av Python-scriptet frå SAP-kildedata — KI-verktøyet har ikkje produsert eller modifisert nokon dataverdiar. Kvar figur er merka «Generert med støtte fra Claude (Anthropic, 2026)» i bildeteksten. Tabellar er formaterte med støtte frå Claude, men alle verdiar kjem direkte frå analysescriptet.</w:t>
+        <w:t>2. Figurer og tabeller.</w:t>
+      </w:r>
+      <w:r>
+        <w:rPr>
+          <w:rFonts w:ascii="Times New Roman" w:hAnsi="Times New Roman" w:cs="Times New Roman"/>
+          <w:sz w:val="24"/>
+        </w:rPr>
+        <w:t xml:space="preserve"> Alle 12 figurer (Fig00–Fig11) er generert med matplotlib-scripts der Claude bidro til utforming av layout, fargepalett og aksetitler. Figurene er basert på analyseresultater produsert av Python-scriptet fra SAP-kildedata — KI-verktøyet har ikke produsert eller modifisert noen dataverdier. Hver figur er merket «Generert med støtte fra Claude (Anthropic, 2026)» i bildeteksten. Tabeller er formatert med støtte fra Claude, men alle verdier kommer direkte fra analysescriptet.</w:t>
       </w:r>
     </w:p>
     <w:p>
@@ -24626,14 +24626,14 @@
           <w:b/>
           <w:sz w:val="24"/>
         </w:rPr>
-        <w:t>3. Tekststrukturering og språkleg bearbeiding.</w:t>
-      </w:r>
-      <w:r>
-        <w:rPr>
-          <w:rFonts w:ascii="Times New Roman" w:hAnsi="Times New Roman" w:cs="Times New Roman"/>
-          <w:sz w:val="24"/>
-        </w:rPr>
-        <w:t xml:space="preserve"> Claude vart brukt til å strukturere rapportteksten og forbetre språkleg klarheit. Verktøyet foreslo disposisjon, avsnittsinndeling og formuleringar som forfattaren vurderte kritisk og reviderte. Alle faglege påstandar, argument og konklusjonar er forfattarens eigne. Claude er ikkje brukt som fagkjelde og er ikkje sitert som belegg for faglege påstandar.</w:t>
+        <w:t>3. Tekststrukturering og språklig bearbeiding.</w:t>
+      </w:r>
+      <w:r>
+        <w:rPr>
+          <w:rFonts w:ascii="Times New Roman" w:hAnsi="Times New Roman" w:cs="Times New Roman"/>
+          <w:sz w:val="24"/>
+        </w:rPr>
+        <w:t xml:space="preserve"> Claude ble brukt til å strukturere rapportteksten og forbedre språklig klarhet. Verktøyet foreslo disposisjon, avsnittsinndeling og formuleringer som forfatteren vurderte kritisk og reviderte. Alle faglige påstander, argumenter og konklusjoner er forfatterens egne. Claude er ikke brukt som fagkilde og er ikke sitert som belegg for faglige påstander.</w:t>
       </w:r>
     </w:p>
     <w:p>
@@ -24646,14 +24646,14 @@
           <w:b/>
           <w:sz w:val="24"/>
         </w:rPr>
-        <w:t>Avgrensing.</w:t>
-      </w:r>
-      <w:r>
-        <w:rPr>
-          <w:rFonts w:ascii="Times New Roman" w:hAnsi="Times New Roman" w:cs="Times New Roman"/>
-          <w:sz w:val="24"/>
-        </w:rPr>
-        <w:t xml:space="preserve"> Rådata frå SAP vart ikkje lagt inn i KI-verktøyet. Alle datatransformasjonar er dokumenterte i D-01–D-08 (avsnitt 4.3) og køyrde lokalt i Python. Ingen pasientdata eller personopplysningar er brukte i studien.</w:t>
+        <w:t>Avgrensning.</w:t>
+      </w:r>
+      <w:r>
+        <w:rPr>
+          <w:rFonts w:ascii="Times New Roman" w:hAnsi="Times New Roman" w:cs="Times New Roman"/>
+          <w:sz w:val="24"/>
+        </w:rPr>
+        <w:t xml:space="preserve"> Rådata fra SAP ble ikke lagt inn i KI-verktøyet. Alle datatransformasjoner er dokumentert i D-01–D-08 (avsnitt 4.3) og kjørt lokalt i Python. Ingen pasientdata eller personopplysninger er brukt i studien.</w:t>
       </w:r>
     </w:p>
     <w:sectPr>

</xml_diff>

<commit_message>
Rett metode-/tallavvik og regenerer DOCX
K_OVERFØR-beskrivelse presisert: identifisering via CV- og verdi-rangering,
ikke ΔTC direkte (samsvar med kode). Regelfordeling rettet mot resultatfil:
R1=143, R2=114, R3=71, R4=18, R5=56. MANGLER_DATA (23) lagt inn i
sammendrag. Språkfeil: totalkostnavvik→totalkostnadsavvik (4 stk),
celleantall (linje 708). DOCX regenerert med build_word.py.

Co-Authored-By: Claude Opus 4.6 (1M context) <noreply@anthropic.com>
</commit_message>
<xml_diff>
--- a/005 report/LOG650_Rapport_v5.docx
+++ b/005 report/LOG650_Rapport_v5.docx
@@ -4633,7 +4633,7 @@
           <w:rFonts w:ascii="Times New Roman" w:hAnsi="Times New Roman"/>
           <w:sz w:val="24"/>
         </w:rPr>
-        <w:t xml:space="preserve">Analysen kombinerer fire metoder i en integrert rørledning: ABC-klassifisering basert på Pareto-prinsippet, XYZ-klassifisering basert på variasjonskoeffisient (CV), EOQ-avviksanalyse med parametere S = 750 kr og h = 20 % av enhetspris, og K-means klyngeanalyse med automatisk K-valg via silhouette-score. Resultatene sammenstilles i en regelmotor med åtte beslutningsregler som klassifiserer hver artikkel i én av tre kategorier: OVERFØR_HVFS, BEHOLD_LOKALT eller VURDER_NÆRMERE.</w:t>
+        <w:t xml:space="preserve">Analysen kombinerer fire metoder i en integrert rørledning: ABC-klassifisering basert på Pareto-prinsippet, XYZ-klassifisering basert på variasjonskoeffisient (CV), EOQ-avviksanalyse med parametere S = 750 kr og h = 20 % av enhetspris, og K-means klyngeanalyse med automatisk K-valg via silhouette-score. Resultatene sammenstilles i en regelmotor med åtte beslutningsregler som klassifiserer hver artikkel i én av fire kategorier: OVERFØR_HVFS, BEHOLD_LOKALT, VURDER_NÆRMERE eller MANGLER_DATA.</w:t>
       </w:r>
     </w:p>
     <w:p>
@@ -4646,7 +4646,7 @@
           <w:rFonts w:ascii="Times New Roman" w:hAnsi="Times New Roman"/>
           <w:sz w:val="24"/>
         </w:rPr>
-        <w:t xml:space="preserve">ABC-analysen viser at 182 artikler (25,7 %) tilhører A-kategorien og bærer om lag 80 % av den totale verdibindingen; 184 tilhører B og 338 tilhører C — de resterende 5 artiklene kunne ikke ABC-klassifiseres grunnet manglende verdidata. XYZ-analysen klassifiserer 350 artikler som X (stabilt forbruk, CV &lt; 0,5), 193 som Y og 144 som Z; 22 artikler ble ikke XYZ-klassifisert grunnet utilstrekkelig forbrukshistorikk. K-means-analysen identifiserer K = 3 distinkte klynger med silhouette-score 0,383 på treningsdata og 0,368 på testdata, noe som bekrefter en akseptabel klyngestruktur. Regelmotoren anbefaler overføring av 145 artikler (20,5 % av populasjonen), mens 257 artikler beholdes lokalt og 284 sendes til manuell vurdering. Det estimerte besparelsespotensialet er kr 451 515 per år i base case (realiseringsgrad g = 75 % av teoretisk totalkostnavvik \sum \Delta TC_i), med et pessimistisk scenario på kr 301 010 og et optimistisk på kr 602 020.</w:t>
+        <w:t xml:space="preserve">ABC-analysen viser at 182 artikler (25,7 %) tilhører A-kategorien og bærer om lag 80 % av den totale verdibindingen; 184 tilhører B og 338 tilhører C — de resterende 5 artiklene kunne ikke ABC-klassifiseres grunnet manglende verdidata. XYZ-analysen klassifiserer 350 artikler som X (stabilt forbruk, CV &lt; 0,5), 193 som Y og 144 som Z; 22 artikler ble ikke XYZ-klassifisert grunnet utilstrekkelig forbrukshistorikk. K-means-analysen identifiserer K = 3 distinkte klynger med silhouette-score 0,383 på treningsdata og 0,368 på testdata, noe som bekrefter en akseptabel klyngestruktur. Regelmotoren anbefaler overføring av 145 artikler (20,5 % av populasjonen), mens 257 artikler beholdes lokalt, 284 sendes til manuell vurdering og 23 artikler (3,2 %) mangler tilstrekkelig data for klassifisering. Det estimerte besparelsespotensialet er kr 451 515 per år i base case (realiseringsgrad g = 75 % av teoretisk totalkostnadsavvik \sum \Delta TC_i), med et pessimistisk scenario på kr 301 010 og et optimistisk på kr 602 020.</w:t>
       </w:r>
     </w:p>
     <w:p>
@@ -6354,7 +6354,7 @@
           <w:rFonts w:ascii="Times New Roman" w:hAnsi="Times New Roman" w:cs="Times New Roman"/>
           <w:sz w:val="24"/>
         </w:rPr>
-        <w:t>Figur 0. Konseptuelt rammeverk – fra SAP-data til HVFS-anbefaling</w:t>
+        <w:t>Figur 1. Konseptuelt rammeverk – fra SAP-data til HVFS-anbefaling</w:t>
       </w:r>
     </w:p>
     <w:p>
@@ -6366,7 +6366,7 @@
           <w:rFonts w:ascii="Times New Roman" w:hAnsi="Times New Roman" w:cs="Times New Roman"/>
           <w:sz w:val="24"/>
         </w:rPr>
-        <w:t>Figur 1. Lagerstruktur – Helse Vest forsyningskjede (forenklet)</w:t>
+        <w:t>Figur 2. Lagerstruktur – Helse Vest forsyningskjede (forenklet)</w:t>
       </w:r>
     </w:p>
     <w:p>
@@ -6378,7 +6378,7 @@
           <w:rFonts w:ascii="Times New Roman" w:hAnsi="Times New Roman" w:cs="Times New Roman"/>
           <w:sz w:val="24"/>
         </w:rPr>
-        <w:t>Figur 2. Analysepipeline: fra SAP-rådata til HVFS-anbefaling</w:t>
+        <w:t>Figur 3. Analysepipeline: fra SAP-rådata til HVFS-anbefaling</w:t>
       </w:r>
     </w:p>
     <w:p>
@@ -6390,7 +6390,7 @@
           <w:rFonts w:ascii="Times New Roman" w:hAnsi="Times New Roman" w:cs="Times New Roman"/>
           <w:sz w:val="24"/>
         </w:rPr>
-        <w:t>Figur 3. Regelmotor: sekvensiell beslutningsflyt for HVFS-anbefaling (R1–R8)</w:t>
+        <w:t>Figur 4. Regelmotor: sekvensiell beslutningsflyt for HVFS-anbefaling (R1–R8)</w:t>
       </w:r>
     </w:p>
     <w:p>
@@ -6402,7 +6402,7 @@
           <w:rFonts w:ascii="Times New Roman" w:hAnsi="Times New Roman" w:cs="Times New Roman"/>
           <w:sz w:val="24"/>
         </w:rPr>
-        <w:t>Figur 4. Dataoversikt: fordeling av nøkkelvariablar for 709 artiklar</w:t>
+        <w:t>Figur 5. Dataoversikt: fordeling av nøkkelvariabler for 709 artikler</w:t>
       </w:r>
     </w:p>
     <w:p>
@@ -6414,7 +6414,7 @@
           <w:rFonts w:ascii="Times New Roman" w:hAnsi="Times New Roman" w:cs="Times New Roman"/>
           <w:sz w:val="24"/>
         </w:rPr>
-        <w:t>Figur 5. ABC Pareto-kurve: kumulativ verdiandel for 709 artikler</w:t>
+        <w:t>Figur 6. ABC Pareto-kurve: kumulativ verdiandel for 709 artikler</w:t>
       </w:r>
     </w:p>
     <w:p>
@@ -6426,7 +6426,7 @@
           <w:rFonts w:ascii="Times New Roman" w:hAnsi="Times New Roman" w:cs="Times New Roman"/>
           <w:sz w:val="24"/>
         </w:rPr>
-        <w:t>Figur 6. ABC/XYZ-kryssmatrise: antall artikler per kombinasjon</w:t>
+        <w:t>Figur 7. ABC/XYZ-kryssmatrise: antall artikler per kombinasjon</w:t>
       </w:r>
     </w:p>
     <w:p>
@@ -6438,7 +6438,7 @@
           <w:rFonts w:ascii="Times New Roman" w:hAnsi="Times New Roman" w:cs="Times New Roman"/>
           <w:sz w:val="24"/>
         </w:rPr>
-        <w:t>Figur 7. EOQ-avvik: relativ frekvensavvik med terskel ved τ_f = 1,5</w:t>
+        <w:t>Figur 8. EOQ-avvik: relativ frekvensavvik med terskel ved τ_f = 1,5</w:t>
       </w:r>
     </w:p>
     <w:p>
@@ -6450,7 +6450,7 @@
           <w:rFonts w:ascii="Times New Roman" w:hAnsi="Times New Roman" w:cs="Times New Roman"/>
           <w:sz w:val="24"/>
         </w:rPr>
-        <w:t>Figur 8. Silhouette-score for K = 2–7 (treningsdata, n = 389)</w:t>
+        <w:t>Figur 9. Silhouette-score for K = 2–7 (treningsdata, n = 389)</w:t>
       </w:r>
     </w:p>
     <w:p>
@@ -6462,7 +6462,7 @@
           <w:rFonts w:ascii="Times New Roman" w:hAnsi="Times New Roman" w:cs="Times New Roman"/>
           <w:sz w:val="24"/>
         </w:rPr>
-        <w:t>Figur 9. K-means klyngeresultat (K = 3): forbruksstabilitet vs verdi og kostnadsavvik</w:t>
+        <w:t>Figur 10. K-means klyngeresultat (K = 3): forbruksstabilitet vs verdi og kostnadsavvik</w:t>
       </w:r>
     </w:p>
     <w:p>
@@ -6474,7 +6474,7 @@
           <w:rFonts w:ascii="Times New Roman" w:hAnsi="Times New Roman" w:cs="Times New Roman"/>
           <w:sz w:val="24"/>
         </w:rPr>
-        <w:t>Figur 10. Klyngeprofiler for K-means (K = 3): gjennomsnittlig z-score per feature</w:t>
+        <w:t>Figur 11. Klyngeprofiler for K-means (K = 3): gjennomsnittlig z-score per feature</w:t>
       </w:r>
     </w:p>
     <w:p>
@@ -6486,7 +6486,7 @@
           <w:rFonts w:ascii="Times New Roman" w:hAnsi="Times New Roman" w:cs="Times New Roman"/>
           <w:sz w:val="24"/>
         </w:rPr>
-        <w:t>Figur 11. Regelmotor og besparelsesanalyse: HVFS-anbefalinger og EOQ-besparelse</w:t>
+        <w:t>Figur 12. Regelmotor og besparelsesanalyse: HVFS-anbefalinger og EOQ-besparelse</w:t>
       </w:r>
     </w:p>
     <w:p>
@@ -7308,7 +7308,7 @@
           <w:rFonts w:ascii="Times New Roman" w:hAnsi="Times New Roman" w:cs="Times New Roman"/>
           <w:sz w:val="24"/>
         </w:rPr>
-        <w:t>Den dominerende tilnærmingen i litteraturen er ABC-analyse basert på Pareto-prinsippet. Silaen et al. (2023) viser at enkelt-kriterieanalyse på forbruksverdi er bredt adoptert i praksis, men påpeker at metoden alene ikke fanger opp variabilitet i etterspørsel eller kritikalitet for forsyningssikkerhet. Gupta et al. (2007) demonstrerer dette i en militærmedisinskstudie der ABC kombineres med VED-analyse (Vital, Essential, Desirable) for å differensiere mellom høyverdiartikler og artikler med kritisk klinisk betydning. Kombinasjonsmetodikken gir grunnlag for et mer nyansert klassifiseringssystem, men VED krever klinisk skjønn og er vanskelig å operasjonalisere på tvers av store sortiment uten strukturerte data.</w:t>
+        <w:t>Den dominerende tilnærmingen i litteraturen er ABC-analyse basert på Pareto-prinsippet. Silaen et al. (2023) viser at enkelt-kriterieanalyse på forbruksverdi er bredt adoptert i praksis, men påpeker at metoden alene ikke fanger opp variabilitet i etterspørsel eller kritikalitet for forsyningssikkerhet. Gupta et al. (2007) demonstrerer dette i en militærmedisinsk studie der ABC kombineres med VED-analyse (Vital, Essential, Desirable) for å differensiere mellom høyverdiartikler og artikler med kritisk klinisk betydning. Kombinasjonsmetodikken gir grunnlag for et mer nyansert klassifiseringssystem, men VED krever klinisk skjønn og er vanskelig å operasjonalisere på tvers av store sortiment uten strukturerte data.</w:t>
       </w:r>
     </w:p>
     <w:p>
@@ -10583,7 +10583,7 @@
           <w:rFonts w:ascii="Times New Roman" w:hAnsi="Times New Roman" w:cs="Times New Roman"/>
           <w:sz w:val="24"/>
         </w:rPr>
-        <w:t>Datagrunnlaget for analysen er hentet fra 14 SAP-tabeller via transaksjonen SE16H i SAP S/4HANA ved Helse Bergen, for perioden 2024–2025 (se Tabell 3 for fullstendig tabelloversikt). Tabellene dekker fire funksjonelle kategorier. Masterdata — MARD, MDMA, MARA, MAKT, MARC og MBEW — definerer artikkeluniverset, gir pris- og varegruppedata samt Helse Bergens operative ABC/XYZ-indikatorer. Forbruksdata fra MSEG (bevegelsestype BWART 201 og 647) registrerer faktisk forbruk ut fra lageret til avdeling på månedlig nivå, og er grunnlaget for XYZ-klassifisering og beregning av etterspørselen D i EOQ-formelen. Innkjøpsdata fra EKKO, EKPO og EKBE dokumenterer innkjøpsordrer og varemottak fra leverandør i analyseperioden, og benyttes til ABC-verdiberegning og kartlegging av faktisk bestillingsfrekvens. Supplerende tabeller — EINA, EINE og T023T — bidrar med leveringstidsdata og varegruppenavn. Det er en viktig funksjonell distinksjon at forbruksdata (MSEG) og innkjøpsdata (EKKO/EKPO/EKBE) representerer henholdsvis vareflyt ut av og inn til lager, og benyttes til ulike analysedimensjoner.</w:t>
+        <w:t>Datagrunnlaget for analysen er hentet fra 14 SAP-tabeller via transaksjonen SE16H i SAP S/4HANA ved Helse Bergen, for perioden 2024–2025 (se Tabell 4 for fullstendig tabelloversikt). Tabellene dekker fire funksjonelle kategorier. Masterdata — MARD, MDMA, MARA, MAKT, MARC og MBEW — definerer artikkeluniverset, gir pris- og varegruppedata samt Helse Bergens operative ABC/XYZ-indikatorer. Forbruksdata fra MSEG (bevegelsestype BWART 201 og 647) registrerer faktisk forbruk ut fra lageret til avdeling på månedlig nivå, og er grunnlaget for XYZ-klassifisering og beregning av etterspørselen D i EOQ-formelen. Innkjøpsdata fra EKKO, EKPO og EKBE dokumenterer innkjøpsordrer og varemottak fra leverandør i analyseperioden, og benyttes til ABC-verdiberegning og kartlegging av faktisk bestillingsfrekvens. Supplerende tabeller — EINA, EINE og T023T — bidrar med leveringstidsdata og varegruppenavn. Det er en viktig funksjonell distinksjon at forbruksdata (MSEG) og innkjøpsdata (EKKO/EKPO/EKBE) representerer henholdsvis vareflyt ut av og inn til lager, og benyttes til ulike analysedimensjoner.</w:t>
       </w:r>
     </w:p>
     <w:p>
@@ -11302,7 +11302,7 @@
                 <w:rFonts w:ascii="Times New Roman" w:hAnsi="Times New Roman"/>
                 <w:sz w:val="22"/>
               </w:rPr>
-              <w:t>Innkjøpsordrerhoder (bestillingstype ZNB)</w:t>
+              <w:t>Innkjøpsordrehoder (bestillingstype ZNB)</w:t>
             </w:r>
           </w:p>
         </w:tc>
@@ -11714,7 +11714,7 @@
           <w:rFonts w:ascii="Times New Roman" w:hAnsi="Times New Roman" w:cs="Times New Roman"/>
           <w:sz w:val="24"/>
         </w:rPr>
-        <w:t>Råuttrekket inneholder 1 006 unike artikkelnumre. Populasjonsavgrensningen beskrives i detalj i avsnitt 4.3 nedenfor, og reduserer dette til 709 aktive artikler. For forbruksdata er det benyttet bevegelsestyper (BWART) 201 og 647 fra MSEG, som representerer henholdsvis vareforbruk til kostnadssted og spesialforbruk. Disse to bevegelsesstypene fanger det reelle forbruket ut fra lager og utelukker interne overføringer og returer som ville ha forvrengt etterspørselsestimatet. Innkjøpsdata er hentet fra EKKO/EKPO/EKBE, som gir faktiske ordrelinjer og varemottak; disse benyttes for ABC-verdiberegning og for estimering av faktisk ordrefrekvens. Leveringstidsdata er hentet fra EINE (feltet WETAG), men dekker kun 6 % av artiklene; se beslutning D-05 under. Figur 5 gir en samlet oversikt over fordelingen av nøkkelvariablar i det endelige datasettet på 709 artikler.</w:t>
+        <w:t>Råuttrekket inneholder 1 006 unike artikkelnumre. Populasjonsavgrensningen beskrives i detalj i avsnitt 4.3 nedenfor, og reduserer dette til 709 aktive artikler. For forbruksdata er det benyttet bevegelsestyper (BWART) 201 og 647 fra MSEG, som representerer henholdsvis vareforbruk til kostnadssted og spesialforbruk. Disse to bevegelsesstypene fanger det reelle forbruket ut fra lager og utelukker interne overføringer og returer som ville ha forvrengt etterspørselsestimatet. Innkjøpsdata er hentet fra EKKO/EKPO/EKBE, som gir faktiske ordrelinjer og varemottak; disse benyttes for ABC-verdiberegning og for estimering av faktisk ordrefrekvens. Leveringstidsdata er hentet fra EINE (feltet WETAG), men dekker kun 6 % av artiklene; se beslutning D-05 under. Figur 5 gir en samlet oversikt over fordelingen av nøkkelvariabler i det endelige datasettet på 709 artikler.</w:t>
       </w:r>
     </w:p>
     <w:p>
@@ -12429,7 +12429,7 @@
           <w:rFonts w:ascii="Times New Roman" w:hAnsi="Times New Roman" w:cs="Times New Roman"/>
           <w:sz w:val="24"/>
         </w:rPr>
-        <w:t>Datapipelinen fra rådata til analyseklar datasett er illustrert i figuren nedenfor.</w:t>
+        <w:t>Datapipelinen fra rådata til analyseklart datasett er illustrert i figuren nedenfor.</w:t>
       </w:r>
     </w:p>
     <w:p>
@@ -12539,7 +12539,7 @@
           <w:rFonts w:ascii="Times New Roman" w:hAnsi="Times New Roman" w:cs="Times New Roman"/>
           <w:sz w:val="24"/>
         </w:rPr>
-        <w:t xml:space="preserve"> av enhetspris per år er en vanlig sjablongregel i EOQ-litteraturen (Hautaniemi &amp; Pirttilä, 1999), men inkluderer implisitte antagelser om kapitalkostand, lagerbrann- og ukurantrisiko som ikke er verifisert mot Helse Bergens faktiske regnskapstall. Sensitivitetsanalysen i kapittel 7 undersøker i hvilken grad resultater endres ved variasjon i disse parameterne.</w:t>
+        <w:t xml:space="preserve"> av enhetspris per år er en vanlig sjablongregel i EOQ-litteraturen (Hautaniemi &amp; Pirttilä, 1999), men inkluderer implisitte antagelser om kapitalkostnad, lagerbrann- og ukurantrisiko som ikke er verifisert mot Helse Bergens faktiske regnskapstall. Sensitivitetsanalysen i kapittel 7 undersøker i hvilken grad resultater endres ved variasjon i disse parameterne.</w:t>
       </w:r>
     </w:p>
     <w:p>
@@ -14382,7 +14382,7 @@
           <w:rFonts w:ascii="Times New Roman" w:hAnsi="Times New Roman" w:cs="Times New Roman"/>
           <w:sz w:val="24"/>
         </w:rPr>
-        <w:t xml:space="preserve">, det vil si at faktisk ordrefrekvens er mer enn 50 % høyere enn EOQ-optimal frekvens. Terskelen </w:t>
+        <w:t xml:space="preserve">, det vil si at faktisk ordrefrekvens er mer enn 150 % høyere enn EOQ-optimal frekvens. Terskelen </w:t>
       </w:r>
       <m:oMath>
         <m:sSub>
@@ -15416,19 +15416,34 @@
           <w:rFonts w:ascii="Times New Roman" w:hAnsi="Times New Roman" w:cs="Times New Roman"/>
           <w:sz w:val="24"/>
         </w:rPr>
-        <w:t xml:space="preserve"> Etter kjøring identifiseres én klynge som HVFS-overføringsklynge basert på en kombinasjon av lav CV (stabilt forbruk), høy artikkelverdi og høyt positivt </w:t>
+        <w:t xml:space="preserve"> Etter kjøring identifiseres én klynge som HVFS-overføringsklynge. Identifiseringen skjer ved at klyngesentroidene rangeres på to dimensjoner — lavest gjennomsnittlig CV (stabilt forbruk) og høyest gjennomsnittlig artikkelverdi — og klyngen med best samlet rangering velges som K\_OVERFØR. Ettersom </w:t>
       </w:r>
       <m:oMath>
-        <m:r>
-          <m:t>ΔTC</m:t>
-        </m:r>
+        <m:d>
+          <m:dPr>
+            <m:begChr m:val="|"/>
+            <m:sepChr m:val=""/>
+            <m:endChr m:val="|"/>
+          </m:dPr>
+          <m:e>
+            <m:r>
+              <m:t>Δ</m:t>
+            </m:r>
+            <m:r>
+              <m:t>T</m:t>
+            </m:r>
+            <m:r>
+              <m:t>C</m:t>
+            </m:r>
+          </m:e>
+        </m:d>
       </m:oMath>
       <w:r>
         <w:rPr>
           <w:rFonts w:ascii="Times New Roman" w:hAnsi="Times New Roman" w:cs="Times New Roman"/>
           <w:sz w:val="24"/>
         </w:rPr>
-        <w:t xml:space="preserve"> (mange unødvendige ordrer). Denne klyngen inngår som ett av inngangssignalene i regelmotoren beskrevet nedenfor.</w:t>
+        <w:t xml:space="preserve"> inngår i featurevektoren, påvirker den klyngestrukturen indirekte: artikler med høyt kostnadsavvik tenderer mot samme klynge som artikler med høy verdi og lav CV. Denne klyngen inngår som ett av inngangssignalene i regelmotoren beskrevet nedenfor.</w:t>
       </w:r>
     </w:p>
     <w:p>
@@ -15918,22 +15933,22 @@
                 <w:rFonts w:ascii="Times New Roman" w:hAnsi="Times New Roman"/>
                 <w:sz w:val="22"/>
               </w:rPr>
-              <w:t>TIL_VURDERING</w:t>
-            </w:r>
-          </w:p>
-        </w:tc>
-        <w:tc>
-          <w:tcPr>
-            <w:tcW w:type="dxa" w:w="2192"/>
-          </w:tcPr>
-          <w:p>
-            <w:r/>
-            <w:r>
-              <w:rPr>
-                <w:rFonts w:ascii="Times New Roman" w:hAnsi="Times New Roman"/>
-                <w:sz w:val="22"/>
-              </w:rPr>
-              <w:t>Høy verdi, stabilt, men ikkje K_OVERFØR</w:t>
+              <w:t>VURDER_NÆRMERE</w:t>
+            </w:r>
+          </w:p>
+        </w:tc>
+        <w:tc>
+          <w:tcPr>
+            <w:tcW w:type="dxa" w:w="2192"/>
+          </w:tcPr>
+          <w:p>
+            <w:r/>
+            <w:r>
+              <w:rPr>
+                <w:rFonts w:ascii="Times New Roman" w:hAnsi="Times New Roman"/>
+                <w:sz w:val="22"/>
+              </w:rPr>
+              <w:t>Høy verdi, stabilt, men ikke K_OVERFØR</w:t>
             </w:r>
           </w:p>
         </w:tc>
@@ -15980,22 +15995,22 @@
                 <w:rFonts w:ascii="Times New Roman" w:hAnsi="Times New Roman"/>
                 <w:sz w:val="22"/>
               </w:rPr>
-              <w:t>TIL_VURDERING</w:t>
-            </w:r>
-          </w:p>
-        </w:tc>
-        <w:tc>
-          <w:tcPr>
-            <w:tcW w:type="dxa" w:w="2192"/>
-          </w:tcPr>
-          <w:p>
-            <w:r/>
-            <w:r>
-              <w:rPr>
-                <w:rFonts w:ascii="Times New Roman" w:hAnsi="Times New Roman"/>
-                <w:sz w:val="22"/>
-              </w:rPr>
-              <w:t>Høy verdi, moderat variasjon, ikkje K_OVERFØR</w:t>
+              <w:t>VURDER_NÆRMERE</w:t>
+            </w:r>
+          </w:p>
+        </w:tc>
+        <w:tc>
+          <w:tcPr>
+            <w:tcW w:type="dxa" w:w="2192"/>
+          </w:tcPr>
+          <w:p>
+            <w:r/>
+            <w:r>
+              <w:rPr>
+                <w:rFonts w:ascii="Times New Roman" w:hAnsi="Times New Roman"/>
+                <w:sz w:val="22"/>
+              </w:rPr>
+              <w:t>Høy verdi, moderat variasjon, ikke K_OVERFØR</w:t>
             </w:r>
           </w:p>
         </w:tc>
@@ -16042,7 +16057,7 @@
                 <w:rFonts w:ascii="Times New Roman" w:hAnsi="Times New Roman"/>
                 <w:sz w:val="22"/>
               </w:rPr>
-              <w:t>TIL_VURDERING</w:t>
+              <w:t>VURDER_NÆRMERE</w:t>
             </w:r>
           </w:p>
         </w:tc>
@@ -16571,7 +16586,7 @@
           <w:rFonts w:ascii="Times New Roman" w:hAnsi="Times New Roman" w:cs="Times New Roman"/>
           <w:sz w:val="24"/>
         </w:rPr>
-        <w:t>ABC- og XYZ-klassifiseringene ble kombinert til en ni-felts kryssmatrise, som vist i Figur 7. Matrisen gir et øyeblikksbilde av populasjonens sammensetning langs de to dimensjonene og danner inngangsdataene for regelmotoren i avsnitt 6.5. Fullstendige celleanntall er gjengitt i Figur 7; univariate XYZ-fordelingar presenteres i Tabell 9 i kapittel 7.</w:t>
+        <w:t>ABC- og XYZ-klassifiseringene ble kombinert til en ni-felts kryssmatrise, som vist i Figur 7. Matrisen gir et øyeblikksbilde av populasjonens sammensetning langs de to dimensjonene og danner inngangsdataene for regelmotoren i avsnitt 6.5. Fullstendige celleantall er gjengitt i Figur 7; univariate XYZ-fordelinger presenteres i Tabell 9 i kapittel 7.</w:t>
       </w:r>
     </w:p>
     <w:p>
@@ -16939,7 +16954,7 @@
           <w:rFonts w:ascii="Times New Roman" w:hAnsi="Times New Roman" w:cs="Times New Roman"/>
           <w:sz w:val="24"/>
         </w:rPr>
-        <w:t xml:space="preserve"> ble beregnet per artikkel. Fordelingen av dette avviket er illustrert i Figur 7 nedenfor. Terskelen </w:t>
+        <w:t xml:space="preserve"> ble beregnet per artikkel. Fordelingen av dette avviket er illustrert i Figur 8 nedenfor. Terskelen </w:t>
       </w:r>
       <m:oMath>
         <m:sSub>
@@ -17427,34 +17442,7 @@
           <w:rFonts w:ascii="Times New Roman" w:hAnsi="Times New Roman" w:cs="Times New Roman"/>
           <w:sz w:val="24"/>
         </w:rPr>
-        <w:t xml:space="preserve"> Etter at KMeans-modellen var fittet på treningsdataene, ble samtlige 487 artikler med tilstrekkelig data predikert til én av de tre klyngene. Klyngene ble karakterisert langs de tre featuredimensjonene, og én klynge ble identifisert som K\_OVERFØR basert på kombinasjonen av lav CV (stabilt forbruksmønster), relativt høy artikkelverdi og høyt positivt </w:t>
-      </w:r>
-      <m:oMath>
-        <m:d>
-          <m:dPr>
-            <m:begChr m:val="|"/>
-            <m:sepChr m:val=""/>
-            <m:endChr m:val="|"/>
-          </m:dPr>
-          <m:e>
-            <m:r>
-              <m:t>Δ</m:t>
-            </m:r>
-            <m:r>
-              <m:t>T</m:t>
-            </m:r>
-            <m:r>
-              <m:t>C</m:t>
-            </m:r>
-          </m:e>
-        </m:d>
-      </m:oMath>
-      <w:r>
-        <w:rPr>
-          <w:rFonts w:ascii="Times New Roman" w:hAnsi="Times New Roman" w:cs="Times New Roman"/>
-          <w:sz w:val="24"/>
-        </w:rPr>
-        <w:t xml:space="preserve"> (mange unødvendige ordrer). Figur 9 visualiserer klyngestrukturen i et to-dimensjonalt projeksjon langs de to mest informative featurene.</w:t>
+        <w:t xml:space="preserve"> Etter at KMeans-modellen var fittet på treningsdataene, ble samtlige 487 artikler med tilstrekkelig data predikert til én av de tre klyngene. Klyngene ble karakterisert langs de tre featuredimensjonene, og én klynge ble identifisert som K\_OVERFØR basert på lavest gjennomsnittlig CV (stabilt forbruksmønster) og høyest gjennomsnittlig artikkelverdi. Figur 10 visualiserer klyngestrukturen i en todimensjonal projeksjon langs de to mest informative featurene.</w:t>
       </w:r>
     </w:p>
     <w:p>
@@ -17905,7 +17893,7 @@
           <w:rFonts w:ascii="Times New Roman" w:hAnsi="Times New Roman" w:cs="Times New Roman"/>
           <w:sz w:val="24"/>
         </w:rPr>
-        <w:t>Figur 12 viser at 145 artikler (20,5 % av populasjonen) anbefales overført til HVFS, mens 257 artikler (36,2 %) beholdes lokalt basert på Z-klasse eller CY-kombinasjon. Kategorien VURDER NÆRMERE er den største enkeltgruppen med 284 artikler (40,1 %), noe som reflekterer at mange artikler har en profil der de ulike analysene ikke gir entydige signaler. Dette er et forventet utfall gitt at regelmotoren er utformet for å unngå feilaktige overføringsanbefalinger: usikre tilfeller sendes til manuell vurdering fremfor å tvinges inn i en binær beslutning. Fordelingen av anbefalinger per regel er som følger: R1 (Z-override) fanget 144 artikler, R2 (CY) fanget 113, R3 (A/B + X + FOR\_MANGE) fanget 91, R4 (A/B + X + K\_OVERFØR) fanget 26, R5 (A/B + Y + K\_OVERFØR) fanget 28, og R6–R8 sendte de resterende 284 artiklene til manuell vurdering. At VURDER\_NÆRMERE er den største enkeltgruppen er et bevisst designvalg: regelmotoren er utformet for høy presisjon i OVERFØR-anbefalingene, og aksepterer at dette medfører en større andel artikler som krever manuell gjennomgang. Fullstendige resultat- og besparelsestabeller presenteres i kapittel 7.</w:t>
+        <w:t>Figur 12 viser at 145 artikler (20,5 % av populasjonen) anbefales overført til HVFS, mens 257 artikler (36,2 %) beholdes lokalt basert på Z-klasse eller CY-kombinasjon. Kategorien VURDER NÆRMERE er den største enkeltgruppen med 284 artikler (40,1 %), noe som reflekterer at mange artikler har en profil der de ulike analysene ikke gir entydige signaler. Dette er et forventet utfall gitt at regelmotoren er utformet for å unngå feilaktige overføringsanbefalinger: usikre tilfeller sendes til manuell vurdering fremfor å tvinges inn i en binær beslutning. Fordelingen av anbefalinger per regel er som følger: R1 (Z-override) fanget 143 artikler, R2 (CY) fanget 114, R3 (A/B + X + FOR\_MANGE) fanget 71, R4 (A/B + X + K\_OVERFØR) fanget 18, R5 (A/B + Y + K\_OVERFØR) fanget 56, og R6–R8 sendte de resterende 284 artiklene til manuell vurdering. At VURDER\_NÆRMERE er den største enkeltgruppen er et bevisst designvalg: regelmotoren er utformet for høy presisjon i OVERFØR-anbefalingene, og aksepterer at dette medfører en større andel artikler som krever manuell gjennomgang. Fullstendige resultat- og besparelsestabeller presenteres i kapittel 7.</w:t>
       </w:r>
     </w:p>
     <w:p>
@@ -18780,7 +18768,7 @@
           <w:rFonts w:ascii="Times New Roman" w:hAnsi="Times New Roman" w:cs="Times New Roman"/>
           <w:sz w:val="24"/>
         </w:rPr>
-        <w:t>Sammenligningen med SAP-feltet ZZXYZ viste 33 % samsvar mellom systemregistrert og beregnet klasse (125 av 375 artikler med data i begge kilder). Valideringen er begrenset til de 375 artiklene der ZZXYZ-feltet er utfylt i MDMA; for de øvrige 334 artiklene mangler systemklassifisering. Tabell 10 oppsummerer kryssvalideringen. Det lave samsvaret på 33 % understreker at SAP-feltets ZZXYZ ikke er systematisk oppdatert og bør erstattes med beregnet CV-klasse som primær XYZ-indikator. ABC/XYZ-kryssmatrisen er presentert som Figur 7 i kapittel 6; fullstendige celleanntall er gjengitt der.</w:t>
+        <w:t>Sammenligningen med SAP-feltet ZZXYZ viste 33 % samsvar mellom systemregistrert og beregnet klasse (125 av 375 artikler med data i begge kilder). Valideringen er begrenset til de 375 artiklene der ZZXYZ-feltet er utfylt i MDMA; for de øvrige 334 artiklene mangler systemklassifisering. Tabell 10 oppsummerer kryssvalideringen. Det lave samsvaret på 33 % understreker at SAP-feltets ZZXYZ ikke er systematisk oppdatert og bør erstattes med beregnet CV-klasse som primær XYZ-indikator. ABC/XYZ-kryssmatrisen er presentert som Figur 7 i kapittel 6; fullstendige celleantall er gjengitt der.</w:t>
       </w:r>
     </w:p>
     <w:tbl>
@@ -19681,7 +19669,7 @@
           <w:rFonts w:ascii="Times New Roman" w:hAnsi="Times New Roman" w:cs="Times New Roman"/>
           <w:sz w:val="24"/>
         </w:rPr>
-        <w:t xml:space="preserve">Av de 487 artiklene med tilstrekkelig data for EOQ-beregning har 356 artikler (73,1 %) en faktisk ordrefrekvens som overskrider EOQ-optimal frekvens med mer enn 50 %, og er klassifisert som FOR\_MANGE\_ORDRER. 100 artikler (20,5 %) opererer innenfor akseptabelt avvik (OK), og 31 artikler (6,4 %) bestiller sjeldnere enn EOQ-optimalt (FOR\_FÅ\_ORDRER). Den høye andelen FOR\_MANGE\_ORDRER indikerer at den eksisterende bestillingspraksisen ved LGORT 3001 er systematisk suboptimal — artiklene bestilles i for små kvanta og for ofte i forhold til hva Wilson-modellen tilsier med de gitte parameterne </w:t>
+        <w:t xml:space="preserve">Av de 487 artiklene med tilstrekkelig data for EOQ-beregning har 356 artikler (73,1 %) en faktisk ordrefrekvens som overskrider EOQ-optimal frekvens med mer enn 150 %, og er klassifisert som FOR\_MANGE\_ORDRER. 100 artikler (20,5 %) opererer innenfor akseptabelt avvik (OK), og 31 artikler (6,4 %) bestiller sjeldnere enn EOQ-optimalt (FOR\_FÅ\_ORDRER). Den høye andelen FOR\_MANGE\_ORDRER indikerer at den eksisterende bestillingspraksisen ved LGORT 3001 er systematisk suboptimal — artiklene bestilles i for små kvanta og for ofte i forhold til hva Wilson-modellen tilsier med de gitte parameterne </w:t>
       </w:r>
       <m:oMath>
         <m:r>
@@ -19717,7 +19705,7 @@
           <w:rFonts w:ascii="Times New Roman" w:hAnsi="Times New Roman" w:cs="Times New Roman"/>
           <w:sz w:val="24"/>
         </w:rPr>
-        <w:t xml:space="preserve">Det samlede teoretiske totalkostnavviket </w:t>
+        <w:t xml:space="preserve">Det samlede teoretiske totalkostnadsavviket </w:t>
       </w:r>
       <m:oMath>
         <m:r>
@@ -19741,7 +19729,7 @@
           <w:rFonts w:ascii="Times New Roman" w:hAnsi="Times New Roman" w:cs="Times New Roman"/>
           <w:sz w:val="24"/>
         </w:rPr>
-        <w:t xml:space="preserve"> for alle 487 artikler er kr 2 333 441 per år. Dette representerer det totale kostnadsoverskuddet som genereres av at faktisk ordrepraksis avviker fra EOQ-optimal; det er ikke direkte det samme som det realisable besparelsespotensialet, da kun artikler i OVERFØR\_HVFS-kategorien inngår i besparelsesberegningen (se avsnitt 7.6). Fordelingen av FREQ\_AVVIK er illustrert i Figur 8 i kapittel 6.</w:t>
+        <w:t xml:space="preserve"> for alle 487 artikler er kr 2 333 441 per år. Dette representerer det totale kostnadsoverskuddet som genereres av at faktisk ordrepraksis avviker fra EOQ-optimal; det er ikke direkte det samme som det realiserbare besparelsespotensialet, da kun artikler i OVERFØR\_HVFS-kategorien inngår i besparelsesberegningen (se avsnitt 7.6). Fordelingen av FREQ\_AVVIK er illustrert i Figur 8 i kapittel 6.</w:t>
       </w:r>
     </w:p>
     <w:p>
@@ -22357,7 +22345,7 @@
           <w:rFonts w:ascii="Times New Roman" w:hAnsi="Times New Roman" w:cs="Times New Roman"/>
           <w:sz w:val="24"/>
         </w:rPr>
-        <w:t xml:space="preserve">) gir kr 602 020. Disse estimatene er forankret i 117 artikler som oppfyller begge kriteriene OVERFØR\_HVFS og FOR\_MANGE\_ORDRER, og der det samlede teoretiske totalkostnavviket er kr 602 020 per år. Sensitivitetsanalysen over 27 parameterkombinasjoner — med variasjon i S, h og </w:t>
+        <w:t xml:space="preserve">) gir kr 602 020. Disse estimatene er forankret i 117 artikler som oppfyller begge kriteriene OVERFØR\_HVFS og FOR\_MANGE\_ORDRER, og der det samlede teoretiske totalkostnadsavviket er kr 602 020 per år. Sensitivitetsanalysen over 27 parameterkombinasjoner — med variasjon i S, h og </w:t>
       </w:r>
       <m:oMath>
         <m:sSub>
@@ -24354,7 +24342,7 @@
                 <w:rFonts w:ascii="Times New Roman" w:hAnsi="Times New Roman"/>
                 <w:sz w:val="22"/>
               </w:rPr>
-              <w:t>Vareguppebeskrivelse</w:t>
+              <w:t>Varegruppebeskrivelse</w:t>
             </w:r>
           </w:p>
         </w:tc>

</xml_diff>

<commit_message>
Legg til avsnitt om Midtøsten-forsyningssituasjon i diskusjonen (8.3)
Co-Authored-By: Claude Opus 4.6 (1M context) <noreply@anthropic.com>
</commit_message>
<xml_diff>
--- a/005 report/LOG650_Rapport_v5.docx
+++ b/005 report/LOG650_Rapport_v5.docx
@@ -22504,6 +22504,18 @@
           <w:sz w:val="24"/>
         </w:rPr>
         <w:t>For LIBRA-prosjektet spesifikt innebærer resultatene at det nå foreligger et kvantitativt, reproduserbart beslutningsgrunnlag som kan integreres i den regionale utrullingen av sentralisert forsyning. Rammeverket kan brukes som mal for tilsvarende analyser ved de øvrige helseforetakene (Helse Stavanger, Helse Fonna, Helse Førde) etter hvert som de kobles på HVFS via SAP S/4HANA. Dersom LIBRA velger å implementere periodisk reklassifisering – for eksempel årlig – vil analysescriptet kunne kjøres på oppdaterte data uten metodisk tilpasning, noe som gir HVFS et verktøy for kontinuerlig porteføljeoptimalisering.</w:t>
+      </w:r>
+    </w:p>
+    <w:p>
+      <w:pPr>
+        <w:spacing w:line="360" w:lineRule="auto"/>
+      </w:pPr>
+      <w:r>
+        <w:rPr>
+          <w:rFonts w:ascii="Times New Roman" w:hAnsi="Times New Roman" w:cs="Times New Roman"/>
+          <w:sz w:val="24"/>
+        </w:rPr>
+        <w:t>Den geopolitiske situasjonen i Midtøsten i første kvartal 2026 understreker den praktiske relevansen av et slikt verktøy. Usikkerhet knyttet til Hormuzstredet, omdirigering av skipstrafikk via Afrika og cyberangrep mot leverandører som Stryker og Intuitive har økt risikoen for lengre ledetider og forstyrrelser i forsyningskjeden for medisinsk utstyr. Selv om HVFS per mars 2026 har om lag tre måneders dekning på normalforbruk og det ikke foreligger noen akutt forsyningskrise, illustrerer situasjonen behovet for proaktiv klassifisering som raskt kan identifisere hvilke artikler som bør prioriteres ved behov for økt sikkerhetslager. Periodisk reklassifisering med oppdaterte transaksjonsdata vil fange opp endringer i forbruksmønster og ledetider som oppstår som følge av slike ytre forstyrrelser.</w:t>
       </w:r>
     </w:p>
     <w:p>

</xml_diff>

<commit_message>
Forkort seksjon 4.5 Bruk av KI-verktøy, henvis til Vedlegg C
Co-Authored-By: Claude Opus 4.6 (1M context) <noreply@anthropic.com>
</commit_message>
<xml_diff>
--- a/005 report/LOG650_Rapport_v5.docx
+++ b/005 report/LOG650_Rapport_v5.docx
@@ -12641,19 +12641,7 @@
           <w:rFonts w:ascii="Times New Roman" w:hAnsi="Times New Roman" w:cs="Times New Roman"/>
           <w:sz w:val="24"/>
         </w:rPr>
-        <w:t>Kunstig intelligens i form av store språkmodeller ble benyttet som faglig støtteverktøy gjennom hele prosjektperioden, i tråd med retningslinjene i kursets skrivekompendium (Rekdal &amp; Pettersen, 2025). Claude (Anthropic, 2026) ble anvendt til tre konkrete formål: (1) kodestøtte og feilsøking i Python-scriptet for ABC-, XYZ-, EOQ- og K-means-analysen; (2) generering av alle datavisualiseringer — Pareto-kurve, kryssmatrise, EOQ-avviksplott, silhouette-profil, scatterplott og regelmotor-fordeling — på grunnlag av analyseresultater produsert av scriptet; og (3) strukturering og språklig bearbeiding av rapportteksten. Alle figurer generert med støtte fra Claude er merket «Generert med støtte fra Claude (Anthropic, 2026)» i bildeteksten.</w:t>
-      </w:r>
-    </w:p>
-    <w:p>
-      <w:pPr>
-        <w:spacing w:line="360" w:lineRule="auto"/>
-      </w:pPr>
-      <w:r>
-        <w:rPr>
-          <w:rFonts w:ascii="Times New Roman" w:hAnsi="Times New Roman" w:cs="Times New Roman"/>
-          <w:sz w:val="24"/>
-        </w:rPr>
-        <w:t>Claude ble ikke brukt som fagkilde og er ikke sitert som belegg for faglige påstander. Alle numeriske resultater, tabellverdier og analytiske konklusjoner er produsert av Python-scriptet fra SAP-kildedata og er uavhengige av KI-verktøyet. Rådata fra SAP ble ikke modifisert i noen fase av arbeidet; alle transformasjoner er dokumentert i D-01–D-08 (avsnitt 4.3) og implementert deterministisk i scriptet.</w:t>
+        <w:t>Kunstig intelligens i form av store språkmodeller ble benyttet som faglig støtteverktøy gjennom hele prosjektperioden, i tråd med retningslinjene i kursets skrivekompendium (Rekdal &amp; Pettersen, 2025). Claude (Anthropic, 2026) ble anvendt til kodestøtte, generering av datavisualiseringer og språklig bearbeiding av rapportteksten. KI-verktøyet er ikke brukt som fagkilde og er ikke sitert som belegg for faglige påstander. Detaljert beskrivelse av bruken finnes i Vedlegg C.</w:t>
       </w:r>
     </w:p>
     <w:p>

</xml_diff>

<commit_message>
Rett figurnummerering: Figur 3–5 vises nå i sekvensiell rekkefølge
Co-Authored-By: Claude Opus 4.6 (1M context) <noreply@anthropic.com>
</commit_message>
<xml_diff>
--- a/005 report/LOG650_Rapport_v5.docx
+++ b/005 report/LOG650_Rapport_v5.docx
@@ -6443,7 +6443,7 @@
           <w:rFonts w:ascii="Times New Roman" w:hAnsi="Times New Roman" w:cs="Times New Roman"/>
           <w:sz w:val="24"/>
         </w:rPr>
-        <w:t>Figur 3. Analysepipeline: fra SAP-rådata til HVFS-anbefaling</w:t>
+        <w:t>Figur 3. Dataoversikt: fordeling av nøkkelvariabler for 709 artikler</w:t>
       </w:r>
     </w:p>
     <w:p>
@@ -6455,7 +6455,7 @@
           <w:rFonts w:ascii="Times New Roman" w:hAnsi="Times New Roman" w:cs="Times New Roman"/>
           <w:sz w:val="24"/>
         </w:rPr>
-        <w:t>Figur 4. Regelmotor: sekvensiell beslutningsflyt for HVFS-anbefaling (R1–R8)</w:t>
+        <w:t>Figur 4. Analysepipeline: fra SAP-rådata til HVFS-anbefaling</w:t>
       </w:r>
     </w:p>
     <w:p>
@@ -6467,7 +6467,7 @@
           <w:rFonts w:ascii="Times New Roman" w:hAnsi="Times New Roman" w:cs="Times New Roman"/>
           <w:sz w:val="24"/>
         </w:rPr>
-        <w:t>Figur 5. Dataoversikt: fordeling av nøkkelvariabler for 709 artikler</w:t>
+        <w:t>Figur 5. Regelmotor: sekvensiell beslutningsflyt for HVFS-anbefaling (R1–R8)</w:t>
       </w:r>
     </w:p>
     <w:p>
@@ -10660,7 +10660,7 @@
           <w:rFonts w:ascii="Times New Roman" w:hAnsi="Times New Roman" w:cs="Times New Roman"/>
           <w:sz w:val="24"/>
         </w:rPr>
-        <w:t>Datapipelinen fra råuttrekk til analyseresultat er illustrert i Figur 3. En sentral datakvalitetsutfordring er at enhetspris i MBEW (feltet STPRS) ikke er per stykk, men per prisenhet (PEINH), som ofte er 10 eller 100 for medisinsk forbruksmateriell. Korrekt enhetspris beregnes derfor som STPRS ÷ PEINH. I tillegg mangler 204 artikler innkjøpsdata fra EKPO i analyseperioden, noe som nødvendiggjør en alternativ verdiberegning basert på annualisert forbruk og enhetspris. Disse og øvrige datakvalitetsbeslutninger er dokumentert i kapittel 4.</w:t>
+        <w:t>Datapipelinen fra råuttrekk til analyseresultat er illustrert i Figur 4. En sentral datakvalitetsutfordring er at enhetspris i MBEW (feltet STPRS) ikke er per stykk, men per prisenhet (PEINH), som ofte er 10 eller 100 for medisinsk forbruksmateriell. Korrekt enhetspris beregnes derfor som STPRS ÷ PEINH. I tillegg mangler 204 artikler innkjøpsdata fra EKPO i analyseperioden, noe som nødvendiggjør en alternativ verdiberegning basert på annualisert forbruk og enhetspris. Disse og øvrige datakvalitetsbeslutninger er dokumentert i kapittel 4.</w:t>
       </w:r>
     </w:p>
     <w:p>
@@ -11779,7 +11779,7 @@
           <w:rFonts w:ascii="Times New Roman" w:hAnsi="Times New Roman" w:cs="Times New Roman"/>
           <w:sz w:val="24"/>
         </w:rPr>
-        <w:t>Råuttrekket inneholder 1 006 unike artikkelnumre. Populasjonsavgrensningen beskrives i detalj i avsnitt 4.3 nedenfor, og reduserer dette til 709 aktive artikler. For forbruksdata er det benyttet bevegelsestyper (BWART) 201 og 647 fra MSEG, som representerer henholdsvis vareforbruk til kostnadssted og spesialforbruk. Disse to bevegelsesstypene fanger det reelle forbruket ut fra lager og utelukker interne overføringer og returer som ville ha forvrengt etterspørselsestimatet. Innkjøpsdata er hentet fra EKKO/EKPO/EKBE, som gir faktiske ordrelinjer og varemottak; disse benyttes for ABC-verdiberegning og for estimering av faktisk ordrefrekvens. Leveringstidsdata er hentet fra EINE (feltet WETAG), men dekker kun 6 % av artiklene; se beslutning D-05 under. Figur 5 gir en samlet oversikt over fordelingen av nøkkelvariabler i det endelige datasettet på 709 artikler.</w:t>
+        <w:t>Råuttrekket inneholder 1 006 unike artikkelnumre. Populasjonsavgrensningen beskrives i detalj i avsnitt 4.3 nedenfor, og reduserer dette til 709 aktive artikler. For forbruksdata er det benyttet bevegelsestyper (BWART) 201 og 647 fra MSEG, som representerer henholdsvis vareforbruk til kostnadssted og spesialforbruk. Disse to bevegelsesstypene fanger det reelle forbruket ut fra lager og utelukker interne overføringer og returer som ville ha forvrengt etterspørselsestimatet. Innkjøpsdata er hentet fra EKKO/EKPO/EKBE, som gir faktiske ordrelinjer og varemottak; disse benyttes for ABC-verdiberegning og for estimering av faktisk ordrefrekvens. Leveringstidsdata er hentet fra EINE (feltet WETAG), men dekker kun 6 % av artiklene; se beslutning D-05 under. Figur 3 gir en samlet oversikt over fordelingen av nøkkelvariabler i det endelige datasettet på 709 artikler.</w:t>
       </w:r>
     </w:p>
     <w:p>
@@ -11828,7 +11828,7 @@
           <w:i/>
           <w:sz w:val="20"/>
         </w:rPr>
-        <w:t>Figur 5. Dataoversikt: fordeling av nøkkelvariabler for 709 artikler ved WERKS 3300, LGORT 3001. Generert med støtte fra Claude (Anthropic, 2026).</w:t>
+        <w:t>Figur 3. Dataoversikt: fordeling av nøkkelvariabler for 709 artikler ved WERKS 3300, LGORT 3001. Generert med støtte fra Claude (Anthropic, 2026).</w:t>
       </w:r>
     </w:p>
     <w:p>
@@ -12543,7 +12543,7 @@
           <w:i/>
           <w:sz w:val="20"/>
         </w:rPr>
-        <w:t>Figur 3. Analysepipeline: fra SAP-rådata til HVFS-anbefaling. Generert med støtte fra Claude (Anthropic, 2026).</w:t>
+        <w:t>Figur 4. Analysepipeline: fra SAP-rådata til HVFS-anbefaling. Generert med støtte fra Claude (Anthropic, 2026).</w:t>
       </w:r>
     </w:p>
     <w:p>
@@ -16427,7 +16427,7 @@
           <w:i/>
           <w:sz w:val="20"/>
         </w:rPr>
-        <w:t>Figur 4. Regelmotor: sekvensiell beslutningsflyt for HVFS-anbefaling (R1–R8). Generert med støtte fra Claude (Anthropic, 2026).</w:t>
+        <w:t>Figur 5. Regelmotor: sekvensiell beslutningsflyt for HVFS-anbefaling (R1–R8). Generert med støtte fra Claude (Anthropic, 2026).</w:t>
       </w:r>
     </w:p>
     <w:p>

</xml_diff>

<commit_message>
Oppdater Word-dokument etter lokal gjennomgang
Co-Authored-By: Claude Opus 4.6 (1M context) <noreply@anthropic.com>
</commit_message>
<xml_diff>
--- a/005 report/LOG650_Rapport_v5.docx
+++ b/005 report/LOG650_Rapport_v5.docx
@@ -7436,6 +7436,16 @@
         <w:t>Tabell 1 gir en samlet oversikt over de sentrale kildene i litteraturgjennomgangen, organisert etter hovedtema og med kopling til denne oppgavens problemstilling.</w:t>
       </w:r>
     </w:p>
+    <w:p>
+      <w:r>
+        <w:rPr>
+          <w:rFonts w:ascii="Times New Roman" w:hAnsi="Times New Roman"/>
+          <w:i/>
+          <w:sz w:val="20"/>
+        </w:rPr>
+        <w:t>Tabell 1. Litteraturoversikt: sentrale kilder med tema og relevans for oppgaven.</w:t>
+      </w:r>
+    </w:p>
     <w:tbl>
       <w:tblPr>
         <w:tblW w:type="auto" w:w="0"/>
@@ -8974,16 +8984,6 @@
       </w:tr>
     </w:tbl>
     <w:p>
-      <w:r>
-        <w:rPr>
-          <w:rFonts w:ascii="Times New Roman" w:hAnsi="Times New Roman"/>
-          <w:i/>
-          <w:sz w:val="20"/>
-        </w:rPr>
-        <w:t>Tabell 1. Litteraturoversikt: sentrale kilder med tema og relevans for oppgaven.</w:t>
-      </w:r>
-    </w:p>
-    <w:p>
       <w:pPr>
         <w:pStyle w:val="Overskrift2"/>
       </w:pPr>
@@ -9253,6 +9253,16 @@
           <w:sz w:val="24"/>
         </w:rPr>
         <w:t>Tabell 2 oppsummerer styrker, svakheter og forutsetninger for de fire analysemetodene som benyttes i denne oppgaven.</w:t>
+      </w:r>
+    </w:p>
+    <w:p>
+      <w:r>
+        <w:rPr>
+          <w:rFonts w:ascii="Times New Roman" w:hAnsi="Times New Roman"/>
+          <w:i/>
+          <w:sz w:val="20"/>
+        </w:rPr>
+        <w:t>Tabell 2. Sammenligning av analysemetoder brukt i oppgaven.</w:t>
       </w:r>
     </w:p>
     <w:tbl>
@@ -9697,16 +9707,6 @@
         </w:tc>
       </w:tr>
     </w:tbl>
-    <w:p>
-      <w:r>
-        <w:rPr>
-          <w:rFonts w:ascii="Times New Roman" w:hAnsi="Times New Roman"/>
-          <w:i/>
-          <w:sz w:val="20"/>
-        </w:rPr>
-        <w:t>Tabell 2. Sammenligning av analysemetoder brukt i oppgaven.</w:t>
-      </w:r>
-    </w:p>
     <w:p>
       <w:pPr>
         <w:pStyle w:val="Overskrift2"/>
@@ -9889,6 +9889,16 @@
         <w:t>Helse Bergen er i SAP S/4HANA registrert under anleggskode (WERKS) 3300. Det operative forsyningslageret for medisinsk forbruksmateriell er tilordnet lagersted (LGORT) 3001 under dette anlegget. Lageret håndterer anskaffelse, mottak, lagring og distribusjon av forbruksartikler til kliniske avdelinger. Innkjøp gjennomføres via innkjøpsgruppe 300 og 3000 i SAP, med bestillingstype ZNB som er Helse Bergens lokale bestillingstype for forsyningslageret. Alle varebevegelser — forbruk ut til avdeling (BWART 201 og 647) og varemottak inn fra leverandør (BWART 101) — er registrert som transaksjonsdata i SAP og utgjør det primære datagrunnlaget for denne oppgaven. Foretakets organisasjonsmessige plassering i Helse Vest og SAP-strukturen er illustrert i Figur 2. Tabell 3 oppsummerer nøkkeltallene for casevirksomheten.</w:t>
       </w:r>
     </w:p>
+    <w:p>
+      <w:r>
+        <w:rPr>
+          <w:rFonts w:ascii="Times New Roman" w:hAnsi="Times New Roman"/>
+          <w:i/>
+          <w:sz w:val="20"/>
+        </w:rPr>
+        <w:t>Tabell 3. Nøkkeltall for casevirksomheten Helse Bergen, WERKS 3300.</w:t>
+      </w:r>
+    </w:p>
     <w:tbl>
       <w:tblPr>
         <w:tblW w:type="auto" w:w="0"/>
@@ -10494,16 +10504,6 @@
         </w:tc>
       </w:tr>
     </w:tbl>
-    <w:p>
-      <w:r>
-        <w:rPr>
-          <w:rFonts w:ascii="Times New Roman" w:hAnsi="Times New Roman"/>
-          <w:i/>
-          <w:sz w:val="20"/>
-        </w:rPr>
-        <w:t>Tabell 3. Nøkkeltall for casevirksomheten Helse Bergen, WERKS 3300.</w:t>
-      </w:r>
-    </w:p>
     <w:p>
       <w:r>
         <w:drawing>
@@ -10781,6 +10781,16 @@
         <w:t>Alle data er hentet fra SAP S/4HANA via transaksjonen SE16H, som gir direkte lesetilgang til databasetabeller uten å gjøre endringer i systemet. Uttrekket er begrenset til WERKS 3300 og LGORT 3001, og dekker en analyseperiode på 24 måneder (januar 2024 til desember 2025). Perioden er valgt fordi den er lang nok til å fange sesongvariasjon og irregulære hendelser i forbruksmønsteret, uten å inkludere data fra perioder med vesentlig annerledes driftsforhold. Tabellen nedenfor gir en oversikt over de 14 SAP-tabellene som inngår i grunnlaget.</w:t>
       </w:r>
     </w:p>
+    <w:p>
+      <w:r>
+        <w:rPr>
+          <w:rFonts w:ascii="Times New Roman" w:hAnsi="Times New Roman"/>
+          <w:i/>
+          <w:sz w:val="20"/>
+        </w:rPr>
+        <w:t>Tabell 4. Datagrunnlag: 14 SAP S/4HANA-tabeller hentet via SE16H, analyseperiode 2024–2025, WERKS 3300 / LGORT 3001.</w:t>
+      </w:r>
+    </w:p>
     <w:tbl>
       <w:tblPr>
         <w:tblW w:type="auto" w:w="0"/>
@@ -11760,16 +11770,6 @@
         </w:tc>
       </w:tr>
     </w:tbl>
-    <w:p>
-      <w:r>
-        <w:rPr>
-          <w:rFonts w:ascii="Times New Roman" w:hAnsi="Times New Roman"/>
-          <w:i/>
-          <w:sz w:val="20"/>
-        </w:rPr>
-        <w:t>Tabell 4. Datagrunnlag: 14 SAP S/4HANA-tabeller hentet via SE16H, analyseperiode 2024–2025, WERKS 3300 / LGORT 3001.</w:t>
-      </w:r>
-    </w:p>
     <w:p>
       <w:pPr>
         <w:spacing w:line="360" w:lineRule="auto"/>
@@ -11856,6 +11856,16 @@
         <w:t>All dataforbehandling er gjennomført i Python 3.13 ved hjelp av bibliotekene pandas (McKinney, 2010) og scikit-learn (Pedregosa et al., 2011). Scriptet er deterministisk og reproduserbart: alle tilfeldige prosesser bruker random_state=42, og ingen manuell redigering av enkeltartikler er foretatt. Åtte eksplisitte datavalgsbeslutninger (D-01–D-08) er dokumentert nedenfor; disse tilsvarer steder i datapipelinen der analytikeren måtte treffe et valg mellom alternative behandlingsmåter, og der valget har materiell innvirkning på resultatene.</w:t>
       </w:r>
     </w:p>
+    <w:p>
+      <w:r>
+        <w:rPr>
+          <w:rFonts w:ascii="Times New Roman" w:hAnsi="Times New Roman"/>
+          <w:i/>
+          <w:sz w:val="20"/>
+        </w:rPr>
+        <w:t>Tabell 5. Datavalgsbeslutninger D-01–D-08 med begrunnelse.</w:t>
+      </w:r>
+    </w:p>
     <w:tbl>
       <w:tblPr>
         <w:tblW w:type="auto" w:w="0"/>
@@ -12463,16 +12473,6 @@
         </w:tc>
       </w:tr>
     </w:tbl>
-    <w:p>
-      <w:r>
-        <w:rPr>
-          <w:rFonts w:ascii="Times New Roman" w:hAnsi="Times New Roman"/>
-          <w:i/>
-          <w:sz w:val="20"/>
-        </w:rPr>
-        <w:t>Tabell 5. Datavalgsbeslutninger D-01–D-08 med begrunnelse.</w:t>
-      </w:r>
-    </w:p>
     <w:p>
       <w:pPr>
         <w:spacing w:line="360" w:lineRule="auto"/>
@@ -13122,6 +13122,16 @@
         <w:t>Klassifiseringsgrensene er satt i henhold til standard ABC-litteratur (Silaen et al., 2023):</w:t>
       </w:r>
     </w:p>
+    <w:p>
+      <w:r>
+        <w:rPr>
+          <w:rFonts w:ascii="Times New Roman" w:hAnsi="Times New Roman"/>
+          <w:i/>
+          <w:sz w:val="20"/>
+        </w:rPr>
+        <w:t>Tabell 6. Modellparametere: ABC-klassifiseringsgrenser og øvrige analyseinnstillinger.</w:t>
+      </w:r>
+    </w:p>
     <w:tbl>
       <w:tblPr>
         <w:tblW w:type="auto" w:w="0"/>
@@ -13821,16 +13831,6 @@
         </w:tc>
       </w:tr>
     </w:tbl>
-    <w:p>
-      <w:r>
-        <w:rPr>
-          <w:rFonts w:ascii="Times New Roman" w:hAnsi="Times New Roman"/>
-          <w:i/>
-          <w:sz w:val="20"/>
-        </w:rPr>
-        <w:t>Tabell 6. Modellparametere: ABC-klassifiseringsgrenser og øvrige analyseinnstillinger.</w:t>
-      </w:r>
-    </w:p>
     <w:p>
       <w:pPr>
         <w:spacing w:line="360" w:lineRule="auto"/>
@@ -15740,6 +15740,16 @@
         <w:t>Regelmotoren kombinerer utfallene fra de fire foregående modellene – ABC-klasse, XYZ-klasse, EOQ-avviksstatus og K-means klyngetilhørighet – og produserer en anbefaling per artikkel. Reglene anvender en sekvensiell prioritet: artikkelen evalueres mot reglene i nummerert rekkefølge, og den første regelen som gir treff bestemmer utfallet. Dette forhindrer at en artikkel oppfyller kriteriene for flere kategorier.</w:t>
       </w:r>
     </w:p>
+    <w:p>
+      <w:r>
+        <w:rPr>
+          <w:rFonts w:ascii="Times New Roman" w:hAnsi="Times New Roman"/>
+          <w:i/>
+          <w:sz w:val="20"/>
+        </w:rPr>
+        <w:t>Tabell 7. Regelmotor: 8 beslutningsregler i prioritert rekkefølge.</w:t>
+      </w:r>
+    </w:p>
     <w:tbl>
       <w:tblPr>
         <w:tblW w:type="auto" w:w="0"/>
@@ -16347,16 +16357,6 @@
         </w:tc>
       </w:tr>
     </w:tbl>
-    <w:p>
-      <w:r>
-        <w:rPr>
-          <w:rFonts w:ascii="Times New Roman" w:hAnsi="Times New Roman"/>
-          <w:i/>
-          <w:sz w:val="20"/>
-        </w:rPr>
-        <w:t>Tabell 7. Regelmotor: 8 beslutningsregler i prioritert rekkefølge.</w:t>
-      </w:r>
-    </w:p>
     <w:p>
       <w:pPr>
         <w:spacing w:line="360" w:lineRule="auto"/>
@@ -17549,7 +17549,7 @@
       </w:r>
       <m:oMath>
         <m:r>
-          <m:t>n=n=389</m:t>
+          <m:t>n=389</m:t>
         </m:r>
       </m:oMath>
       <w:r>
@@ -17561,7 +17561,7 @@
       </w:r>
       <m:oMath>
         <m:r>
-          <m:t>n=n=98</m:t>
+          <m:t>n=98</m:t>
         </m:r>
       </m:oMath>
       <w:r>
@@ -17707,7 +17707,7 @@
       </w:r>
       <m:oMath>
         <m:r>
-          <m:t>n=n=98</m:t>
+          <m:t>n=98</m:t>
         </m:r>
       </m:oMath>
       <w:r>
@@ -17861,7 +17861,7 @@
       </w:r>
       <m:oMath>
         <m:r>
-          <m:t>n=n=281</m:t>
+          <m:t>n=281</m:t>
         </m:r>
       </m:oMath>
       <w:r>
@@ -17873,7 +17873,7 @@
       </w:r>
       <m:oMath>
         <m:r>
-          <m:t>n=n=175</m:t>
+          <m:t>n=175</m:t>
         </m:r>
       </m:oMath>
       <w:r>
@@ -17885,7 +17885,7 @@
       </w:r>
       <m:oMath>
         <m:r>
-          <m:t>n=n=31</m:t>
+          <m:t>n=31</m:t>
         </m:r>
       </m:oMath>
       <w:r>
@@ -18216,6 +18216,16 @@
         <w:t>7.1 ABC-resultater</w:t>
       </w:r>
     </w:p>
+    <w:p>
+      <w:r>
+        <w:rPr>
+          <w:rFonts w:ascii="Times New Roman" w:hAnsi="Times New Roman"/>
+          <w:i/>
+          <w:sz w:val="20"/>
+        </w:rPr>
+        <w:t>Tabell 8. ABC-fordeling: antall artikler og verdiandel per klasse (n = 709).</w:t>
+      </w:r>
+    </w:p>
     <w:tbl>
       <w:tblPr>
         <w:tblW w:type="auto" w:w="0"/>
@@ -18637,38 +18647,38 @@
       </w:tr>
     </w:tbl>
     <w:p>
+      <w:pPr>
+        <w:spacing w:line="360" w:lineRule="auto"/>
+      </w:pPr>
+      <w:r>
+        <w:rPr>
+          <w:rFonts w:ascii="Times New Roman" w:hAnsi="Times New Roman" w:cs="Times New Roman"/>
+          <w:sz w:val="24"/>
+        </w:rPr>
+        <w:t>Fordelingen viser et tydelig Pareto-mønster: A- og B-artiklene (366 artikler, 51,6 %) står for ~95 % av verdibindingen, mens 338 C-artikler (47,7 %) dekker de resterende 5 %. A-klassens andel på 25,7 % er noe høyere enn den kanoniske 20 %-regelen, men konsistent med sykehussortiment der få høyverdige artikler dominerer. Pareto-kurven er presentert som Figur 6 i kapittel 6.</w:t>
+      </w:r>
+    </w:p>
+    <w:p>
+      <w:pPr>
+        <w:pStyle w:val="Overskrift2"/>
+      </w:pPr>
+      <w:r>
+        <w:rPr>
+          <w:rFonts w:ascii="Times New Roman" w:hAnsi="Times New Roman"/>
+          <w:color w:val="000000"/>
+          <w:sz w:val="32"/>
+        </w:rPr>
+        <w:t>7.2 XYZ-resultater</w:t>
+      </w:r>
+    </w:p>
+    <w:p>
       <w:r>
         <w:rPr>
           <w:rFonts w:ascii="Times New Roman" w:hAnsi="Times New Roman"/>
           <w:i/>
           <w:sz w:val="20"/>
         </w:rPr>
-        <w:t>Tabell 8. ABC-fordeling: antall artikler og verdiandel per klasse (n = 709).</w:t>
-      </w:r>
-    </w:p>
-    <w:p>
-      <w:pPr>
-        <w:spacing w:line="360" w:lineRule="auto"/>
-      </w:pPr>
-      <w:r>
-        <w:rPr>
-          <w:rFonts w:ascii="Times New Roman" w:hAnsi="Times New Roman" w:cs="Times New Roman"/>
-          <w:sz w:val="24"/>
-        </w:rPr>
-        <w:t>Fordelingen viser et tydelig Pareto-mønster: A- og B-artiklene (366 artikler, 51,6 %) står for ~95 % av verdibindingen, mens 338 C-artikler (47,7 %) dekker de resterende 5 %. A-klassens andel på 25,7 % er noe høyere enn den kanoniske 20 %-regelen, men konsistent med sykehussortiment der få høyverdige artikler dominerer. Pareto-kurven er presentert som Figur 6 i kapittel 6.</w:t>
-      </w:r>
-    </w:p>
-    <w:p>
-      <w:pPr>
-        <w:pStyle w:val="Overskrift2"/>
-      </w:pPr>
-      <w:r>
-        <w:rPr>
-          <w:rFonts w:ascii="Times New Roman" w:hAnsi="Times New Roman"/>
-          <w:color w:val="000000"/>
-          <w:sz w:val="32"/>
-        </w:rPr>
-        <w:t>7.2 XYZ-resultater</w:t>
+        <w:t>Tabell 9. XYZ-fordeling: antall artikler per klasse (n = 687 klassifiserte).</w:t>
       </w:r>
     </w:p>
     <w:tbl>
@@ -19031,37 +19041,37 @@
       </w:tr>
     </w:tbl>
     <w:p>
+      <w:pPr>
+        <w:spacing w:line="360" w:lineRule="auto"/>
+      </w:pPr>
+      <w:r>
+        <w:rPr>
+          <w:rFonts w:ascii="Times New Roman" w:hAnsi="Times New Roman" w:cs="Times New Roman"/>
+          <w:sz w:val="24"/>
+        </w:rPr>
+        <w:t>350 artikler (50,9 % av klassifiserte) har stabilt forbruksmønster (X), 193 artikler (28,1 %) har moderat variasjon (Y), og 144 artikler (20,9 %) har uregelmessig forbruk (Z). At over halvparten av artiklene faller i X-kategorien er positivt for HVFS-sentralisering, da stabilt forbruk er en forutsetning for APL-leveransemodellen. De 22 ikke-klassifiserte artiklene mangler tilstrekkelig forbrukshistorikk i MSEG (færre enn tre måneder med registrert forbruk) og er ekskludert fra XYZ-analysen for å unngå misvisende CV-estimater.</w:t>
+      </w:r>
+    </w:p>
+    <w:p>
+      <w:pPr>
+        <w:spacing w:line="360" w:lineRule="auto"/>
+      </w:pPr>
+      <w:r>
+        <w:rPr>
+          <w:rFonts w:ascii="Times New Roman" w:hAnsi="Times New Roman" w:cs="Times New Roman"/>
+          <w:sz w:val="24"/>
+        </w:rPr>
+        <w:t>Sammenligningen med SAP-feltet ZZXYZ viste 33 % samsvar mellom systemregistrert og beregnet klasse (125 av 375 artikler med data i begge kilder). Valideringen er begrenset til de 375 artiklene der ZZXYZ-feltet er utfylt i MDMA; for de øvrige 334 artiklene mangler systemklassifisering. Tabell 10 oppsummerer kryssvalideringen. Det lave samsvaret på 33 % understreker at SAP-feltets ZZXYZ ikke er systematisk oppdatert og bør erstattes med beregnet CV-klasse som primær XYZ-indikator. ABC/XYZ-kryssmatrisen er presentert som Figur 7 i kapittel 6; fullstendige celleantall er gjengitt der.</w:t>
+      </w:r>
+    </w:p>
+    <w:p>
       <w:r>
         <w:rPr>
           <w:rFonts w:ascii="Times New Roman" w:hAnsi="Times New Roman"/>
           <w:i/>
           <w:sz w:val="20"/>
         </w:rPr>
-        <w:t>Tabell 9. XYZ-fordeling: antall artikler per klasse (n = 687 klassifiserte).</w:t>
-      </w:r>
-    </w:p>
-    <w:p>
-      <w:pPr>
-        <w:spacing w:line="360" w:lineRule="auto"/>
-      </w:pPr>
-      <w:r>
-        <w:rPr>
-          <w:rFonts w:ascii="Times New Roman" w:hAnsi="Times New Roman" w:cs="Times New Roman"/>
-          <w:sz w:val="24"/>
-        </w:rPr>
-        <w:t>350 artikler (50,9 % av klassifiserte) har stabilt forbruksmønster (X), 193 artikler (28,1 %) har moderat variasjon (Y), og 144 artikler (20,9 %) har uregelmessig forbruk (Z). At over halvparten av artiklene faller i X-kategorien er positivt for HVFS-sentralisering, da stabilt forbruk er en forutsetning for APL-leveransemodellen. De 22 ikke-klassifiserte artiklene mangler tilstrekkelig forbrukshistorikk i MSEG (færre enn tre måneder med registrert forbruk) og er ekskludert fra XYZ-analysen for å unngå misvisende CV-estimater.</w:t>
-      </w:r>
-    </w:p>
-    <w:p>
-      <w:pPr>
-        <w:spacing w:line="360" w:lineRule="auto"/>
-      </w:pPr>
-      <w:r>
-        <w:rPr>
-          <w:rFonts w:ascii="Times New Roman" w:hAnsi="Times New Roman" w:cs="Times New Roman"/>
-          <w:sz w:val="24"/>
-        </w:rPr>
-        <w:t>Sammenligningen med SAP-feltet ZZXYZ viste 33 % samsvar mellom systemregistrert og beregnet klasse (125 av 375 artikler med data i begge kilder). Valideringen er begrenset til de 375 artiklene der ZZXYZ-feltet er utfylt i MDMA; for de øvrige 334 artiklene mangler systemklassifisering. Tabell 10 oppsummerer kryssvalideringen. Det lave samsvaret på 33 % understreker at SAP-feltets ZZXYZ ikke er systematisk oppdatert og bør erstattes med beregnet CV-klasse som primær XYZ-indikator. ABC/XYZ-kryssmatrisen er presentert som Figur 7 i kapittel 6; fullstendige celleantall er gjengitt der.</w:t>
+        <w:t>Tabell 10. SAP ZZXYZ-validering: samsvar mellom systemklasse og beregnet CV-klasse (n = 375 artikler med data i begge kilder).</w:t>
       </w:r>
     </w:p>
     <w:tbl>
@@ -19503,26 +19513,26 @@
       </w:tr>
     </w:tbl>
     <w:p>
+      <w:pPr>
+        <w:pStyle w:val="Overskrift2"/>
+      </w:pPr>
+      <w:r>
+        <w:rPr>
+          <w:rFonts w:ascii="Times New Roman" w:hAnsi="Times New Roman"/>
+          <w:color w:val="000000"/>
+          <w:sz w:val="32"/>
+        </w:rPr>
+        <w:t>7.3 EOQ-avviksresultater</w:t>
+      </w:r>
+    </w:p>
+    <w:p>
       <w:r>
         <w:rPr>
           <w:rFonts w:ascii="Times New Roman" w:hAnsi="Times New Roman"/>
           <w:i/>
           <w:sz w:val="20"/>
         </w:rPr>
-        <w:t>Tabell 10. SAP ZZXYZ-validering: samsvar mellom systemklasse og beregnet CV-klasse (n = 375 artikler med data i begge kilder).</w:t>
-      </w:r>
-    </w:p>
-    <w:p>
-      <w:pPr>
-        <w:pStyle w:val="Overskrift2"/>
-      </w:pPr>
-      <w:r>
-        <w:rPr>
-          <w:rFonts w:ascii="Times New Roman" w:hAnsi="Times New Roman"/>
-          <w:color w:val="000000"/>
-          <w:sz w:val="32"/>
-        </w:rPr>
-        <w:t>7.3 EOQ-avviksresultater</w:t>
+        <w:t>Tabell 11. EOQ-avviksresultater: fordeling av artikler etter ordrefrekvensavvik (n = 487).</w:t>
       </w:r>
     </w:p>
     <w:tbl>
@@ -19944,16 +19954,6 @@
       </w:tr>
     </w:tbl>
     <w:p>
-      <w:r>
-        <w:rPr>
-          <w:rFonts w:ascii="Times New Roman" w:hAnsi="Times New Roman"/>
-          <w:i/>
-          <w:sz w:val="20"/>
-        </w:rPr>
-        <w:t>Tabell 11. EOQ-avviksresultater: fordeling av artikler etter ordrefrekvensavvik (n = 487).</w:t>
-      </w:r>
-    </w:p>
-    <w:p>
       <w:pPr>
         <w:spacing w:line="360" w:lineRule="auto"/>
       </w:pPr>
@@ -20063,7 +20063,7 @@
       </w:r>
       <m:oMath>
         <m:r>
-          <m:t>n=n=389</m:t>
+          <m:t>n=389</m:t>
         </m:r>
       </m:oMath>
       <w:r>
@@ -20075,7 +20075,7 @@
       </w:r>
       <m:oMath>
         <m:r>
-          <m:t>n=n=98</m:t>
+          <m:t>n=98</m:t>
         </m:r>
       </m:oMath>
       <w:r>
@@ -20084,6 +20084,16 @@
           <w:sz w:val="24"/>
         </w:rPr>
         <w:t>) var 0,368. Differansen mellom trenings- og testresultat er 0,015, noe som ikke indikerer vesentlig overfit. Klyngeprofiler er presentert i Tabell 12.</w:t>
+      </w:r>
+    </w:p>
+    <w:p>
+      <w:r>
+        <w:rPr>
+          <w:rFonts w:ascii="Times New Roman" w:hAnsi="Times New Roman"/>
+          <w:i/>
+          <w:sz w:val="20"/>
+        </w:rPr>
+        <w:t>Tabell 12. K-means klyngeprofiler: gjennomsnittsverdier per klynge for de tre featurene (K = 3, n = 487).</w:t>
       </w:r>
     </w:p>
     <w:tbl>
@@ -20520,16 +20530,6 @@
       </w:tr>
     </w:tbl>
     <w:p>
-      <w:r>
-        <w:rPr>
-          <w:rFonts w:ascii="Times New Roman" w:hAnsi="Times New Roman"/>
-          <w:i/>
-          <w:sz w:val="20"/>
-        </w:rPr>
-        <w:t>Tabell 12. K-means klyngeprofiler: gjennomsnittsverdier per klynge for de tre featurene (K = 3, n = 487).</w:t>
-      </w:r>
-    </w:p>
-    <w:p>
       <w:pPr>
         <w:spacing w:line="360" w:lineRule="auto"/>
       </w:pPr>
@@ -20603,6 +20603,16 @@
           <w:sz w:val="24"/>
         </w:rPr>
         <w:t>Regelmotoren produserte en anbefaling for samtlige 709 artikler. Fordelingen er presentert i Tabell 13.</w:t>
+      </w:r>
+    </w:p>
+    <w:p>
+      <w:r>
+        <w:rPr>
+          <w:rFonts w:ascii="Times New Roman" w:hAnsi="Times New Roman"/>
+          <w:i/>
+          <w:sz w:val="20"/>
+        </w:rPr>
+        <w:t>Tabell 13. HVFS-anbefalinger fra regelmotor: fordeling per kategori (n = 709, LGORT 3001).</w:t>
       </w:r>
     </w:p>
     <w:tbl>
@@ -21026,16 +21036,6 @@
       </w:tr>
     </w:tbl>
     <w:p>
-      <w:r>
-        <w:rPr>
-          <w:rFonts w:ascii="Times New Roman" w:hAnsi="Times New Roman"/>
-          <w:i/>
-          <w:sz w:val="20"/>
-        </w:rPr>
-        <w:t>Tabell 13. HVFS-anbefalinger fra regelmotor: fordeling per kategori (n = 709, LGORT 3001).</w:t>
-      </w:r>
-    </w:p>
-    <w:p>
       <w:pPr>
         <w:spacing w:line="360" w:lineRule="auto"/>
       </w:pPr>
@@ -21044,7 +21044,7 @@
           <w:rFonts w:ascii="Times New Roman" w:hAnsi="Times New Roman" w:cs="Times New Roman"/>
           <w:sz w:val="24"/>
         </w:rPr>
-        <w:t>145 artikler (20,5 %) anbefales overført til HVFS. Denne gruppen består av artikler som tilfredsstiller ett eller flere av de positive overføringsskriteriene: R3 fanget 91 artikler (A/B + X + FOR\_MANGE\_ORDRER), R4 fanget 26 artikler (A/B + X + K\_OVERFØR), og R5 fanget 28 artikler (A/B + Y + K\_OVERFØR). Av de 145 overførte artiklene har 117 status FOR\_MANGE\_ORDRER og inngår dermed i besparelsesberegningen i avsnitt 7.6. De resterende 28 artiklene (R5) inngår ikke i besparelsesgrunnlaget fordi FOR\_MANGE\_ORDRER-flagget ikke er aktivert, men de anbefales overført fordi kombinasjonen av ABC/XYZ-profil (A/B + Y) og K\_OVERFØR-klyngetilhørighet oppfyller APL-egnethetskriteriet for sentralisering, jf. kap. 5.5.</w:t>
+        <w:t>145 artikler (20,5 %) anbefales overført til HVFS. Denne gruppen består av artikler som tilfredsstiller ett eller flere av de positive overføringsskriteriene: R3 fanget 71 artikler (A/B + X + FOR\_MANGE\_ORDRER), R4 fanget 18 artikler (A/B + X + K\_OVERFØR), og R5 fanget 56 artikler (A/B + Y + K\_OVERFØR). Av de 145 overførte artiklene har 117 status FOR\_MANGE\_ORDRER og inngår dermed i besparelsesberegningen i avsnitt 7.6. De resterende 28 artiklene (alle 18 fra R4 og 10 fra R5) inngår ikke i besparelsesgrunnlaget fordi FOR\_MANGE\_ORDRER-flagget ikke er aktivert, men de anbefales overført fordi kombinasjonen av ABC/XYZ-profil og K\_OVERFØR-klyngetilhørighet oppfyller APL-egnethetskriteriet for sentralisering, jf. kap. 5.5.</w:t>
       </w:r>
     </w:p>
     <w:p>
@@ -21056,7 +21056,7 @@
           <w:rFonts w:ascii="Times New Roman" w:hAnsi="Times New Roman" w:cs="Times New Roman"/>
           <w:sz w:val="24"/>
         </w:rPr>
-        <w:t>257 artikler (36,2 %) beholdes lokalt, primært grunnet Z-klassifisering (R1: 144 artikler) eller CY-profil (R2: 113 artikler). Z-override (R1) er den enkeltregelen som fanger flest artikler, noe som bekrefter at uforutsigbart forbruksmønster er den vanligste kontraindikasjonen mot sentralisering i dette sortimentet. 284 artikler (40,1 %) sendes til manuell vurdering — artikler der de kvantitative signalene fra ABC, XYZ, EOQ og K-means ikke er tilstrekkelig entydige til å generere en automatisert anbefaling. 23 artikler (3,2 %) mangler tilstrekkelig data for klassifisering. Fordelingen er visualisert i Figur 12 i kapittel 6.</w:t>
+        <w:t>257 artikler (36,2 %) beholdes lokalt, primært grunnet Z-klassifisering (R1: 143 artikler) eller CY-profil (R2: 114 artikler). Z-override (R1) er den enkeltregelen som fanger flest artikler, noe som bekrefter at uforutsigbart forbruksmønster er den vanligste kontraindikasjonen mot sentralisering i dette sortimentet. 284 artikler (40,1 %) sendes til manuell vurdering — artikler der de kvantitative signalene fra ABC, XYZ, EOQ og K-means ikke er tilstrekkelig entydige til å generere en automatisert anbefaling. 23 artikler (3,2 %) mangler tilstrekkelig data for klassifisering. Fordelingen er visualisert i Figur 12 i kapittel 6.</w:t>
       </w:r>
     </w:p>
     <w:p>
@@ -21143,6 +21143,16 @@
         <w:t xml:space="preserve"> er antatt realiseringsgrad for den teoretiske EOQ-besparelsen. Tabell 14 viser resultatene for de tre scenariene.</w:t>
       </w:r>
     </w:p>
+    <w:p>
+      <w:r>
+        <w:rPr>
+          <w:rFonts w:ascii="Times New Roman" w:hAnsi="Times New Roman"/>
+          <w:i/>
+          <w:sz w:val="20"/>
+        </w:rPr>
+        <w:t>Tabell 14. Besparelsesestimater for tre scenarier: 117 artikler (OVERFØR\_HVFS ∩ FOR\_MANGE\_ORDRER), S = 750 NOK.</w:t>
+      </w:r>
+    </w:p>
     <w:tbl>
       <w:tblPr>
         <w:tblW w:type="auto" w:w="0"/>
@@ -21373,16 +21383,6 @@
       </w:tr>
     </w:tbl>
     <w:p>
-      <w:r>
-        <w:rPr>
-          <w:rFonts w:ascii="Times New Roman" w:hAnsi="Times New Roman"/>
-          <w:i/>
-          <w:sz w:val="20"/>
-        </w:rPr>
-        <w:t>Tabell 14. Besparelsesestimater for tre scenarier: 117 artikler (OVERFØR\_HVFS ∩ FOR\_MANGE\_ORDRER), S = 750 NOK.</w:t>
-      </w:r>
-    </w:p>
-    <w:p>
       <w:pPr>
         <w:spacing w:line="360" w:lineRule="auto"/>
       </w:pPr>
@@ -21641,6 +21641,16 @@
           <w:sz w:val="24"/>
         </w:rPr>
         <w:t>Tabell 15 oppsummerer de sentrale funnene fra denne studien sett opp mot forventninger fra litteraturen.</w:t>
+      </w:r>
+    </w:p>
+    <w:p>
+      <w:r>
+        <w:rPr>
+          <w:rFonts w:ascii="Times New Roman" w:hAnsi="Times New Roman"/>
+          <w:i/>
+          <w:sz w:val="20"/>
+        </w:rPr>
+        <w:t>Tabell 15. Sammenstilling av egne resultater mot funn i eksisterende litteratur.</w:t>
       </w:r>
     </w:p>
     <w:tbl>
@@ -22239,16 +22249,6 @@
         </w:tc>
       </w:tr>
     </w:tbl>
-    <w:p>
-      <w:r>
-        <w:rPr>
-          <w:rFonts w:ascii="Times New Roman" w:hAnsi="Times New Roman"/>
-          <w:i/>
-          <w:sz w:val="20"/>
-        </w:rPr>
-        <w:t>Tabell 15. Sammenstilling av egne resultater mot funn i eksisterende litteratur.</w:t>
-      </w:r>
-    </w:p>
     <w:p>
       <w:pPr>
         <w:pStyle w:val="Overskrift2"/>

</xml_diff>

<commit_message>
Forkort forord og sammendrag, slett engelsk abstract
Co-Authored-By: Claude Opus 4.6 (1M context) <noreply@anthropic.com>
</commit_message>
<xml_diff>
--- a/005 report/LOG650_Rapport_v5.docx
+++ b/005 report/LOG650_Rapport_v5.docx
@@ -4504,7 +4504,7 @@
           <w:rFonts w:ascii="Times New Roman" w:hAnsi="Times New Roman"/>
           <w:sz w:val="24"/>
         </w:rPr>
-        <w:t xml:space="preserve">Jeg vil rette en hjertelig takk til min veileder, Bård Inge Austigard Pettersen, for faglig engasjement, konstruktive tilbakemeldinger og tydelige forventninger gjennom hele prosessen. Hans kombinasjon av akademisk presisjon og praktisk forankring har vært uvurderlig for å løfte oppgaven fra en teknisk analyse til et faglig gjennomarbeidet forskningsprosjekt.</w:t>
+        <w:t xml:space="preserve">Jeg vil rette en stor takk til min veileder, Bård Inge Austigard Pettersen, for faglig engasjement, konstruktive tilbakemeldinger og tydelige forventninger gjennom hele prosessen. Hans evne til å kombinere akademisk presisjon med praktisk relevans har vært avgjørende for arbeidet med oppgaven.</w:t>
       </w:r>
     </w:p>
     <w:p>
@@ -4516,7 +4516,7 @@
           <w:rFonts w:ascii="Times New Roman" w:hAnsi="Times New Roman"/>
           <w:sz w:val="24"/>
         </w:rPr>
-        <w:t xml:space="preserve">Takk til Helse Bergen ved innkjøps- og logistikkavdelingen for tilgang til transaksjonsdata fra SAP S/4HANA. Uten tillatelse til å hente ut data fra forsyningslagerets 14 kildetabeller via SE16H hadde den kvantitative analysen ikke vært gjennomførbar. Datagrunnlaget er behandlet i henhold til gjeldende retningslinjer for personvern og informasjonssikkerhet, og ingen pasientdata er benyttet i studien.</w:t>
+        <w:t xml:space="preserve">Takk til Helse Bergen og Helse Vest IKT for tilgang til SAP S/4HANA-data som har gjort analysen mulig. Datagrunnlaget er behandlet i tråd med gjeldende retningslinjer for personvern og informasjonssikkerhet, og studien omfatter ikke personidentifiserbare opplysninger.</w:t>
       </w:r>
     </w:p>
     <w:p>
@@ -4528,7 +4528,7 @@
           <w:rFonts w:ascii="Times New Roman" w:hAnsi="Times New Roman"/>
           <w:sz w:val="24"/>
         </w:rPr>
-        <w:t xml:space="preserve">Motivasjonen for å skrive om dette temaet springer ut av min daglige jobb som SAP MM-konsulent ved Helse Vest IKT, der jeg arbeider med materialstyring og logistikk i SAP S/4HANA som del av LIBRA-prosjektet – Helse Vest sin regionale SAP-implementering. Gjennom dette arbeidet ser jeg at det finnes et reelt gap mellom de datamengdene som allerede eksisterer i systemet og den innsikten som faktisk utnyttes til å ta operasjonelle og strategiske beslutninger. Denne oppgaven er et forsøk på å bygge bro over det gapet, og å demonstrere at transaksjonsdataene i SAP – riktig bearbeidet – kan gi et robust grunnlag for å identifisere overføringskandidater til Helse Vest Forsyningssenter.</w:t>
+        <w:t xml:space="preserve">Motivasjonen springer ut av min rolle som SAP MM-konsulent ved Helse Vest IKT, hvor jeg daglig ser at transaksjonsdataene i SAP er underutnyttet som beslutningsgrunnlag. Denne oppgaven er et forsøk på å bygge bro over det gapet.</w:t>
       </w:r>
     </w:p>
     <w:p>
@@ -4540,7 +4540,7 @@
           <w:rFonts w:ascii="Times New Roman" w:hAnsi="Times New Roman"/>
           <w:sz w:val="24"/>
         </w:rPr>
-        <w:t xml:space="preserve">Jeg vil også takke min samboer Hilde for tålmodighet og støtte gjennom et krevende semester med fulltidsjobb ved siden av studiene.</w:t>
+        <w:t xml:space="preserve">Til slutt vil jeg takke min samboer Hilde for støtte og tålmodighet gjennom et krevende semester med fulltidsjobb ved siden av studiene.</w:t>
       </w:r>
     </w:p>
     <w:p>
@@ -4607,7 +4607,7 @@
           <w:rFonts w:ascii="Times New Roman" w:hAnsi="Times New Roman"/>
           <w:sz w:val="24"/>
         </w:rPr>
-        <w:t xml:space="preserve">Denne studien analyserer hvilke artikler ved Helse Bergens forsyningslager (WERKS 3300, LGORT 3001) som bør overføres til Helse Vest Forsyningssenter (HVFS), og estimerer det tilknyttede besparelsespotensialet. Bakgrunnen er LIBRA-prosjektet, Helse Vests regionale implementering av SAP S/4HANA, som legger til rette for sentralisert forsyning via en avdelingspakket leveransemodell (APL). Formålet er å utvikle et datadrevet og reproduserbart rammeverk for sentraliseringsvurdering basert på operasjonelle SAP-transaksjonsdata.</w:t>
+        <w:t xml:space="preserve">Denne studien analyserer hvilke artikler ved Helse Bergens forsyningslager (WERKS 3300, LGORT 3001) som bør overføres til Helse Vest Forsyningssenter (HVFS), og estimerer tilhørende besparelsespotensial. Studien er forankret i LIBRA-prosjektet og har som mål å utvikle et datadrevet og reproduserbart beslutningsgrunnlag for sentralisering basert på SAP S/4HANA-data.</w:t>
       </w:r>
     </w:p>
     <w:p>
@@ -4620,7 +4620,7 @@
           <w:rFonts w:ascii="Times New Roman" w:hAnsi="Times New Roman"/>
           <w:sz w:val="24"/>
         </w:rPr>
-        <w:t xml:space="preserve">Datagrunnlaget består av 709 aktive artikler hentet fra 14 tabeller i SAP S/4HANA via transaksjonen SE16H, for perioden 2024–2025. Av totalt 1 006 unike artikkelnumre i LGORT 3001 ble 297 artikler ekskludert fordi de ikke hadde registrert forbruk og ikke hadde lagerbeholdning i analyseperioden — operasjonelt inaktive artikler etter aktivitetskriteriet i D-01. Dataforbehandlingen er dokumentert gjennom åtte eksplisitte datavalgsbeslutninger (D-01 til D-08) og gjennomføres med et deterministisk Python-script for full reproduserbarhet.</w:t>
+        <w:t xml:space="preserve">Analysen omfatter 709 aktive artikler for perioden 2024–2025. Metodetilnærmingen kombinerer ABC- og XYZ-klassifisering, EOQ-avviksanalyse og K-means klyngeanalyse i en regelbasert beslutningsmodell. K-means identifiserer K = 3 klynger med akseptabel klyngestruktur (silhouette-score 0,383 trening / 0,368 test).</w:t>
       </w:r>
     </w:p>
     <w:p>
@@ -4633,7 +4633,7 @@
           <w:rFonts w:ascii="Times New Roman" w:hAnsi="Times New Roman"/>
           <w:sz w:val="24"/>
         </w:rPr>
-        <w:t xml:space="preserve">Analysen kombinerer fire metoder i en integrert rørledning: ABC-klassifisering basert på Pareto-prinsippet, XYZ-klassifisering basert på variasjonskoeffisient (CV), EOQ-avviksanalyse med parametere S = 750 kr og h = 20 % av enhetspris, og K-means klyngeanalyse med automatisk K-valg via silhouette-score. Resultatene sammenstilles i en regelmotor med åtte beslutningsregler som klassifiserer hver artikkel i én av fire kategorier: OVERFØR_HVFS, BEHOLD_LOKALT, VURDER_NÆRMERE eller MANGLER_DATA.</w:t>
+        <w:t xml:space="preserve">Resultatene viser at 145 artikler (20,5 %) identifiseres som prioriterte overføringskandidater til HVFS, mens 257 beholdes lokalt, 284 krever manuell vurdering og 23 mangler tilstrekkelig datagrunnlag. Den høye andelen manuell vurdering (40,1 %) reflekterer en bevisst prioritering av presisjon fremfor full automatisering.</w:t>
       </w:r>
     </w:p>
     <w:p>
@@ -4646,7 +4646,7 @@
           <w:rFonts w:ascii="Times New Roman" w:hAnsi="Times New Roman"/>
           <w:sz w:val="24"/>
         </w:rPr>
-        <w:t xml:space="preserve">ABC-analysen viser at 182 artikler (25,7 %) tilhører A-kategorien og bærer om lag 80 % av den totale verdibindingen; 184 tilhører B og 338 tilhører C — de resterende 5 artiklene kunne ikke ABC-klassifiseres grunnet manglende verdidata. XYZ-analysen klassifiserer 350 artikler som X (stabilt forbruk, CV &lt; 0,5), 193 som Y og 144 som Z; 22 artikler ble ikke XYZ-klassifisert grunnet utilstrekkelig forbrukshistorikk. K-means-analysen identifiserer K = 3 distinkte klynger med silhouette-score 0,383 på treningsdata og 0,368 på testdata, noe som bekrefter en akseptabel klyngestruktur. Regelmotoren identifiserer 145 artikler (20,5 %) som prioriterte overføringskandidater til HVFS, mens 257 artikler beholdes lokalt, 284 sendes til manuell vurdering og 23 artikler (3,2 %) mangler tilstrekkelig data for klassifisering. At 40,1 % av artiklene havner i manuell vurdering, reflekterer at modellen prioriterer presisjon over recall — hovedverdien er systematisk triage av artikkelporteføljen, ikke full beslutningsautomatisering. Det estimerte besparelsespotensialet varierer fra kr 301 010 (pessimistisk, g = 50 %) til kr 602 020 (optimistisk, g = 100 %) per år, med et base case-estimat på kr 451 515 (g = 75 %). Parametrene S, h og g er ikke kalibrert mot lokalt observerte kostnader, og estimatene bør betraktes som scenariobaserte intervaller.</w:t>
+        <w:t xml:space="preserve">Det estimerte besparelsespotensialet varierer fra kr 301 010 til kr 602 020 per år, med et base case-estimat på kr 451 515. Estimatene er scenariobaserte og avhenger av ikke-kalibrerte kostnadsparametere.</w:t>
       </w:r>
     </w:p>
     <w:p>
@@ -4659,72 +4659,7 @@
           <w:rFonts w:ascii="Times New Roman" w:hAnsi="Times New Roman"/>
           <w:sz w:val="24"/>
         </w:rPr>
-        <w:t xml:space="preserve">Studien konkluderer med at multikriterieklassifisering og klyngeanalyse av SAP-transaksjonsdata gir et strukturert beslutningsgrunnlag for å prioritere HVFS-overføringskandidater ved Helse Bergen. Realisering forutsetter aktiv justering av SAP MM-parametere, innkjøpsfaglig validering av overføringslisten, og en strukturert manuell gjennomgang av VURDER NÆRMERE-gruppen.</w:t>
-      </w:r>
-    </w:p>
-    <w:p>
-      <w:pPr>
-        <w:pStyle w:val="Normal"/>
-        <w:spacing w:line="360" w:lineRule="auto"/>
-      </w:pPr>
-      <w:r>
-        <w:rPr>
-          <w:rFonts w:ascii="Times New Roman" w:hAnsi="Times New Roman"/>
-          <w:sz w:val="24"/>
-        </w:rPr>
-        <w:t xml:space="preserve"># Abstract</w:t>
-      </w:r>
-    </w:p>
-    <w:p>
-      <w:pPr>
-        <w:pStyle w:val="Normal"/>
-        <w:spacing w:line="360" w:lineRule="auto"/>
-      </w:pPr>
-      <w:r>
-        <w:rPr>
-          <w:rFonts w:ascii="Times New Roman" w:hAnsi="Times New Roman"/>
-          <w:sz w:val="24"/>
-        </w:rPr>
-        <w:t xml:space="preserve">This study analyses which medical consumable articles at Helse Bergen's supply warehouse (WERKS 3300, LGORT 3001) should be transferred to the regional supply centre Helse Vest Forsyningssenter (HVFS), and estimates the associated cost savings. The context is the LIBRA project — Helse Vest's regional implementation of SAP S/4HANA — which enables centralised supply through a department-packed delivery model (APL).</w:t>
-      </w:r>
-    </w:p>
-    <w:p>
-      <w:pPr>
-        <w:pStyle w:val="Normal"/>
-        <w:spacing w:line="360" w:lineRule="auto"/>
-      </w:pPr>
-      <w:r>
-        <w:rPr>
-          <w:rFonts w:ascii="Times New Roman" w:hAnsi="Times New Roman"/>
-          <w:sz w:val="24"/>
-        </w:rPr>
-        <w:t xml:space="preserve">The dataset comprises 709 active articles extracted from 14 SAP S/4HANA tables for the period 2024–2025. The analysis combines four methods in an integrated pipeline: ABC classification based on the Pareto principle, XYZ classification based on the coefficient of variation (CV), EOQ deviation analysis with parameters S = NOK 750 and h = 20 % of unit price, and K-means cluster analysis with automatic K selection via silhouette score. Results are synthesised through a rule engine with eight decision rules that classify each article into one of four categories: TRANSFER, KEEP LOCAL, REVIEW, or INSUFFICIENT DATA.</w:t>
-      </w:r>
-    </w:p>
-    <w:p>
-      <w:pPr>
-        <w:pStyle w:val="Normal"/>
-        <w:spacing w:line="360" w:lineRule="auto"/>
-      </w:pPr>
-      <w:r>
-        <w:rPr>
-          <w:rFonts w:ascii="Times New Roman" w:hAnsi="Times New Roman"/>
-          <w:sz w:val="24"/>
-        </w:rPr>
-        <w:t xml:space="preserve">The ABC analysis assigns 182 articles (25.7 %) to category A, accounting for approximately 80 % of total value. K-means identifies K = 3 clusters with silhouette scores of 0.383 (training) and 0.368 (test), confirming acceptable cluster structure. The rule engine identifies 145 articles (20.5 %) as prioritised transfer candidates, while 257 are retained locally, 284 require manual review, and 23 lack sufficient data. The estimated annual savings potential ranges from NOK 301 010 (pessimistic, g = 50 %) to NOK 602 020 (optimistic, g = 100 %), with a base case estimate of NOK 451 515 (g = 75 %). As cost parameters are not calibrated against locally observed costs, these estimates should be interpreted as scenario-based intervals.</w:t>
-      </w:r>
-    </w:p>
-    <w:p>
-      <w:pPr>
-        <w:pStyle w:val="Normal"/>
-        <w:spacing w:line="360" w:lineRule="auto"/>
-      </w:pPr>
-      <w:r>
-        <w:rPr>
-          <w:rFonts w:ascii="Times New Roman" w:hAnsi="Times New Roman"/>
-          <w:sz w:val="24"/>
-        </w:rPr>
-        <w:t xml:space="preserve">The study concludes that multi-criteria classification combined with cluster analysis of SAP transaction data provides a structured decision basis for prioritising HVFS transfer candidates. The tool's primary value is systematic triage of the article portfolio; final transfer decisions require procurement and clinical validation, active adjustment of SAP MM parameters, and structured expert review of the REVIEW group.</w:t>
+        <w:t xml:space="preserve">Studien viser at multikriterieklassifisering kombinert med klyngeanalyse gir et strukturert beslutningsgrunnlag for sentralisering i sykehuslogistikk. Praktisk realisering forutsetter justering av SAP MM-parametere, faglig validering og systematisk gjennomgang av artikler med usikker klassifisering.</w:t>
       </w:r>
     </w:p>
     <w:p>

</xml_diff>